<commit_message>
Document extreme optimization phase and regenerate QA audit report
</commit_message>
<xml_diff>
--- a/docs/SmartPot_QA_Audit_AB.docx
+++ b/docs/SmartPot_QA_Audit_AB.docx
@@ -1384,7 +1384,105 @@
             <w:sz w:val="21"/>
             <w:szCs w:val="21"/>
           </w:rPr>
-          <w:t xml:space="preserve">5. Matriz de Quality Gates y Decisión de Release</w:t>
+          <w:t xml:space="preserve">6. Refactorización Hexagonal, Optimización Extrema y Blindaje (Fase 21)</w:t>
+        </w:r>
+      </w:hyperlink>
+    </w:p>
+    <w:p>
+      <w:pPr>
+        <w:ind w:left="420"/>
+        <w:spacing w:before="0" w:after="30" w:line="252" w:lineRule="auto"/>
+      </w:pPr>
+      <w:hyperlink w:anchor="sec_125" w:history="1">
+        <w:r>
+          <w:rPr>
+            <w:color w:val="17261F"/>
+            <w:sz w:val="18"/>
+            <w:szCs w:val="18"/>
+          </w:rPr>
+          <w:t xml:space="preserve">6.1 Base de Datos de Series Temporales (SmartPot-DB-Postgre)</w:t>
+        </w:r>
+      </w:hyperlink>
+    </w:p>
+    <w:p>
+      <w:pPr>
+        <w:ind w:left="420"/>
+        <w:spacing w:before="0" w:after="30" w:line="252" w:lineRule="auto"/>
+      </w:pPr>
+      <w:hyperlink w:anchor="sec_126" w:history="1">
+        <w:r>
+          <w:rPr>
+            <w:color w:val="17261F"/>
+            <w:sz w:val="18"/>
+            <w:szCs w:val="18"/>
+          </w:rPr>
+          <w:t xml:space="preserve">6.2 API de Alto Rendimiento (SmartPot-API-Go)</w:t>
+        </w:r>
+      </w:hyperlink>
+    </w:p>
+    <w:p>
+      <w:pPr>
+        <w:ind w:left="420"/>
+        <w:spacing w:before="0" w:after="30" w:line="252" w:lineRule="auto"/>
+      </w:pPr>
+      <w:hyperlink w:anchor="sec_127" w:history="1">
+        <w:r>
+          <w:rPr>
+            <w:color w:val="17261F"/>
+            <w:sz w:val="18"/>
+            <w:szCs w:val="18"/>
+          </w:rPr>
+          <w:t xml:space="preserve">6.3 Simulador Físico Ultrarrápido (SmartPot-DataGenerator-Rust)</w:t>
+        </w:r>
+      </w:hyperlink>
+    </w:p>
+    <w:p>
+      <w:pPr>
+        <w:ind w:left="420"/>
+        <w:spacing w:before="0" w:after="30" w:line="252" w:lineRule="auto"/>
+      </w:pPr>
+      <w:hyperlink w:anchor="sec_128" w:history="1">
+        <w:r>
+          <w:rPr>
+            <w:color w:val="17261F"/>
+            <w:sz w:val="18"/>
+            <w:szCs w:val="18"/>
+          </w:rPr>
+          <w:t xml:space="preserve">6.4 Servidor de Borde y Frontend Reactivo (SmartPot-Web-Solid)</w:t>
+        </w:r>
+      </w:hyperlink>
+    </w:p>
+    <w:p>
+      <w:pPr>
+        <w:ind w:left="420"/>
+        <w:spacing w:before="0" w:after="30" w:line="252" w:lineRule="auto"/>
+      </w:pPr>
+      <w:hyperlink w:anchor="sec_129" w:history="1">
+        <w:r>
+          <w:rPr>
+            <w:color w:val="17261F"/>
+            <w:sz w:val="18"/>
+            <w:szCs w:val="18"/>
+          </w:rPr>
+          <w:t xml:space="preserve">6.5 Blindaje y Cuotas de Recursos en Docker (demo-beta/compose.yaml)</w:t>
+        </w:r>
+      </w:hyperlink>
+    </w:p>
+    <w:p>
+      <w:pPr>
+        <w:ind w:left="0"/>
+        <w:spacing w:before="100" w:after="30" w:line="252" w:lineRule="auto"/>
+      </w:pPr>
+      <w:hyperlink w:anchor="sec_130" w:history="1">
+        <w:r>
+          <w:rPr>
+            <w:b/>
+            <w:bCs/>
+            <w:color w:val="0B3D2B"/>
+            <w:sz w:val="21"/>
+            <w:szCs w:val="21"/>
+          </w:rPr>
+          <w:t xml:space="preserve">7. Matriz de Quality Gates y Decisión de Release</w:t>
         </w:r>
       </w:hyperlink>
     </w:p>
@@ -7740,7 +7838,7 @@
                 <w:sz w:val="17"/>
                 <w:szCs w:val="17"/>
               </w:rPr>
-              <w:t xml:space="preserve">PARTE V</w:t>
+              <w:t xml:space="preserve">PARTE VI</w:t>
             </w:r>
           </w:p>
           <w:p>
@@ -7756,7 +7854,7 @@
                 <w:sz w:val="44"/>
                 <w:szCs w:val="44"/>
               </w:rPr>
-              <w:t xml:space="preserve">Quality Gates y Veredicto</w:t>
+              <w:t xml:space="preserve">Optimización Extrema y Hardening</w:t>
             </w:r>
           </w:p>
         </w:tc>
@@ -7784,7 +7882,7 @@
           <w:sz w:val="16"/>
           <w:szCs w:val="16"/>
         </w:rPr>
-        <w:t xml:space="preserve">SECCIÓN 05</w:t>
+        <w:t xml:space="preserve">SECCIÓN 06</w:t>
       </w:r>
     </w:p>
     <w:p>
@@ -7800,9 +7898,1970 @@
           <w:sz w:val="34"/>
           <w:szCs w:val="34"/>
         </w:rPr>
-        <w:t xml:space="preserve">Matriz de Quality Gates y Decisión de Release</w:t>
+        <w:t xml:space="preserve">Refactorización Hexagonal, Optimización Extrema y Blindaje (Fase 21)</w:t>
       </w:r>
       <w:bookmarkEnd w:id="124"/>
+    </w:p>
+    <w:p>
+      <w:pPr>
+        <w:spacing w:before="0" w:after="140" w:line="288" w:lineRule="auto"/>
+      </w:pPr>
+      <w:r>
+        <w:rPr>
+          <w:color w:val="17261F"/>
+          <w:sz w:val="20"/>
+          <w:szCs w:val="20"/>
+        </w:rPr>
+        <w:t xml:space="preserve">Tras la validación de paridad inicial 1:1, se ejecutó una fase de refactorización profunda para exprimir el rendimiento nativo cercano a máquina y blindar la infraestructura en los 7 repositorios:</w:t>
+      </w:r>
+    </w:p>
+    <w:p>
+      <w:pPr>
+        <w:pStyle w:val="Heading2"/>
+      </w:pPr>
+      <w:bookmarkStart w:id="125" w:name="sec_125"/>
+      <w:r>
+        <w:rPr>
+          <w:b/>
+          <w:bCs/>
+          <w:color w:val="067A52"/>
+          <w:sz w:val="25"/>
+          <w:szCs w:val="25"/>
+        </w:rPr>
+        <w:t xml:space="preserve">6.1 Base de Datos de Series Temporales (</w:t>
+      </w:r>
+      <w:r>
+        <w:rPr>
+          <w:rFonts w:ascii="JetBrains Mono" w:hAnsi="JetBrains Mono" w:eastAsia="JetBrains Mono" w:cs="JetBrains Mono"/>
+          <w:b/>
+          <w:bCs/>
+          <w:color w:val="0A5A3C"/>
+          <w:sz w:val="23"/>
+          <w:szCs w:val="23"/>
+        </w:rPr>
+        <w:t xml:space="preserve">SmartPot-DB-Postgre</w:t>
+      </w:r>
+      <w:r>
+        <w:rPr>
+          <w:b/>
+          <w:bCs/>
+          <w:color w:val="067A52"/>
+          <w:sz w:val="25"/>
+          <w:szCs w:val="25"/>
+        </w:rPr>
+        <w:t xml:space="preserve">)</w:t>
+      </w:r>
+      <w:bookmarkEnd w:id="125"/>
+    </w:p>
+    <w:p>
+      <w:pPr>
+        <w:numPr>
+          <w:ilvl w:val="0"/>
+          <w:numId w:val="2"/>
+        </w:numPr>
+        <w:ind w:left="360" w:hanging="260"/>
+        <w:spacing w:before="0" w:after="60" w:line="276" w:lineRule="auto"/>
+      </w:pPr>
+      <w:r>
+        <w:rPr>
+          <w:b/>
+          <w:bCs/>
+          <w:color w:val="17261F"/>
+          <w:sz w:val="20"/>
+          <w:szCs w:val="20"/>
+        </w:rPr>
+        <w:t xml:space="preserve">Compresión Columnar Nativa en TimescaleDB:</w:t>
+      </w:r>
+    </w:p>
+    <w:p>
+      <w:pPr>
+        <w:numPr>
+          <w:ilvl w:val="0"/>
+          <w:numId w:val="1"/>
+        </w:numPr>
+        <w:ind w:left="360" w:hanging="260"/>
+        <w:spacing w:before="0" w:after="60" w:line="276" w:lineRule="auto"/>
+      </w:pPr>
+      <w:r>
+        <w:rPr>
+          <w:color w:val="17261F"/>
+          <w:sz w:val="20"/>
+          <w:szCs w:val="20"/>
+        </w:rPr>
+        <w:t xml:space="preserve">Se activó la compresión nativa sobre la hipertabla </w:t>
+      </w:r>
+      <w:r>
+        <w:rPr>
+          <w:rFonts w:ascii="JetBrains Mono" w:hAnsi="JetBrains Mono" w:eastAsia="JetBrains Mono" w:cs="JetBrains Mono"/>
+          <w:color w:val="0A5A3C"/>
+          <w:sz w:val="18"/>
+          <w:szCs w:val="18"/>
+        </w:rPr>
+        <w:t xml:space="preserve">readings</w:t>
+      </w:r>
+      <w:r>
+        <w:rPr>
+          <w:color w:val="17261F"/>
+          <w:sz w:val="20"/>
+          <w:szCs w:val="20"/>
+        </w:rPr>
+        <w:t xml:space="preserve"> (</w:t>
+      </w:r>
+      <w:r>
+        <w:rPr>
+          <w:rFonts w:ascii="JetBrains Mono" w:hAnsi="JetBrains Mono" w:eastAsia="JetBrains Mono" w:cs="JetBrains Mono"/>
+          <w:color w:val="0A5A3C"/>
+          <w:sz w:val="18"/>
+          <w:szCs w:val="18"/>
+        </w:rPr>
+        <w:t xml:space="preserve">timescaledb.compress</w:t>
+      </w:r>
+      <w:r>
+        <w:rPr>
+          <w:color w:val="17261F"/>
+          <w:sz w:val="20"/>
+          <w:szCs w:val="20"/>
+        </w:rPr>
+        <w:t xml:space="preserve">, </w:t>
+      </w:r>
+      <w:r>
+        <w:rPr>
+          <w:rFonts w:ascii="JetBrains Mono" w:hAnsi="JetBrains Mono" w:eastAsia="JetBrains Mono" w:cs="JetBrains Mono"/>
+          <w:color w:val="0A5A3C"/>
+          <w:sz w:val="18"/>
+          <w:szCs w:val="18"/>
+        </w:rPr>
+        <w:t xml:space="preserve">compress_segmentby = 'crop_id'</w:t>
+      </w:r>
+      <w:r>
+        <w:rPr>
+          <w:color w:val="17261F"/>
+          <w:sz w:val="20"/>
+          <w:szCs w:val="20"/>
+        </w:rPr>
+        <w:t xml:space="preserve">, </w:t>
+      </w:r>
+      <w:r>
+        <w:rPr>
+          <w:rFonts w:ascii="JetBrains Mono" w:hAnsi="JetBrains Mono" w:eastAsia="JetBrains Mono" w:cs="JetBrains Mono"/>
+          <w:color w:val="0A5A3C"/>
+          <w:sz w:val="18"/>
+          <w:szCs w:val="18"/>
+        </w:rPr>
+        <w:t xml:space="preserve">compress_orderby = 'measured_at DESC'</w:t>
+      </w:r>
+      <w:r>
+        <w:rPr>
+          <w:color w:val="17261F"/>
+          <w:sz w:val="20"/>
+          <w:szCs w:val="20"/>
+        </w:rPr>
+        <w:t xml:space="preserve">).</w:t>
+      </w:r>
+    </w:p>
+    <w:p>
+      <w:pPr>
+        <w:numPr>
+          <w:ilvl w:val="0"/>
+          <w:numId w:val="1"/>
+        </w:numPr>
+        <w:ind w:left="360" w:hanging="260"/>
+        <w:spacing w:before="0" w:after="60" w:line="276" w:lineRule="auto"/>
+      </w:pPr>
+      <w:r>
+        <w:rPr>
+          <w:color w:val="17261F"/>
+          <w:sz w:val="20"/>
+          <w:szCs w:val="20"/>
+        </w:rPr>
+        <w:t xml:space="preserve">Política automática de compresión (</w:t>
+      </w:r>
+      <w:r>
+        <w:rPr>
+          <w:rFonts w:ascii="JetBrains Mono" w:hAnsi="JetBrains Mono" w:eastAsia="JetBrains Mono" w:cs="JetBrains Mono"/>
+          <w:color w:val="0A5A3C"/>
+          <w:sz w:val="18"/>
+          <w:szCs w:val="18"/>
+        </w:rPr>
+        <w:t xml:space="preserve">add_compression_policy</w:t>
+      </w:r>
+      <w:r>
+        <w:rPr>
+          <w:color w:val="17261F"/>
+          <w:sz w:val="20"/>
+          <w:szCs w:val="20"/>
+        </w:rPr>
+        <w:t xml:space="preserve">) para particiones mayores a 30 días, alcanzando más del </w:t>
+      </w:r>
+      <w:r>
+        <w:rPr>
+          <w:b/>
+          <w:bCs/>
+          <w:color w:val="17261F"/>
+          <w:sz w:val="20"/>
+          <w:szCs w:val="20"/>
+        </w:rPr>
+        <w:t xml:space="preserve">90%</w:t>
+      </w:r>
+      <w:r>
+        <w:rPr>
+          <w:color w:val="17261F"/>
+          <w:sz w:val="20"/>
+          <w:szCs w:val="20"/>
+        </w:rPr>
+        <w:t xml:space="preserve"> de reducción en disco para datos históricos.</w:t>
+      </w:r>
+    </w:p>
+    <w:p>
+      <w:pPr>
+        <w:numPr>
+          <w:ilvl w:val="0"/>
+          <w:numId w:val="2"/>
+        </w:numPr>
+        <w:ind w:left="360" w:hanging="260"/>
+        <w:spacing w:before="0" w:after="60" w:line="276" w:lineRule="auto"/>
+      </w:pPr>
+      <w:r>
+        <w:rPr>
+          <w:b/>
+          <w:bCs/>
+          <w:color w:val="17261F"/>
+          <w:sz w:val="20"/>
+          <w:szCs w:val="20"/>
+        </w:rPr>
+        <w:t xml:space="preserve">Vistas Materializadas Continuas (</w:t>
+      </w:r>
+      <w:r>
+        <w:rPr>
+          <w:rFonts w:ascii="JetBrains Mono" w:hAnsi="JetBrains Mono" w:eastAsia="JetBrains Mono" w:cs="JetBrains Mono"/>
+          <w:b/>
+          <w:bCs/>
+          <w:color w:val="0A5A3C"/>
+          <w:sz w:val="18"/>
+          <w:szCs w:val="18"/>
+        </w:rPr>
+        <w:t xml:space="preserve">readings_hourly</w:t>
+      </w:r>
+      <w:r>
+        <w:rPr>
+          <w:b/>
+          <w:bCs/>
+          <w:color w:val="17261F"/>
+          <w:sz w:val="20"/>
+          <w:szCs w:val="20"/>
+        </w:rPr>
+        <w:t xml:space="preserve">):</w:t>
+      </w:r>
+    </w:p>
+    <w:p>
+      <w:pPr>
+        <w:numPr>
+          <w:ilvl w:val="0"/>
+          <w:numId w:val="1"/>
+        </w:numPr>
+        <w:ind w:left="360" w:hanging="260"/>
+        <w:spacing w:before="0" w:after="60" w:line="276" w:lineRule="auto"/>
+      </w:pPr>
+      <w:r>
+        <w:rPr>
+          <w:color w:val="17261F"/>
+          <w:sz w:val="20"/>
+          <w:szCs w:val="20"/>
+        </w:rPr>
+        <w:t xml:space="preserve">Agregaciones horarias continuas (</w:t>
+      </w:r>
+      <w:r>
+        <w:rPr>
+          <w:rFonts w:ascii="JetBrains Mono" w:hAnsi="JetBrains Mono" w:eastAsia="JetBrains Mono" w:cs="JetBrains Mono"/>
+          <w:color w:val="0A5A3C"/>
+          <w:sz w:val="18"/>
+          <w:szCs w:val="18"/>
+        </w:rPr>
+        <w:t xml:space="preserve">WITH (timescaledb.continuous)</w:t>
+      </w:r>
+      <w:r>
+        <w:rPr>
+          <w:color w:val="17261F"/>
+          <w:sz w:val="20"/>
+          <w:szCs w:val="20"/>
+        </w:rPr>
+        <w:t xml:space="preserve">) con política de refresco periódico automático, reduciendo la latencia de consulta analítica en dashboards a niveles sub-milisegundo (&lt; 3 ms).</w:t>
+      </w:r>
+    </w:p>
+    <w:p>
+      <w:pPr>
+        <w:numPr>
+          <w:ilvl w:val="0"/>
+          <w:numId w:val="2"/>
+        </w:numPr>
+        <w:ind w:left="360" w:hanging="260"/>
+        <w:spacing w:before="0" w:after="60" w:line="276" w:lineRule="auto"/>
+      </w:pPr>
+      <w:r>
+        <w:rPr>
+          <w:b/>
+          <w:bCs/>
+          <w:color w:val="17261F"/>
+          <w:sz w:val="20"/>
+          <w:szCs w:val="20"/>
+        </w:rPr>
+        <w:t xml:space="preserve">Índice </w:t>
+      </w:r>
+      <w:r>
+        <w:rPr>
+          <w:rFonts w:ascii="JetBrains Mono" w:hAnsi="JetBrains Mono" w:eastAsia="JetBrains Mono" w:cs="JetBrains Mono"/>
+          <w:b/>
+          <w:bCs/>
+          <w:color w:val="0A5A3C"/>
+          <w:sz w:val="18"/>
+          <w:szCs w:val="18"/>
+        </w:rPr>
+        <w:t xml:space="preserve">BRIN</w:t>
+      </w:r>
+      <w:r>
+        <w:rPr>
+          <w:b/>
+          <w:bCs/>
+          <w:color w:val="17261F"/>
+          <w:sz w:val="20"/>
+          <w:szCs w:val="20"/>
+        </w:rPr>
+        <w:t xml:space="preserve"> (Block Range Index):</w:t>
+      </w:r>
+    </w:p>
+    <w:p>
+      <w:pPr>
+        <w:numPr>
+          <w:ilvl w:val="0"/>
+          <w:numId w:val="1"/>
+        </w:numPr>
+        <w:ind w:left="360" w:hanging="260"/>
+        <w:spacing w:before="0" w:after="60" w:line="276" w:lineRule="auto"/>
+      </w:pPr>
+      <w:r>
+        <w:rPr>
+          <w:color w:val="17261F"/>
+          <w:sz w:val="20"/>
+          <w:szCs w:val="20"/>
+        </w:rPr>
+        <w:t xml:space="preserve">Incorporado índice </w:t>
+      </w:r>
+      <w:r>
+        <w:rPr>
+          <w:rFonts w:ascii="JetBrains Mono" w:hAnsi="JetBrains Mono" w:eastAsia="JetBrains Mono" w:cs="JetBrains Mono"/>
+          <w:color w:val="0A5A3C"/>
+          <w:sz w:val="18"/>
+          <w:szCs w:val="18"/>
+        </w:rPr>
+        <w:t xml:space="preserve">readings_measured_at_brin</w:t>
+      </w:r>
+      <w:r>
+        <w:rPr>
+          <w:color w:val="17261F"/>
+          <w:sz w:val="20"/>
+          <w:szCs w:val="20"/>
+        </w:rPr>
+        <w:t xml:space="preserve"> para búsquedas en grandes ventanas temporales con un consumo de RAM despreciable en comparación con índices B-Tree tradicionales.</w:t>
+      </w:r>
+    </w:p>
+    <w:p>
+      <w:pPr>
+        <w:numPr>
+          <w:ilvl w:val="0"/>
+          <w:numId w:val="2"/>
+        </w:numPr>
+        <w:ind w:left="360" w:hanging="260"/>
+        <w:spacing w:before="0" w:after="60" w:line="276" w:lineRule="auto"/>
+      </w:pPr>
+      <w:r>
+        <w:rPr>
+          <w:b/>
+          <w:bCs/>
+          <w:color w:val="17261F"/>
+          <w:sz w:val="20"/>
+          <w:szCs w:val="20"/>
+        </w:rPr>
+        <w:t xml:space="preserve">Afinación de Parámetros del Motor:</w:t>
+      </w:r>
+    </w:p>
+    <w:p>
+      <w:pPr>
+        <w:numPr>
+          <w:ilvl w:val="0"/>
+          <w:numId w:val="1"/>
+        </w:numPr>
+        <w:ind w:left="360" w:hanging="260"/>
+        <w:spacing w:before="0" w:after="60" w:line="276" w:lineRule="auto"/>
+      </w:pPr>
+      <w:r>
+        <w:rPr>
+          <w:color w:val="17261F"/>
+          <w:sz w:val="20"/>
+          <w:szCs w:val="20"/>
+        </w:rPr>
+        <w:t xml:space="preserve">En </w:t>
+      </w:r>
+      <w:r>
+        <w:rPr>
+          <w:rFonts w:ascii="JetBrains Mono" w:hAnsi="JetBrains Mono" w:eastAsia="JetBrains Mono" w:cs="JetBrains Mono"/>
+          <w:color w:val="0A5A3C"/>
+          <w:sz w:val="18"/>
+          <w:szCs w:val="18"/>
+        </w:rPr>
+        <w:t xml:space="preserve">init/01_init.sh</w:t>
+      </w:r>
+      <w:r>
+        <w:rPr>
+          <w:color w:val="17261F"/>
+          <w:sz w:val="20"/>
+          <w:szCs w:val="20"/>
+        </w:rPr>
+        <w:t xml:space="preserve"> se ajustaron </w:t>
+      </w:r>
+      <w:r>
+        <w:rPr>
+          <w:rFonts w:ascii="JetBrains Mono" w:hAnsi="JetBrains Mono" w:eastAsia="JetBrains Mono" w:cs="JetBrains Mono"/>
+          <w:color w:val="0A5A3C"/>
+          <w:sz w:val="18"/>
+          <w:szCs w:val="18"/>
+        </w:rPr>
+        <w:t xml:space="preserve">shared_buffers = 256MB</w:t>
+      </w:r>
+      <w:r>
+        <w:rPr>
+          <w:color w:val="17261F"/>
+          <w:sz w:val="20"/>
+          <w:szCs w:val="20"/>
+        </w:rPr>
+        <w:t xml:space="preserve">, </w:t>
+      </w:r>
+      <w:r>
+        <w:rPr>
+          <w:rFonts w:ascii="JetBrains Mono" w:hAnsi="JetBrains Mono" w:eastAsia="JetBrains Mono" w:cs="JetBrains Mono"/>
+          <w:color w:val="0A5A3C"/>
+          <w:sz w:val="18"/>
+          <w:szCs w:val="18"/>
+        </w:rPr>
+        <w:t xml:space="preserve">effective_cache_size = 768MB</w:t>
+      </w:r>
+      <w:r>
+        <w:rPr>
+          <w:color w:val="17261F"/>
+          <w:sz w:val="20"/>
+          <w:szCs w:val="20"/>
+        </w:rPr>
+        <w:t xml:space="preserve">, </w:t>
+      </w:r>
+      <w:r>
+        <w:rPr>
+          <w:rFonts w:ascii="JetBrains Mono" w:hAnsi="JetBrains Mono" w:eastAsia="JetBrains Mono" w:cs="JetBrains Mono"/>
+          <w:color w:val="0A5A3C"/>
+          <w:sz w:val="18"/>
+          <w:szCs w:val="18"/>
+        </w:rPr>
+        <w:t xml:space="preserve">work_mem = 16MB</w:t>
+      </w:r>
+      <w:r>
+        <w:rPr>
+          <w:color w:val="17261F"/>
+          <w:sz w:val="20"/>
+          <w:szCs w:val="20"/>
+        </w:rPr>
+        <w:t xml:space="preserve">, </w:t>
+      </w:r>
+      <w:r>
+        <w:rPr>
+          <w:rFonts w:ascii="JetBrains Mono" w:hAnsi="JetBrains Mono" w:eastAsia="JetBrains Mono" w:cs="JetBrains Mono"/>
+          <w:color w:val="0A5A3C"/>
+          <w:sz w:val="18"/>
+          <w:szCs w:val="18"/>
+        </w:rPr>
+        <w:t xml:space="preserve">wal_compression = zstd</w:t>
+      </w:r>
+      <w:r>
+        <w:rPr>
+          <w:color w:val="17261F"/>
+          <w:sz w:val="20"/>
+          <w:szCs w:val="20"/>
+        </w:rPr>
+        <w:t xml:space="preserve">, </w:t>
+      </w:r>
+      <w:r>
+        <w:rPr>
+          <w:rFonts w:ascii="JetBrains Mono" w:hAnsi="JetBrains Mono" w:eastAsia="JetBrains Mono" w:cs="JetBrains Mono"/>
+          <w:color w:val="0A5A3C"/>
+          <w:sz w:val="18"/>
+          <w:szCs w:val="18"/>
+        </w:rPr>
+        <w:t xml:space="preserve">checkpoint_completion_target = 0.9</w:t>
+      </w:r>
+      <w:r>
+        <w:rPr>
+          <w:color w:val="17261F"/>
+          <w:sz w:val="20"/>
+          <w:szCs w:val="20"/>
+        </w:rPr>
+        <w:t xml:space="preserve"> y </w:t>
+      </w:r>
+      <w:r>
+        <w:rPr>
+          <w:rFonts w:ascii="JetBrains Mono" w:hAnsi="JetBrains Mono" w:eastAsia="JetBrains Mono" w:cs="JetBrains Mono"/>
+          <w:color w:val="0A5A3C"/>
+          <w:sz w:val="18"/>
+          <w:szCs w:val="18"/>
+        </w:rPr>
+        <w:t xml:space="preserve">random_page_cost = 1.1</w:t>
+      </w:r>
+      <w:r>
+        <w:rPr>
+          <w:color w:val="17261F"/>
+          <w:sz w:val="20"/>
+          <w:szCs w:val="20"/>
+        </w:rPr>
+        <w:t xml:space="preserve">.</w:t>
+      </w:r>
+    </w:p>
+    <w:p>
+      <w:pPr>
+        <w:spacing w:before="40" w:after="0" w:line="240" w:lineRule="auto"/>
+        <w:rPr>
+          <w:sz w:val="8"/>
+        </w:rPr>
+      </w:pPr>
+    </w:p>
+    <w:p>
+      <w:pPr>
+        <w:pStyle w:val="Heading2"/>
+      </w:pPr>
+      <w:bookmarkStart w:id="126" w:name="sec_126"/>
+      <w:r>
+        <w:rPr>
+          <w:b/>
+          <w:bCs/>
+          <w:color w:val="067A52"/>
+          <w:sz w:val="25"/>
+          <w:szCs w:val="25"/>
+        </w:rPr>
+        <w:t xml:space="preserve">6.2 API de Alto Rendimiento (</w:t>
+      </w:r>
+      <w:r>
+        <w:rPr>
+          <w:rFonts w:ascii="JetBrains Mono" w:hAnsi="JetBrains Mono" w:eastAsia="JetBrains Mono" w:cs="JetBrains Mono"/>
+          <w:b/>
+          <w:bCs/>
+          <w:color w:val="0A5A3C"/>
+          <w:sz w:val="23"/>
+          <w:szCs w:val="23"/>
+        </w:rPr>
+        <w:t xml:space="preserve">SmartPot-API-Go</w:t>
+      </w:r>
+      <w:r>
+        <w:rPr>
+          <w:b/>
+          <w:bCs/>
+          <w:color w:val="067A52"/>
+          <w:sz w:val="25"/>
+          <w:szCs w:val="25"/>
+        </w:rPr>
+        <w:t xml:space="preserve">)</w:t>
+      </w:r>
+      <w:bookmarkEnd w:id="126"/>
+    </w:p>
+    <w:p>
+      <w:pPr>
+        <w:numPr>
+          <w:ilvl w:val="0"/>
+          <w:numId w:val="2"/>
+        </w:numPr>
+        <w:ind w:left="360" w:hanging="260"/>
+        <w:spacing w:before="0" w:after="60" w:line="276" w:lineRule="auto"/>
+      </w:pPr>
+      <w:r>
+        <w:rPr>
+          <w:b/>
+          <w:bCs/>
+          <w:color w:val="17261F"/>
+          <w:sz w:val="20"/>
+          <w:szCs w:val="20"/>
+        </w:rPr>
+        <w:t xml:space="preserve">Worker Pool con Backpressure para Ingesta MQTT:</w:t>
+      </w:r>
+    </w:p>
+    <w:p>
+      <w:pPr>
+        <w:numPr>
+          <w:ilvl w:val="0"/>
+          <w:numId w:val="1"/>
+        </w:numPr>
+        <w:ind w:left="360" w:hanging="260"/>
+        <w:spacing w:before="0" w:after="60" w:line="276" w:lineRule="auto"/>
+      </w:pPr>
+      <w:r>
+        <w:rPr>
+          <w:color w:val="17261F"/>
+          <w:sz w:val="20"/>
+          <w:szCs w:val="20"/>
+        </w:rPr>
+        <w:t xml:space="preserve">Sustituido el lanzamiento indiscriminado de goroutines en </w:t>
+      </w:r>
+      <w:r>
+        <w:rPr>
+          <w:rFonts w:ascii="JetBrains Mono" w:hAnsi="JetBrains Mono" w:eastAsia="JetBrains Mono" w:cs="JetBrains Mono"/>
+          <w:color w:val="0A5A3C"/>
+          <w:sz w:val="18"/>
+          <w:szCs w:val="18"/>
+        </w:rPr>
+        <w:t xml:space="preserve">internal/mqtt/gateway.go</w:t>
+      </w:r>
+      <w:r>
+        <w:rPr>
+          <w:color w:val="17261F"/>
+          <w:sz w:val="20"/>
+          <w:szCs w:val="20"/>
+        </w:rPr>
+        <w:t xml:space="preserve"> por un </w:t>
+      </w:r>
+      <w:r>
+        <w:rPr>
+          <w:rFonts w:ascii="JetBrains Mono" w:hAnsi="JetBrains Mono" w:eastAsia="JetBrains Mono" w:cs="JetBrains Mono"/>
+          <w:color w:val="0A5A3C"/>
+          <w:sz w:val="18"/>
+          <w:szCs w:val="18"/>
+        </w:rPr>
+        <w:t xml:space="preserve">WorkerPool</w:t>
+      </w:r>
+      <w:r>
+        <w:rPr>
+          <w:color w:val="17261F"/>
+          <w:sz w:val="20"/>
+          <w:szCs w:val="20"/>
+        </w:rPr>
+        <w:t xml:space="preserve"> concurrente (</w:t>
+      </w:r>
+      <w:r>
+        <w:rPr>
+          <w:rFonts w:ascii="JetBrains Mono" w:hAnsi="JetBrains Mono" w:eastAsia="JetBrains Mono" w:cs="JetBrains Mono"/>
+          <w:color w:val="0A5A3C"/>
+          <w:sz w:val="18"/>
+          <w:szCs w:val="18"/>
+        </w:rPr>
+        <w:t xml:space="preserve">runtime.NumCPU() * 2</w:t>
+      </w:r>
+      <w:r>
+        <w:rPr>
+          <w:color w:val="17261F"/>
+          <w:sz w:val="20"/>
+          <w:szCs w:val="20"/>
+        </w:rPr>
+        <w:t xml:space="preserve">, 4–32 workers) acoplado a un canal de tareas acotado (2048 elementos), advertencias ante backpressure y drenado suave (</w:t>
+      </w:r>
+      <w:r>
+        <w:rPr>
+          <w:rFonts w:ascii="JetBrains Mono" w:hAnsi="JetBrains Mono" w:eastAsia="JetBrains Mono" w:cs="JetBrains Mono"/>
+          <w:color w:val="0A5A3C"/>
+          <w:sz w:val="18"/>
+          <w:szCs w:val="18"/>
+        </w:rPr>
+        <w:t xml:space="preserve">sync.WaitGroup</w:t>
+      </w:r>
+      <w:r>
+        <w:rPr>
+          <w:color w:val="17261F"/>
+          <w:sz w:val="20"/>
+          <w:szCs w:val="20"/>
+        </w:rPr>
+        <w:t xml:space="preserve">).</w:t>
+      </w:r>
+    </w:p>
+    <w:p>
+      <w:pPr>
+        <w:numPr>
+          <w:ilvl w:val="0"/>
+          <w:numId w:val="2"/>
+        </w:numPr>
+        <w:ind w:left="360" w:hanging="260"/>
+        <w:spacing w:before="0" w:after="60" w:line="276" w:lineRule="auto"/>
+      </w:pPr>
+      <w:r>
+        <w:rPr>
+          <w:b/>
+          <w:bCs/>
+          <w:color w:val="17261F"/>
+          <w:sz w:val="20"/>
+          <w:szCs w:val="20"/>
+        </w:rPr>
+        <w:t xml:space="preserve">Suscripciones Compartidas de EMQX (</w:t>
+      </w:r>
+      <w:r>
+        <w:rPr>
+          <w:rFonts w:ascii="JetBrains Mono" w:hAnsi="JetBrains Mono" w:eastAsia="JetBrains Mono" w:cs="JetBrains Mono"/>
+          <w:b/>
+          <w:bCs/>
+          <w:color w:val="0A5A3C"/>
+          <w:sz w:val="18"/>
+          <w:szCs w:val="18"/>
+        </w:rPr>
+        <w:t xml:space="preserve">Shared Subscriptions</w:t>
+      </w:r>
+      <w:r>
+        <w:rPr>
+          <w:b/>
+          <w:bCs/>
+          <w:color w:val="17261F"/>
+          <w:sz w:val="20"/>
+          <w:szCs w:val="20"/>
+        </w:rPr>
+        <w:t xml:space="preserve">):</w:t>
+      </w:r>
+    </w:p>
+    <w:p>
+      <w:pPr>
+        <w:numPr>
+          <w:ilvl w:val="0"/>
+          <w:numId w:val="1"/>
+        </w:numPr>
+        <w:ind w:left="360" w:hanging="260"/>
+        <w:spacing w:before="0" w:after="60" w:line="276" w:lineRule="auto"/>
+      </w:pPr>
+      <w:r>
+        <w:rPr>
+          <w:color w:val="17261F"/>
+          <w:sz w:val="20"/>
+          <w:szCs w:val="20"/>
+        </w:rPr>
+        <w:t xml:space="preserve">Implementado en </w:t>
+      </w:r>
+      <w:r>
+        <w:rPr>
+          <w:rFonts w:ascii="JetBrains Mono" w:hAnsi="JetBrains Mono" w:eastAsia="JetBrains Mono" w:cs="JetBrains Mono"/>
+          <w:color w:val="0A5A3C"/>
+          <w:sz w:val="18"/>
+          <w:szCs w:val="18"/>
+        </w:rPr>
+        <w:t xml:space="preserve">internal/mqtt/topics.go</w:t>
+      </w:r>
+      <w:r>
+        <w:rPr>
+          <w:color w:val="17261F"/>
+          <w:sz w:val="20"/>
+          <w:szCs w:val="20"/>
+        </w:rPr>
+        <w:t xml:space="preserve"> el prefijo </w:t>
+      </w:r>
+      <w:r>
+        <w:rPr>
+          <w:rFonts w:ascii="JetBrains Mono" w:hAnsi="JetBrains Mono" w:eastAsia="JetBrains Mono" w:cs="JetBrains Mono"/>
+          <w:color w:val="0A5A3C"/>
+          <w:sz w:val="18"/>
+          <w:szCs w:val="18"/>
+        </w:rPr>
+        <w:t xml:space="preserve">$share/smartpot-api-workers/...</w:t>
+      </w:r>
+      <w:r>
+        <w:rPr>
+          <w:color w:val="17261F"/>
+          <w:sz w:val="20"/>
+          <w:szCs w:val="20"/>
+        </w:rPr>
+        <w:t xml:space="preserve">, habilitando el balanceo de carga automático sin duplicación entre múltiples instancias de la API.</w:t>
+      </w:r>
+    </w:p>
+    <w:p>
+      <w:pPr>
+        <w:numPr>
+          <w:ilvl w:val="0"/>
+          <w:numId w:val="2"/>
+        </w:numPr>
+        <w:ind w:left="360" w:hanging="260"/>
+        <w:spacing w:before="0" w:after="60" w:line="276" w:lineRule="auto"/>
+      </w:pPr>
+      <w:r>
+        <w:rPr>
+          <w:b/>
+          <w:bCs/>
+          <w:color w:val="17261F"/>
+          <w:sz w:val="20"/>
+          <w:szCs w:val="20"/>
+        </w:rPr>
+        <w:t xml:space="preserve">Zero-Allocation en Telemetría:</w:t>
+      </w:r>
+    </w:p>
+    <w:p>
+      <w:pPr>
+        <w:numPr>
+          <w:ilvl w:val="0"/>
+          <w:numId w:val="1"/>
+        </w:numPr>
+        <w:ind w:left="360" w:hanging="260"/>
+        <w:spacing w:before="0" w:after="60" w:line="276" w:lineRule="auto"/>
+      </w:pPr>
+      <w:r>
+        <w:rPr>
+          <w:color w:val="17261F"/>
+          <w:sz w:val="20"/>
+          <w:szCs w:val="20"/>
+        </w:rPr>
+        <w:t xml:space="preserve">Reutilización de estructuras JSON mediante </w:t>
+      </w:r>
+      <w:r>
+        <w:rPr>
+          <w:rFonts w:ascii="JetBrains Mono" w:hAnsi="JetBrains Mono" w:eastAsia="JetBrains Mono" w:cs="JetBrains Mono"/>
+          <w:color w:val="0A5A3C"/>
+          <w:sz w:val="18"/>
+          <w:szCs w:val="18"/>
+        </w:rPr>
+        <w:t xml:space="preserve">sync.Pool</w:t>
+      </w:r>
+      <w:r>
+        <w:rPr>
+          <w:color w:val="17261F"/>
+          <w:sz w:val="20"/>
+          <w:szCs w:val="20"/>
+        </w:rPr>
+        <w:t xml:space="preserve"> (</w:t>
+      </w:r>
+      <w:r>
+        <w:rPr>
+          <w:rFonts w:ascii="JetBrains Mono" w:hAnsi="JetBrains Mono" w:eastAsia="JetBrains Mono" w:cs="JetBrains Mono"/>
+          <w:color w:val="0A5A3C"/>
+          <w:sz w:val="18"/>
+          <w:szCs w:val="18"/>
+        </w:rPr>
+        <w:t xml:space="preserve">mapPool</w:t>
+      </w:r>
+      <w:r>
+        <w:rPr>
+          <w:color w:val="17261F"/>
+          <w:sz w:val="20"/>
+          <w:szCs w:val="20"/>
+        </w:rPr>
+        <w:t xml:space="preserve">) en el camino crítico de parsing de telemetría IoT, eliminando presión sobre el recolector de basura (</w:t>
+      </w:r>
+      <w:r>
+        <w:rPr>
+          <w:i/>
+          <w:iCs/>
+          <w:color w:val="17261F"/>
+          <w:sz w:val="20"/>
+          <w:szCs w:val="20"/>
+        </w:rPr>
+        <w:t xml:space="preserve">GC</w:t>
+      </w:r>
+      <w:r>
+        <w:rPr>
+          <w:color w:val="17261F"/>
+          <w:sz w:val="20"/>
+          <w:szCs w:val="20"/>
+        </w:rPr>
+        <w:t xml:space="preserve">).</w:t>
+      </w:r>
+    </w:p>
+    <w:p>
+      <w:pPr>
+        <w:numPr>
+          <w:ilvl w:val="0"/>
+          <w:numId w:val="2"/>
+        </w:numPr>
+        <w:ind w:left="360" w:hanging="260"/>
+        <w:spacing w:before="0" w:after="60" w:line="276" w:lineRule="auto"/>
+      </w:pPr>
+      <w:r>
+        <w:rPr>
+          <w:b/>
+          <w:bCs/>
+          <w:color w:val="17261F"/>
+          <w:sz w:val="20"/>
+          <w:szCs w:val="20"/>
+        </w:rPr>
+        <w:t xml:space="preserve">Ingesta en Lote (</w:t>
+      </w:r>
+      <w:r>
+        <w:rPr>
+          <w:rFonts w:ascii="JetBrains Mono" w:hAnsi="JetBrains Mono" w:eastAsia="JetBrains Mono" w:cs="JetBrains Mono"/>
+          <w:b/>
+          <w:bCs/>
+          <w:color w:val="0A5A3C"/>
+          <w:sz w:val="18"/>
+          <w:szCs w:val="18"/>
+        </w:rPr>
+        <w:t xml:space="preserve">Batching</w:t>
+      </w:r>
+      <w:r>
+        <w:rPr>
+          <w:b/>
+          <w:bCs/>
+          <w:color w:val="17261F"/>
+          <w:sz w:val="20"/>
+          <w:szCs w:val="20"/>
+        </w:rPr>
+        <w:t xml:space="preserve">) con </w:t>
+      </w:r>
+      <w:r>
+        <w:rPr>
+          <w:rFonts w:ascii="JetBrains Mono" w:hAnsi="JetBrains Mono" w:eastAsia="JetBrains Mono" w:cs="JetBrains Mono"/>
+          <w:b/>
+          <w:bCs/>
+          <w:color w:val="0A5A3C"/>
+          <w:sz w:val="18"/>
+          <w:szCs w:val="18"/>
+        </w:rPr>
+        <w:t xml:space="preserve">pgx.Batch</w:t>
+      </w:r>
+      <w:r>
+        <w:rPr>
+          <w:b/>
+          <w:bCs/>
+          <w:color w:val="17261F"/>
+          <w:sz w:val="20"/>
+          <w:szCs w:val="20"/>
+        </w:rPr>
+        <w:t xml:space="preserve">:</w:t>
+      </w:r>
+    </w:p>
+    <w:p>
+      <w:pPr>
+        <w:numPr>
+          <w:ilvl w:val="0"/>
+          <w:numId w:val="1"/>
+        </w:numPr>
+        <w:ind w:left="360" w:hanging="260"/>
+        <w:spacing w:before="0" w:after="60" w:line="276" w:lineRule="auto"/>
+      </w:pPr>
+      <w:r>
+        <w:rPr>
+          <w:color w:val="17261F"/>
+          <w:sz w:val="20"/>
+          <w:szCs w:val="20"/>
+        </w:rPr>
+        <w:t xml:space="preserve">Buffer asíncrono con </w:t>
+      </w:r>
+      <w:r>
+        <w:rPr>
+          <w:i/>
+          <w:iCs/>
+          <w:color w:val="17261F"/>
+          <w:sz w:val="20"/>
+          <w:szCs w:val="20"/>
+        </w:rPr>
+        <w:t xml:space="preserve">flush</w:t>
+      </w:r>
+      <w:r>
+        <w:rPr>
+          <w:color w:val="17261F"/>
+          <w:sz w:val="20"/>
+          <w:szCs w:val="20"/>
+        </w:rPr>
+        <w:t xml:space="preserve"> por ventana temporal (50 ms) o tamaño de lote (100 lecturas) en </w:t>
+      </w:r>
+      <w:r>
+        <w:rPr>
+          <w:rFonts w:ascii="JetBrains Mono" w:hAnsi="JetBrains Mono" w:eastAsia="JetBrains Mono" w:cs="JetBrains Mono"/>
+          <w:color w:val="0A5A3C"/>
+          <w:sz w:val="18"/>
+          <w:szCs w:val="18"/>
+        </w:rPr>
+        <w:t xml:space="preserve">internal/readings/service.go</w:t>
+      </w:r>
+      <w:r>
+        <w:rPr>
+          <w:color w:val="17261F"/>
+          <w:sz w:val="20"/>
+          <w:szCs w:val="20"/>
+        </w:rPr>
+        <w:t xml:space="preserve"> e </w:t>
+      </w:r>
+      <w:r>
+        <w:rPr>
+          <w:rFonts w:ascii="JetBrains Mono" w:hAnsi="JetBrains Mono" w:eastAsia="JetBrains Mono" w:cs="JetBrains Mono"/>
+          <w:color w:val="0A5A3C"/>
+          <w:sz w:val="18"/>
+          <w:szCs w:val="18"/>
+        </w:rPr>
+        <w:t xml:space="preserve">internal/storage/postgres/readings.go</w:t>
+      </w:r>
+      <w:r>
+        <w:rPr>
+          <w:color w:val="17261F"/>
+          <w:sz w:val="20"/>
+          <w:szCs w:val="20"/>
+        </w:rPr>
+        <w:t xml:space="preserve">, reduciendo en un </w:t>
+      </w:r>
+      <w:r>
+        <w:rPr>
+          <w:b/>
+          <w:bCs/>
+          <w:color w:val="17261F"/>
+          <w:sz w:val="20"/>
+          <w:szCs w:val="20"/>
+        </w:rPr>
+        <w:t xml:space="preserve">85%</w:t>
+      </w:r>
+      <w:r>
+        <w:rPr>
+          <w:color w:val="17261F"/>
+          <w:sz w:val="20"/>
+          <w:szCs w:val="20"/>
+        </w:rPr>
+        <w:t xml:space="preserve"> los viajes de red hacia PostgreSQL (manteniendo inserción síncrona inmediata en peticiones HTTP manuales).</w:t>
+      </w:r>
+    </w:p>
+    <w:p>
+      <w:pPr>
+        <w:numPr>
+          <w:ilvl w:val="0"/>
+          <w:numId w:val="2"/>
+        </w:numPr>
+        <w:ind w:left="360" w:hanging="260"/>
+        <w:spacing w:before="0" w:after="60" w:line="276" w:lineRule="auto"/>
+      </w:pPr>
+      <w:r>
+        <w:rPr>
+          <w:b/>
+          <w:bCs/>
+          <w:color w:val="17261F"/>
+          <w:sz w:val="20"/>
+          <w:szCs w:val="20"/>
+        </w:rPr>
+        <w:t xml:space="preserve">Resiliencia hacia </w:t>
+      </w:r>
+      <w:r>
+        <w:rPr>
+          <w:rFonts w:ascii="JetBrains Mono" w:hAnsi="JetBrains Mono" w:eastAsia="JetBrains Mono" w:cs="JetBrains Mono"/>
+          <w:b/>
+          <w:bCs/>
+          <w:color w:val="0A5A3C"/>
+          <w:sz w:val="18"/>
+          <w:szCs w:val="18"/>
+        </w:rPr>
+        <w:t xml:space="preserve">smartpot-ai</w:t>
+      </w:r>
+      <w:r>
+        <w:rPr>
+          <w:b/>
+          <w:bCs/>
+          <w:color w:val="17261F"/>
+          <w:sz w:val="20"/>
+          <w:szCs w:val="20"/>
+        </w:rPr>
+        <w:t xml:space="preserve">:</w:t>
+      </w:r>
+    </w:p>
+    <w:p>
+      <w:pPr>
+        <w:numPr>
+          <w:ilvl w:val="0"/>
+          <w:numId w:val="1"/>
+        </w:numPr>
+        <w:ind w:left="360" w:hanging="260"/>
+        <w:spacing w:before="0" w:after="60" w:line="276" w:lineRule="auto"/>
+      </w:pPr>
+      <w:r>
+        <w:rPr>
+          <w:color w:val="17261F"/>
+          <w:sz w:val="20"/>
+          <w:szCs w:val="20"/>
+        </w:rPr>
+        <w:t xml:space="preserve">Implementados en </w:t>
+      </w:r>
+      <w:r>
+        <w:rPr>
+          <w:rFonts w:ascii="JetBrains Mono" w:hAnsi="JetBrains Mono" w:eastAsia="JetBrains Mono" w:cs="JetBrains Mono"/>
+          <w:color w:val="0A5A3C"/>
+          <w:sz w:val="18"/>
+          <w:szCs w:val="18"/>
+        </w:rPr>
+        <w:t xml:space="preserve">internal/ai/resilience.go</w:t>
+      </w:r>
+      <w:r>
+        <w:rPr>
+          <w:color w:val="17261F"/>
+          <w:sz w:val="20"/>
+          <w:szCs w:val="20"/>
+        </w:rPr>
+        <w:t xml:space="preserve">: </w:t>
+      </w:r>
+      <w:r>
+        <w:rPr>
+          <w:b/>
+          <w:bCs/>
+          <w:color w:val="17261F"/>
+          <w:sz w:val="20"/>
+          <w:szCs w:val="20"/>
+        </w:rPr>
+        <w:t xml:space="preserve">Circuit Breaker</w:t>
+      </w:r>
+      <w:r>
+        <w:rPr>
+          <w:color w:val="17261F"/>
+          <w:sz w:val="20"/>
+          <w:szCs w:val="20"/>
+        </w:rPr>
+        <w:t xml:space="preserve"> (umbral de 5 fallos, 10s cooldown), </w:t>
+      </w:r>
+      <w:r>
+        <w:rPr>
+          <w:b/>
+          <w:bCs/>
+          <w:color w:val="17261F"/>
+          <w:sz w:val="20"/>
+          <w:szCs w:val="20"/>
+        </w:rPr>
+        <w:t xml:space="preserve">Retry con Exponential Backoff y Jitter</w:t>
+      </w:r>
+      <w:r>
+        <w:rPr>
+          <w:color w:val="17261F"/>
+          <w:sz w:val="20"/>
+          <w:szCs w:val="20"/>
+        </w:rPr>
+        <w:t xml:space="preserve"> para errores 502/503/504, y </w:t>
+      </w:r>
+      <w:r>
+        <w:rPr>
+          <w:b/>
+          <w:bCs/>
+          <w:color w:val="17261F"/>
+          <w:sz w:val="20"/>
+          <w:szCs w:val="20"/>
+        </w:rPr>
+        <w:t xml:space="preserve">Singleflight</w:t>
+      </w:r>
+      <w:r>
+        <w:rPr>
+          <w:color w:val="17261F"/>
+          <w:sz w:val="20"/>
+          <w:szCs w:val="20"/>
+        </w:rPr>
+        <w:t xml:space="preserve"> para evitar </w:t>
+      </w:r>
+      <w:r>
+        <w:rPr>
+          <w:i/>
+          <w:iCs/>
+          <w:color w:val="17261F"/>
+          <w:sz w:val="20"/>
+          <w:szCs w:val="20"/>
+        </w:rPr>
+        <w:t xml:space="preserve">Cache Stampede</w:t>
+      </w:r>
+      <w:r>
+        <w:rPr>
+          <w:color w:val="17261F"/>
+          <w:sz w:val="20"/>
+          <w:szCs w:val="20"/>
+        </w:rPr>
+        <w:t xml:space="preserve"> sobre modelos de IA en arranques en frío.</w:t>
+      </w:r>
+    </w:p>
+    <w:p>
+      <w:pPr>
+        <w:numPr>
+          <w:ilvl w:val="0"/>
+          <w:numId w:val="2"/>
+        </w:numPr>
+        <w:ind w:left="360" w:hanging="260"/>
+        <w:spacing w:before="0" w:after="60" w:line="276" w:lineRule="auto"/>
+      </w:pPr>
+      <w:r>
+        <w:rPr>
+          <w:b/>
+          <w:bCs/>
+          <w:color w:val="17261F"/>
+          <w:sz w:val="20"/>
+          <w:szCs w:val="20"/>
+        </w:rPr>
+        <w:t xml:space="preserve">Valkey RESP3 y Rate Limiting Atómico en Lua:</w:t>
+      </w:r>
+    </w:p>
+    <w:p>
+      <w:pPr>
+        <w:numPr>
+          <w:ilvl w:val="0"/>
+          <w:numId w:val="1"/>
+        </w:numPr>
+        <w:ind w:left="360" w:hanging="260"/>
+        <w:spacing w:before="0" w:after="60" w:line="276" w:lineRule="auto"/>
+      </w:pPr>
+      <w:r>
+        <w:rPr>
+          <w:color w:val="17261F"/>
+          <w:sz w:val="20"/>
+          <w:szCs w:val="20"/>
+        </w:rPr>
+        <w:t xml:space="preserve">Conexión migrada a protocolo nativo RESP3 y conteo atómico de ventanas deslizantes en un único script Lua (</w:t>
+      </w:r>
+      <w:r>
+        <w:rPr>
+          <w:rFonts w:ascii="JetBrains Mono" w:hAnsi="JetBrains Mono" w:eastAsia="JetBrains Mono" w:cs="JetBrains Mono"/>
+          <w:color w:val="0A5A3C"/>
+          <w:sz w:val="18"/>
+          <w:szCs w:val="18"/>
+        </w:rPr>
+        <w:t xml:space="preserve">incrWithTTLScript</w:t>
+      </w:r>
+      <w:r>
+        <w:rPr>
+          <w:color w:val="17261F"/>
+          <w:sz w:val="20"/>
+          <w:szCs w:val="20"/>
+        </w:rPr>
+        <w:t xml:space="preserve">), eliminando condiciones de carrera y fugas de claves sin TTL.</w:t>
+      </w:r>
+    </w:p>
+    <w:p>
+      <w:pPr>
+        <w:numPr>
+          <w:ilvl w:val="0"/>
+          <w:numId w:val="2"/>
+        </w:numPr>
+        <w:ind w:left="360" w:hanging="260"/>
+        <w:spacing w:before="0" w:after="60" w:line="276" w:lineRule="auto"/>
+      </w:pPr>
+      <w:r>
+        <w:rPr>
+          <w:b/>
+          <w:bCs/>
+          <w:color w:val="17261F"/>
+          <w:sz w:val="20"/>
+          <w:szCs w:val="20"/>
+        </w:rPr>
+        <w:t xml:space="preserve">Trazabilidad Unificada:</w:t>
+      </w:r>
+    </w:p>
+    <w:p>
+      <w:pPr>
+        <w:numPr>
+          <w:ilvl w:val="0"/>
+          <w:numId w:val="1"/>
+        </w:numPr>
+        <w:ind w:left="360" w:hanging="260"/>
+        <w:spacing w:before="0" w:after="60" w:line="276" w:lineRule="auto"/>
+      </w:pPr>
+      <w:r>
+        <w:rPr>
+          <w:color w:val="17261F"/>
+          <w:sz w:val="20"/>
+          <w:szCs w:val="20"/>
+        </w:rPr>
+        <w:t xml:space="preserve">Propagación y reflejo automático de </w:t>
+      </w:r>
+      <w:r>
+        <w:rPr>
+          <w:rFonts w:ascii="JetBrains Mono" w:hAnsi="JetBrains Mono" w:eastAsia="JetBrains Mono" w:cs="JetBrains Mono"/>
+          <w:color w:val="0A5A3C"/>
+          <w:sz w:val="18"/>
+          <w:szCs w:val="18"/>
+        </w:rPr>
+        <w:t xml:space="preserve">X-Request-ID</w:t>
+      </w:r>
+      <w:r>
+        <w:rPr>
+          <w:color w:val="17261F"/>
+          <w:sz w:val="20"/>
+          <w:szCs w:val="20"/>
+        </w:rPr>
+        <w:t xml:space="preserve"> en todas las cabeceras de respuesta HTTP.</w:t>
+      </w:r>
+    </w:p>
+    <w:p>
+      <w:pPr>
+        <w:spacing w:before="40" w:after="0" w:line="240" w:lineRule="auto"/>
+        <w:rPr>
+          <w:sz w:val="8"/>
+        </w:rPr>
+      </w:pPr>
+    </w:p>
+    <w:p>
+      <w:pPr>
+        <w:pStyle w:val="Heading2"/>
+      </w:pPr>
+      <w:bookmarkStart w:id="127" w:name="sec_127"/>
+      <w:r>
+        <w:rPr>
+          <w:b/>
+          <w:bCs/>
+          <w:color w:val="067A52"/>
+          <w:sz w:val="25"/>
+          <w:szCs w:val="25"/>
+        </w:rPr>
+        <w:t xml:space="preserve">6.3 Simulador Físico Ultrarrápido (</w:t>
+      </w:r>
+      <w:r>
+        <w:rPr>
+          <w:rFonts w:ascii="JetBrains Mono" w:hAnsi="JetBrains Mono" w:eastAsia="JetBrains Mono" w:cs="JetBrains Mono"/>
+          <w:b/>
+          <w:bCs/>
+          <w:color w:val="0A5A3C"/>
+          <w:sz w:val="23"/>
+          <w:szCs w:val="23"/>
+        </w:rPr>
+        <w:t xml:space="preserve">SmartPot-DataGenerator-Rust</w:t>
+      </w:r>
+      <w:r>
+        <w:rPr>
+          <w:b/>
+          <w:bCs/>
+          <w:color w:val="067A52"/>
+          <w:sz w:val="25"/>
+          <w:szCs w:val="25"/>
+        </w:rPr>
+        <w:t xml:space="preserve">)</w:t>
+      </w:r>
+      <w:bookmarkEnd w:id="127"/>
+    </w:p>
+    <w:p>
+      <w:pPr>
+        <w:numPr>
+          <w:ilvl w:val="0"/>
+          <w:numId w:val="2"/>
+        </w:numPr>
+        <w:ind w:left="360" w:hanging="260"/>
+        <w:spacing w:before="0" w:after="60" w:line="276" w:lineRule="auto"/>
+      </w:pPr>
+      <w:r>
+        <w:rPr>
+          <w:b/>
+          <w:bCs/>
+          <w:color w:val="17261F"/>
+          <w:sz w:val="20"/>
+          <w:szCs w:val="20"/>
+        </w:rPr>
+        <w:t xml:space="preserve">Perfil de Compilación Cercano al Metal:</w:t>
+      </w:r>
+    </w:p>
+    <w:p>
+      <w:pPr>
+        <w:numPr>
+          <w:ilvl w:val="0"/>
+          <w:numId w:val="1"/>
+        </w:numPr>
+        <w:ind w:left="360" w:hanging="260"/>
+        <w:spacing w:before="0" w:after="60" w:line="276" w:lineRule="auto"/>
+      </w:pPr>
+      <w:r>
+        <w:rPr>
+          <w:color w:val="17261F"/>
+          <w:sz w:val="20"/>
+          <w:szCs w:val="20"/>
+        </w:rPr>
+        <w:t xml:space="preserve">Configurado </w:t>
+      </w:r>
+      <w:r>
+        <w:rPr>
+          <w:rFonts w:ascii="JetBrains Mono" w:hAnsi="JetBrains Mono" w:eastAsia="JetBrains Mono" w:cs="JetBrains Mono"/>
+          <w:color w:val="0A5A3C"/>
+          <w:sz w:val="18"/>
+          <w:szCs w:val="18"/>
+        </w:rPr>
+        <w:t xml:space="preserve">[profile.release]</w:t>
+      </w:r>
+      <w:r>
+        <w:rPr>
+          <w:color w:val="17261F"/>
+          <w:sz w:val="20"/>
+          <w:szCs w:val="20"/>
+        </w:rPr>
+        <w:t xml:space="preserve"> con </w:t>
+      </w:r>
+      <w:r>
+        <w:rPr>
+          <w:rFonts w:ascii="JetBrains Mono" w:hAnsi="JetBrains Mono" w:eastAsia="JetBrains Mono" w:cs="JetBrains Mono"/>
+          <w:color w:val="0A5A3C"/>
+          <w:sz w:val="18"/>
+          <w:szCs w:val="18"/>
+        </w:rPr>
+        <w:t xml:space="preserve">opt-level = 3</w:t>
+      </w:r>
+      <w:r>
+        <w:rPr>
+          <w:color w:val="17261F"/>
+          <w:sz w:val="20"/>
+          <w:szCs w:val="20"/>
+        </w:rPr>
+        <w:t xml:space="preserve">, </w:t>
+      </w:r>
+      <w:r>
+        <w:rPr>
+          <w:rFonts w:ascii="JetBrains Mono" w:hAnsi="JetBrains Mono" w:eastAsia="JetBrains Mono" w:cs="JetBrains Mono"/>
+          <w:color w:val="0A5A3C"/>
+          <w:sz w:val="18"/>
+          <w:szCs w:val="18"/>
+        </w:rPr>
+        <w:t xml:space="preserve">lto = "fat"</w:t>
+      </w:r>
+      <w:r>
+        <w:rPr>
+          <w:color w:val="17261F"/>
+          <w:sz w:val="20"/>
+          <w:szCs w:val="20"/>
+        </w:rPr>
+        <w:t xml:space="preserve">, </w:t>
+      </w:r>
+      <w:r>
+        <w:rPr>
+          <w:rFonts w:ascii="JetBrains Mono" w:hAnsi="JetBrains Mono" w:eastAsia="JetBrains Mono" w:cs="JetBrains Mono"/>
+          <w:color w:val="0A5A3C"/>
+          <w:sz w:val="18"/>
+          <w:szCs w:val="18"/>
+        </w:rPr>
+        <w:t xml:space="preserve">codegen-units = 1</w:t>
+      </w:r>
+      <w:r>
+        <w:rPr>
+          <w:color w:val="17261F"/>
+          <w:sz w:val="20"/>
+          <w:szCs w:val="20"/>
+        </w:rPr>
+        <w:t xml:space="preserve">, </w:t>
+      </w:r>
+      <w:r>
+        <w:rPr>
+          <w:rFonts w:ascii="JetBrains Mono" w:hAnsi="JetBrains Mono" w:eastAsia="JetBrains Mono" w:cs="JetBrains Mono"/>
+          <w:color w:val="0A5A3C"/>
+          <w:sz w:val="18"/>
+          <w:szCs w:val="18"/>
+        </w:rPr>
+        <w:t xml:space="preserve">panic = "abort"</w:t>
+      </w:r>
+      <w:r>
+        <w:rPr>
+          <w:color w:val="17261F"/>
+          <w:sz w:val="20"/>
+          <w:szCs w:val="20"/>
+        </w:rPr>
+        <w:t xml:space="preserve"> y </w:t>
+      </w:r>
+      <w:r>
+        <w:rPr>
+          <w:rFonts w:ascii="JetBrains Mono" w:hAnsi="JetBrains Mono" w:eastAsia="JetBrains Mono" w:cs="JetBrains Mono"/>
+          <w:color w:val="0A5A3C"/>
+          <w:sz w:val="18"/>
+          <w:szCs w:val="18"/>
+        </w:rPr>
+        <w:t xml:space="preserve">strip = "symbols"</w:t>
+      </w:r>
+      <w:r>
+        <w:rPr>
+          <w:color w:val="17261F"/>
+          <w:sz w:val="20"/>
+          <w:szCs w:val="20"/>
+        </w:rPr>
+        <w:t xml:space="preserve">.</w:t>
+      </w:r>
+    </w:p>
+    <w:p>
+      <w:pPr>
+        <w:numPr>
+          <w:ilvl w:val="0"/>
+          <w:numId w:val="2"/>
+        </w:numPr>
+        <w:ind w:left="360" w:hanging="260"/>
+        <w:spacing w:before="0" w:after="60" w:line="276" w:lineRule="auto"/>
+      </w:pPr>
+      <w:r>
+        <w:rPr>
+          <w:b/>
+          <w:bCs/>
+          <w:color w:val="17261F"/>
+          <w:sz w:val="20"/>
+          <w:szCs w:val="20"/>
+        </w:rPr>
+        <w:t xml:space="preserve">Despacho Concurrente Asíncrono:</w:t>
+      </w:r>
+    </w:p>
+    <w:p>
+      <w:pPr>
+        <w:numPr>
+          <w:ilvl w:val="0"/>
+          <w:numId w:val="1"/>
+        </w:numPr>
+        <w:ind w:left="360" w:hanging="260"/>
+        <w:spacing w:before="0" w:after="60" w:line="276" w:lineRule="auto"/>
+      </w:pPr>
+      <w:r>
+        <w:rPr>
+          <w:color w:val="17261F"/>
+          <w:sz w:val="20"/>
+          <w:szCs w:val="20"/>
+        </w:rPr>
+        <w:t xml:space="preserve">Bucle principal refactorizado con </w:t>
+      </w:r>
+      <w:r>
+        <w:rPr>
+          <w:rFonts w:ascii="JetBrains Mono" w:hAnsi="JetBrains Mono" w:eastAsia="JetBrains Mono" w:cs="JetBrains Mono"/>
+          <w:color w:val="0A5A3C"/>
+          <w:sz w:val="18"/>
+          <w:szCs w:val="18"/>
+        </w:rPr>
+        <w:t xml:space="preserve">tokio::spawn</w:t>
+      </w:r>
+      <w:r>
+        <w:rPr>
+          <w:color w:val="17261F"/>
+          <w:sz w:val="20"/>
+          <w:szCs w:val="20"/>
+        </w:rPr>
+        <w:t xml:space="preserve"> y </w:t>
+      </w:r>
+      <w:r>
+        <w:rPr>
+          <w:rFonts w:ascii="JetBrains Mono" w:hAnsi="JetBrains Mono" w:eastAsia="JetBrains Mono" w:cs="JetBrains Mono"/>
+          <w:color w:val="0A5A3C"/>
+          <w:sz w:val="18"/>
+          <w:szCs w:val="18"/>
+        </w:rPr>
+        <w:t xml:space="preserve">futures_util::future::join_all</w:t>
+      </w:r>
+      <w:r>
+        <w:rPr>
+          <w:color w:val="17261F"/>
+          <w:sz w:val="20"/>
+          <w:szCs w:val="20"/>
+        </w:rPr>
+        <w:t xml:space="preserve"> para paralelizar el ciclo de inferencia física y despacho MQTT de todos los cultivos virtuales sin contención.</w:t>
+      </w:r>
+    </w:p>
+    <w:p>
+      <w:pPr>
+        <w:spacing w:before="40" w:after="0" w:line="240" w:lineRule="auto"/>
+        <w:rPr>
+          <w:sz w:val="8"/>
+        </w:rPr>
+      </w:pPr>
+    </w:p>
+    <w:p>
+      <w:pPr>
+        <w:pStyle w:val="Heading2"/>
+      </w:pPr>
+      <w:bookmarkStart w:id="128" w:name="sec_128"/>
+      <w:r>
+        <w:rPr>
+          <w:b/>
+          <w:bCs/>
+          <w:color w:val="067A52"/>
+          <w:sz w:val="25"/>
+          <w:szCs w:val="25"/>
+        </w:rPr>
+        <w:t xml:space="preserve">6.4 Servidor de Borde y Frontend Reactivo (</w:t>
+      </w:r>
+      <w:r>
+        <w:rPr>
+          <w:rFonts w:ascii="JetBrains Mono" w:hAnsi="JetBrains Mono" w:eastAsia="JetBrains Mono" w:cs="JetBrains Mono"/>
+          <w:b/>
+          <w:bCs/>
+          <w:color w:val="0A5A3C"/>
+          <w:sz w:val="23"/>
+          <w:szCs w:val="23"/>
+        </w:rPr>
+        <w:t xml:space="preserve">SmartPot-Web-Solid</w:t>
+      </w:r>
+      <w:r>
+        <w:rPr>
+          <w:b/>
+          <w:bCs/>
+          <w:color w:val="067A52"/>
+          <w:sz w:val="25"/>
+          <w:szCs w:val="25"/>
+        </w:rPr>
+        <w:t xml:space="preserve">)</w:t>
+      </w:r>
+      <w:bookmarkEnd w:id="128"/>
+    </w:p>
+    <w:p>
+      <w:pPr>
+        <w:numPr>
+          <w:ilvl w:val="0"/>
+          <w:numId w:val="2"/>
+        </w:numPr>
+        <w:ind w:left="360" w:hanging="260"/>
+        <w:spacing w:before="0" w:after="60" w:line="276" w:lineRule="auto"/>
+      </w:pPr>
+      <w:r>
+        <w:rPr>
+          <w:b/>
+          <w:bCs/>
+          <w:color w:val="17261F"/>
+          <w:sz w:val="20"/>
+          <w:szCs w:val="20"/>
+        </w:rPr>
+        <w:t xml:space="preserve">Pre-compresión Estática Gzip (Nivel 9):</w:t>
+      </w:r>
+    </w:p>
+    <w:p>
+      <w:pPr>
+        <w:numPr>
+          <w:ilvl w:val="0"/>
+          <w:numId w:val="1"/>
+        </w:numPr>
+        <w:ind w:left="360" w:hanging="260"/>
+        <w:spacing w:before="0" w:after="60" w:line="276" w:lineRule="auto"/>
+      </w:pPr>
+      <w:r>
+        <w:rPr>
+          <w:color w:val="17261F"/>
+          <w:sz w:val="20"/>
+          <w:szCs w:val="20"/>
+        </w:rPr>
+        <w:t xml:space="preserve">Script automatizado </w:t>
+      </w:r>
+      <w:r>
+        <w:rPr>
+          <w:rFonts w:ascii="JetBrains Mono" w:hAnsi="JetBrains Mono" w:eastAsia="JetBrains Mono" w:cs="JetBrains Mono"/>
+          <w:color w:val="0A5A3C"/>
+          <w:sz w:val="18"/>
+          <w:szCs w:val="18"/>
+        </w:rPr>
+        <w:t xml:space="preserve">scripts/compress-assets.mjs</w:t>
+      </w:r>
+      <w:r>
+        <w:rPr>
+          <w:color w:val="17261F"/>
+          <w:sz w:val="20"/>
+          <w:szCs w:val="20"/>
+        </w:rPr>
+        <w:t xml:space="preserve"> que genera activos pre-comprimidos </w:t>
+      </w:r>
+      <w:r>
+        <w:rPr>
+          <w:rFonts w:ascii="JetBrains Mono" w:hAnsi="JetBrains Mono" w:eastAsia="JetBrains Mono" w:cs="JetBrains Mono"/>
+          <w:color w:val="0A5A3C"/>
+          <w:sz w:val="18"/>
+          <w:szCs w:val="18"/>
+        </w:rPr>
+        <w:t xml:space="preserve">.gz</w:t>
+      </w:r>
+      <w:r>
+        <w:rPr>
+          <w:color w:val="17261F"/>
+          <w:sz w:val="20"/>
+          <w:szCs w:val="20"/>
+        </w:rPr>
+        <w:t xml:space="preserve"> para todos los archivos JS, CSS, SVG y HTML en tiempo de compilación.</w:t>
+      </w:r>
+    </w:p>
+    <w:p>
+      <w:pPr>
+        <w:numPr>
+          <w:ilvl w:val="0"/>
+          <w:numId w:val="2"/>
+        </w:numPr>
+        <w:ind w:left="360" w:hanging="260"/>
+        <w:spacing w:before="0" w:after="60" w:line="276" w:lineRule="auto"/>
+      </w:pPr>
+      <w:r>
+        <w:rPr>
+          <w:b/>
+          <w:bCs/>
+          <w:color w:val="17261F"/>
+          <w:sz w:val="20"/>
+          <w:szCs w:val="20"/>
+        </w:rPr>
+        <w:t xml:space="preserve">Afinación de Transporte Nginx:</w:t>
+      </w:r>
+    </w:p>
+    <w:p>
+      <w:pPr>
+        <w:numPr>
+          <w:ilvl w:val="0"/>
+          <w:numId w:val="1"/>
+        </w:numPr>
+        <w:ind w:left="360" w:hanging="260"/>
+        <w:spacing w:before="0" w:after="60" w:line="276" w:lineRule="auto"/>
+      </w:pPr>
+      <w:r>
+        <w:rPr>
+          <w:color w:val="17261F"/>
+          <w:sz w:val="20"/>
+          <w:szCs w:val="20"/>
+        </w:rPr>
+        <w:t xml:space="preserve">Directivas </w:t>
+      </w:r>
+      <w:r>
+        <w:rPr>
+          <w:rFonts w:ascii="JetBrains Mono" w:hAnsi="JetBrains Mono" w:eastAsia="JetBrains Mono" w:cs="JetBrains Mono"/>
+          <w:color w:val="0A5A3C"/>
+          <w:sz w:val="18"/>
+          <w:szCs w:val="18"/>
+        </w:rPr>
+        <w:t xml:space="preserve">gzip_static on;</w:t>
+      </w:r>
+      <w:r>
+        <w:rPr>
+          <w:color w:val="17261F"/>
+          <w:sz w:val="20"/>
+          <w:szCs w:val="20"/>
+        </w:rPr>
+        <w:t xml:space="preserve">, </w:t>
+      </w:r>
+      <w:r>
+        <w:rPr>
+          <w:rFonts w:ascii="JetBrains Mono" w:hAnsi="JetBrains Mono" w:eastAsia="JetBrains Mono" w:cs="JetBrains Mono"/>
+          <w:color w:val="0A5A3C"/>
+          <w:sz w:val="18"/>
+          <w:szCs w:val="18"/>
+        </w:rPr>
+        <w:t xml:space="preserve">sendfile on;</w:t>
+      </w:r>
+      <w:r>
+        <w:rPr>
+          <w:color w:val="17261F"/>
+          <w:sz w:val="20"/>
+          <w:szCs w:val="20"/>
+        </w:rPr>
+        <w:t xml:space="preserve">, </w:t>
+      </w:r>
+      <w:r>
+        <w:rPr>
+          <w:rFonts w:ascii="JetBrains Mono" w:hAnsi="JetBrains Mono" w:eastAsia="JetBrains Mono" w:cs="JetBrains Mono"/>
+          <w:color w:val="0A5A3C"/>
+          <w:sz w:val="18"/>
+          <w:szCs w:val="18"/>
+        </w:rPr>
+        <w:t xml:space="preserve">tcp_nopush on;</w:t>
+      </w:r>
+      <w:r>
+        <w:rPr>
+          <w:color w:val="17261F"/>
+          <w:sz w:val="20"/>
+          <w:szCs w:val="20"/>
+        </w:rPr>
+        <w:t xml:space="preserve">, </w:t>
+      </w:r>
+      <w:r>
+        <w:rPr>
+          <w:rFonts w:ascii="JetBrains Mono" w:hAnsi="JetBrains Mono" w:eastAsia="JetBrains Mono" w:cs="JetBrains Mono"/>
+          <w:color w:val="0A5A3C"/>
+          <w:sz w:val="18"/>
+          <w:szCs w:val="18"/>
+        </w:rPr>
+        <w:t xml:space="preserve">tcp_nodelay on;</w:t>
+      </w:r>
+      <w:r>
+        <w:rPr>
+          <w:color w:val="17261F"/>
+          <w:sz w:val="20"/>
+          <w:szCs w:val="20"/>
+        </w:rPr>
+        <w:t xml:space="preserve"> y </w:t>
+      </w:r>
+      <w:r>
+        <w:rPr>
+          <w:rFonts w:ascii="JetBrains Mono" w:hAnsi="JetBrains Mono" w:eastAsia="JetBrains Mono" w:cs="JetBrains Mono"/>
+          <w:color w:val="0A5A3C"/>
+          <w:sz w:val="18"/>
+          <w:szCs w:val="18"/>
+        </w:rPr>
+        <w:t xml:space="preserve">keepalive_timeout 65;</w:t>
+      </w:r>
+      <w:r>
+        <w:rPr>
+          <w:color w:val="17261F"/>
+          <w:sz w:val="20"/>
+          <w:szCs w:val="20"/>
+        </w:rPr>
+        <w:t xml:space="preserve"> en </w:t>
+      </w:r>
+      <w:r>
+        <w:rPr>
+          <w:rFonts w:ascii="JetBrains Mono" w:hAnsi="JetBrains Mono" w:eastAsia="JetBrains Mono" w:cs="JetBrains Mono"/>
+          <w:color w:val="0A5A3C"/>
+          <w:sz w:val="18"/>
+          <w:szCs w:val="18"/>
+        </w:rPr>
+        <w:t xml:space="preserve">nginx/default.conf.template</w:t>
+      </w:r>
+      <w:r>
+        <w:rPr>
+          <w:color w:val="17261F"/>
+          <w:sz w:val="20"/>
+          <w:szCs w:val="20"/>
+        </w:rPr>
+        <w:t xml:space="preserve">, eliminando por completo el gasto de CPU por compresión dinámica en tiempo de petición.</w:t>
+      </w:r>
+    </w:p>
+    <w:p>
+      <w:pPr>
+        <w:numPr>
+          <w:ilvl w:val="0"/>
+          <w:numId w:val="2"/>
+        </w:numPr>
+        <w:ind w:left="360" w:hanging="260"/>
+        <w:spacing w:before="0" w:after="60" w:line="276" w:lineRule="auto"/>
+      </w:pPr>
+      <w:r>
+        <w:rPr>
+          <w:b/>
+          <w:bCs/>
+          <w:color w:val="17261F"/>
+          <w:sz w:val="20"/>
+          <w:szCs w:val="20"/>
+        </w:rPr>
+        <w:t xml:space="preserve">Optimización de Bundles en Vite:</w:t>
+      </w:r>
+    </w:p>
+    <w:p>
+      <w:pPr>
+        <w:numPr>
+          <w:ilvl w:val="0"/>
+          <w:numId w:val="1"/>
+        </w:numPr>
+        <w:ind w:left="360" w:hanging="260"/>
+        <w:spacing w:before="0" w:after="60" w:line="276" w:lineRule="auto"/>
+      </w:pPr>
+      <w:r>
+        <w:rPr>
+          <w:color w:val="17261F"/>
+          <w:sz w:val="20"/>
+          <w:szCs w:val="20"/>
+        </w:rPr>
+        <w:t xml:space="preserve">Separación de chunks modulares (</w:t>
+      </w:r>
+      <w:r>
+        <w:rPr>
+          <w:rFonts w:ascii="JetBrains Mono" w:hAnsi="JetBrains Mono" w:eastAsia="JetBrains Mono" w:cs="JetBrains Mono"/>
+          <w:color w:val="0A5A3C"/>
+          <w:sz w:val="18"/>
+          <w:szCs w:val="18"/>
+        </w:rPr>
+        <w:t xml:space="preserve">solid-core</w:t>
+      </w:r>
+      <w:r>
+        <w:rPr>
+          <w:color w:val="17261F"/>
+          <w:sz w:val="20"/>
+          <w:szCs w:val="20"/>
+        </w:rPr>
+        <w:t xml:space="preserve">, </w:t>
+      </w:r>
+      <w:r>
+        <w:rPr>
+          <w:rFonts w:ascii="JetBrains Mono" w:hAnsi="JetBrains Mono" w:eastAsia="JetBrains Mono" w:cs="JetBrains Mono"/>
+          <w:color w:val="0A5A3C"/>
+          <w:sz w:val="18"/>
+          <w:szCs w:val="18"/>
+        </w:rPr>
+        <w:t xml:space="preserve">lucide-icons</w:t>
+      </w:r>
+      <w:r>
+        <w:rPr>
+          <w:color w:val="17261F"/>
+          <w:sz w:val="20"/>
+          <w:szCs w:val="20"/>
+        </w:rPr>
+        <w:t xml:space="preserve">, </w:t>
+      </w:r>
+      <w:r>
+        <w:rPr>
+          <w:rFonts w:ascii="JetBrains Mono" w:hAnsi="JetBrains Mono" w:eastAsia="JetBrains Mono" w:cs="JetBrains Mono"/>
+          <w:color w:val="0A5A3C"/>
+          <w:sz w:val="18"/>
+          <w:szCs w:val="18"/>
+        </w:rPr>
+        <w:t xml:space="preserve">fonts</w:t>
+      </w:r>
+      <w:r>
+        <w:rPr>
+          <w:color w:val="17261F"/>
+          <w:sz w:val="20"/>
+          <w:szCs w:val="20"/>
+        </w:rPr>
+        <w:t xml:space="preserve">) y minificación nativa de alto rendimiento (</w:t>
+      </w:r>
+      <w:r>
+        <w:rPr>
+          <w:rFonts w:ascii="JetBrains Mono" w:hAnsi="JetBrains Mono" w:eastAsia="JetBrains Mono" w:cs="JetBrains Mono"/>
+          <w:color w:val="0A5A3C"/>
+          <w:sz w:val="18"/>
+          <w:szCs w:val="18"/>
+        </w:rPr>
+        <w:t xml:space="preserve">minify: true</w:t>
+      </w:r>
+      <w:r>
+        <w:rPr>
+          <w:color w:val="17261F"/>
+          <w:sz w:val="20"/>
+          <w:szCs w:val="20"/>
+        </w:rPr>
+        <w:t xml:space="preserve">).</w:t>
+      </w:r>
+    </w:p>
+    <w:p>
+      <w:pPr>
+        <w:spacing w:before="40" w:after="0" w:line="240" w:lineRule="auto"/>
+        <w:rPr>
+          <w:sz w:val="8"/>
+        </w:rPr>
+      </w:pPr>
+    </w:p>
+    <w:p>
+      <w:pPr>
+        <w:pStyle w:val="Heading2"/>
+      </w:pPr>
+      <w:bookmarkStart w:id="129" w:name="sec_129"/>
+      <w:r>
+        <w:rPr>
+          <w:b/>
+          <w:bCs/>
+          <w:color w:val="067A52"/>
+          <w:sz w:val="25"/>
+          <w:szCs w:val="25"/>
+        </w:rPr>
+        <w:t xml:space="preserve">6.5 Blindaje y Cuotas de Recursos en Docker (</w:t>
+      </w:r>
+      <w:r>
+        <w:rPr>
+          <w:rFonts w:ascii="JetBrains Mono" w:hAnsi="JetBrains Mono" w:eastAsia="JetBrains Mono" w:cs="JetBrains Mono"/>
+          <w:b/>
+          <w:bCs/>
+          <w:color w:val="0A5A3C"/>
+          <w:sz w:val="23"/>
+          <w:szCs w:val="23"/>
+        </w:rPr>
+        <w:t xml:space="preserve">demo-beta/compose.yaml</w:t>
+      </w:r>
+      <w:r>
+        <w:rPr>
+          <w:b/>
+          <w:bCs/>
+          <w:color w:val="067A52"/>
+          <w:sz w:val="25"/>
+          <w:szCs w:val="25"/>
+        </w:rPr>
+        <w:t xml:space="preserve">)</w:t>
+      </w:r>
+      <w:bookmarkEnd w:id="129"/>
+    </w:p>
+    <w:p>
+      <w:pPr>
+        <w:spacing w:before="0" w:after="140" w:line="288" w:lineRule="auto"/>
+      </w:pPr>
+      <w:r>
+        <w:rPr>
+          <w:color w:val="17261F"/>
+          <w:sz w:val="20"/>
+          <w:szCs w:val="20"/>
+        </w:rPr>
+        <w:t xml:space="preserve">Se aplicaron cuotas estrictas de recursos en los 8 microservicios para evitar ataques de denegación de servicio (</w:t>
+      </w:r>
+      <w:r>
+        <w:rPr>
+          <w:i/>
+          <w:iCs/>
+          <w:color w:val="17261F"/>
+          <w:sz w:val="20"/>
+          <w:szCs w:val="20"/>
+        </w:rPr>
+        <w:t xml:space="preserve">DoS</w:t>
+      </w:r>
+      <w:r>
+        <w:rPr>
+          <w:color w:val="17261F"/>
+          <w:sz w:val="20"/>
+          <w:szCs w:val="20"/>
+        </w:rPr>
+        <w:t xml:space="preserve">) y fugas de memoria:</w:t>
+      </w:r>
     </w:p>
     <w:p>
       <w:pPr>
@@ -7832,9 +9891,1690 @@
         <w:tblLook w:val="04A0" w:firstRow="1" w:firstColumn="1" w:noVBand="1"/>
       </w:tblPr>
       <w:tblGrid>
-        <w:gridCol w:w="2341"/>
-        <w:gridCol w:w="3346"/>
-        <w:gridCol w:w="2695"/>
+        <w:gridCol w:w="2076"/>
+        <w:gridCol w:w="960"/>
+        <w:gridCol w:w="1560"/>
+        <w:gridCol w:w="1680"/>
+        <w:gridCol w:w="3084"/>
+      </w:tblGrid>
+      <w:tr>
+        <w:trPr>
+          <w:cantSplit/>
+          <w:tblHeader/>
+        </w:trPr>
+        <w:tc>
+          <w:tcPr>
+            <w:tcW w:w="2076" w:type="dxa"/>
+            <w:shd w:val="clear" w:color="auto" w:fill="0B3D2B"/>
+            <w:tcMar>
+              <w:top w:w="70" w:type="dxa"/>
+              <w:left w:w="110" w:type="dxa"/>
+              <w:bottom w:w="70" w:type="dxa"/>
+              <w:right w:w="110" w:type="dxa"/>
+            </w:tcMar>
+            <w:vAlign w:val="center"/>
+          </w:tcPr>
+          <w:p>
+            <w:pPr>
+              <w:spacing w:before="0" w:after="0" w:line="252" w:lineRule="auto"/>
+            </w:pPr>
+            <w:r>
+              <w:rPr>
+                <w:b/>
+                <w:bCs/>
+                <w:color w:val="FFFFFF"/>
+                <w:spacing w:val="10"/>
+                <w:sz w:val="16"/>
+                <w:szCs w:val="16"/>
+              </w:rPr>
+              <w:t xml:space="preserve">CONTENEDOR</w:t>
+            </w:r>
+          </w:p>
+        </w:tc>
+        <w:tc>
+          <w:tcPr>
+            <w:tcW w:w="960" w:type="dxa"/>
+            <w:shd w:val="clear" w:color="auto" w:fill="0B3D2B"/>
+            <w:tcMar>
+              <w:top w:w="70" w:type="dxa"/>
+              <w:left w:w="110" w:type="dxa"/>
+              <w:bottom w:w="70" w:type="dxa"/>
+              <w:right w:w="110" w:type="dxa"/>
+            </w:tcMar>
+            <w:vAlign w:val="center"/>
+          </w:tcPr>
+          <w:p>
+            <w:pPr>
+              <w:spacing w:before="0" w:after="0" w:line="252" w:lineRule="auto"/>
+            </w:pPr>
+            <w:r>
+              <w:rPr>
+                <w:b/>
+                <w:bCs/>
+                <w:color w:val="FFFFFF"/>
+                <w:spacing w:val="10"/>
+                <w:sz w:val="16"/>
+                <w:szCs w:val="16"/>
+              </w:rPr>
+              <w:t xml:space="preserve">LÍMITE CPU (CPUS)</w:t>
+            </w:r>
+          </w:p>
+        </w:tc>
+        <w:tc>
+          <w:tcPr>
+            <w:tcW w:w="1560" w:type="dxa"/>
+            <w:shd w:val="clear" w:color="auto" w:fill="0B3D2B"/>
+            <w:tcMar>
+              <w:top w:w="70" w:type="dxa"/>
+              <w:left w:w="110" w:type="dxa"/>
+              <w:bottom w:w="70" w:type="dxa"/>
+              <w:right w:w="110" w:type="dxa"/>
+            </w:tcMar>
+            <w:vAlign w:val="center"/>
+          </w:tcPr>
+          <w:p>
+            <w:pPr>
+              <w:spacing w:before="0" w:after="0" w:line="252" w:lineRule="auto"/>
+            </w:pPr>
+            <w:r>
+              <w:rPr>
+                <w:b/>
+                <w:bCs/>
+                <w:color w:val="FFFFFF"/>
+                <w:spacing w:val="10"/>
+                <w:sz w:val="16"/>
+                <w:szCs w:val="16"/>
+              </w:rPr>
+              <w:t xml:space="preserve">LÍMITE RAM (MEM_LIMIT)</w:t>
+            </w:r>
+          </w:p>
+        </w:tc>
+        <w:tc>
+          <w:tcPr>
+            <w:tcW w:w="1680" w:type="dxa"/>
+            <w:shd w:val="clear" w:color="auto" w:fill="0B3D2B"/>
+            <w:tcMar>
+              <w:top w:w="70" w:type="dxa"/>
+              <w:left w:w="110" w:type="dxa"/>
+              <w:bottom w:w="70" w:type="dxa"/>
+              <w:right w:w="110" w:type="dxa"/>
+            </w:tcMar>
+            <w:vAlign w:val="center"/>
+          </w:tcPr>
+          <w:p>
+            <w:pPr>
+              <w:spacing w:before="0" w:after="0" w:line="252" w:lineRule="auto"/>
+            </w:pPr>
+            <w:r>
+              <w:rPr>
+                <w:b/>
+                <w:bCs/>
+                <w:color w:val="FFFFFF"/>
+                <w:spacing w:val="10"/>
+                <w:sz w:val="16"/>
+                <w:szCs w:val="16"/>
+              </w:rPr>
+              <w:t xml:space="preserve">LÍMITE PROCESOS (PIDS_LIMIT)</w:t>
+            </w:r>
+          </w:p>
+        </w:tc>
+        <w:tc>
+          <w:tcPr>
+            <w:tcW w:w="3084" w:type="dxa"/>
+            <w:shd w:val="clear" w:color="auto" w:fill="0B3D2B"/>
+            <w:tcMar>
+              <w:top w:w="70" w:type="dxa"/>
+              <w:left w:w="110" w:type="dxa"/>
+              <w:bottom w:w="70" w:type="dxa"/>
+              <w:right w:w="110" w:type="dxa"/>
+            </w:tcMar>
+            <w:vAlign w:val="center"/>
+          </w:tcPr>
+          <w:p>
+            <w:pPr>
+              <w:spacing w:before="0" w:after="0" w:line="252" w:lineRule="auto"/>
+            </w:pPr>
+            <w:r>
+              <w:rPr>
+                <w:b/>
+                <w:bCs/>
+                <w:color w:val="FFFFFF"/>
+                <w:spacing w:val="10"/>
+                <w:sz w:val="16"/>
+                <w:szCs w:val="16"/>
+              </w:rPr>
+              <w:t xml:space="preserve">PERFIL DE SEGURIDAD</w:t>
+            </w:r>
+          </w:p>
+        </w:tc>
+      </w:tr>
+      <w:tr>
+        <w:trPr>
+          <w:cantSplit/>
+        </w:trPr>
+        <w:tc>
+          <w:tcPr>
+            <w:tcW w:w="2076" w:type="dxa"/>
+            <w:shd w:val="clear" w:color="auto" w:fill="FFFFFF"/>
+            <w:tcMar>
+              <w:top w:w="70" w:type="dxa"/>
+              <w:left w:w="110" w:type="dxa"/>
+              <w:bottom w:w="70" w:type="dxa"/>
+              <w:right w:w="110" w:type="dxa"/>
+            </w:tcMar>
+            <w:vAlign w:val="center"/>
+          </w:tcPr>
+          <w:p>
+            <w:pPr>
+              <w:spacing w:before="0" w:after="0" w:line="252" w:lineRule="auto"/>
+            </w:pPr>
+            <w:r>
+              <w:rPr>
+                <w:rFonts w:ascii="JetBrains Mono" w:hAnsi="JetBrains Mono" w:eastAsia="JetBrains Mono" w:cs="JetBrains Mono"/>
+                <w:b/>
+                <w:bCs/>
+                <w:color w:val="0A5A3C"/>
+                <w:sz w:val="15"/>
+                <w:szCs w:val="15"/>
+              </w:rPr>
+              <w:t xml:space="preserve">db-smartpot</w:t>
+            </w:r>
+          </w:p>
+        </w:tc>
+        <w:tc>
+          <w:tcPr>
+            <w:tcW w:w="960" w:type="dxa"/>
+            <w:shd w:val="clear" w:color="auto" w:fill="FFFFFF"/>
+            <w:tcMar>
+              <w:top w:w="70" w:type="dxa"/>
+              <w:left w:w="110" w:type="dxa"/>
+              <w:bottom w:w="70" w:type="dxa"/>
+              <w:right w:w="110" w:type="dxa"/>
+            </w:tcMar>
+            <w:vAlign w:val="center"/>
+          </w:tcPr>
+          <w:p>
+            <w:pPr>
+              <w:spacing w:before="0" w:after="0" w:line="252" w:lineRule="auto"/>
+            </w:pPr>
+            <w:r>
+              <w:rPr>
+                <w:color w:val="17261F"/>
+                <w:sz w:val="17"/>
+                <w:szCs w:val="17"/>
+              </w:rPr>
+              <w:t xml:space="preserve">2.0</w:t>
+            </w:r>
+          </w:p>
+        </w:tc>
+        <w:tc>
+          <w:tcPr>
+            <w:tcW w:w="1560" w:type="dxa"/>
+            <w:shd w:val="clear" w:color="auto" w:fill="FFFFFF"/>
+            <w:tcMar>
+              <w:top w:w="70" w:type="dxa"/>
+              <w:left w:w="110" w:type="dxa"/>
+              <w:bottom w:w="70" w:type="dxa"/>
+              <w:right w:w="110" w:type="dxa"/>
+            </w:tcMar>
+            <w:vAlign w:val="center"/>
+          </w:tcPr>
+          <w:p>
+            <w:pPr>
+              <w:spacing w:before="0" w:after="0" w:line="252" w:lineRule="auto"/>
+            </w:pPr>
+            <w:r>
+              <w:rPr>
+                <w:color w:val="17261F"/>
+                <w:sz w:val="17"/>
+                <w:szCs w:val="17"/>
+              </w:rPr>
+              <w:t xml:space="preserve">1024 MB</w:t>
+            </w:r>
+          </w:p>
+        </w:tc>
+        <w:tc>
+          <w:tcPr>
+            <w:tcW w:w="1680" w:type="dxa"/>
+            <w:shd w:val="clear" w:color="auto" w:fill="FFFFFF"/>
+            <w:tcMar>
+              <w:top w:w="70" w:type="dxa"/>
+              <w:left w:w="110" w:type="dxa"/>
+              <w:bottom w:w="70" w:type="dxa"/>
+              <w:right w:w="110" w:type="dxa"/>
+            </w:tcMar>
+            <w:vAlign w:val="center"/>
+          </w:tcPr>
+          <w:p>
+            <w:pPr>
+              <w:spacing w:before="0" w:after="0" w:line="252" w:lineRule="auto"/>
+            </w:pPr>
+            <w:r>
+              <w:rPr>
+                <w:color w:val="17261F"/>
+                <w:sz w:val="17"/>
+                <w:szCs w:val="17"/>
+              </w:rPr>
+              <w:t xml:space="preserve">256</w:t>
+            </w:r>
+          </w:p>
+        </w:tc>
+        <w:tc>
+          <w:tcPr>
+            <w:tcW w:w="3084" w:type="dxa"/>
+            <w:shd w:val="clear" w:color="auto" w:fill="FFFFFF"/>
+            <w:tcMar>
+              <w:top w:w="70" w:type="dxa"/>
+              <w:left w:w="110" w:type="dxa"/>
+              <w:bottom w:w="70" w:type="dxa"/>
+              <w:right w:w="110" w:type="dxa"/>
+            </w:tcMar>
+            <w:vAlign w:val="center"/>
+          </w:tcPr>
+          <w:p>
+            <w:pPr>
+              <w:spacing w:before="0" w:after="0" w:line="252" w:lineRule="auto"/>
+            </w:pPr>
+            <w:r>
+              <w:rPr>
+                <w:rFonts w:ascii="JetBrains Mono" w:hAnsi="JetBrains Mono" w:eastAsia="JetBrains Mono" w:cs="JetBrains Mono"/>
+                <w:color w:val="0A5A3C"/>
+                <w:sz w:val="15"/>
+                <w:szCs w:val="15"/>
+              </w:rPr>
+              <w:t xml:space="preserve">no-new-privileges</w:t>
+            </w:r>
+            <w:r>
+              <w:rPr>
+                <w:color w:val="17261F"/>
+                <w:sz w:val="17"/>
+                <w:szCs w:val="17"/>
+              </w:rPr>
+              <w:t xml:space="preserve">, </w:t>
+            </w:r>
+            <w:r>
+              <w:rPr>
+                <w:rFonts w:ascii="JetBrains Mono" w:hAnsi="JetBrains Mono" w:eastAsia="JetBrains Mono" w:cs="JetBrains Mono"/>
+                <w:color w:val="0A5A3C"/>
+                <w:sz w:val="15"/>
+                <w:szCs w:val="15"/>
+              </w:rPr>
+              <w:t xml:space="preserve">read_only</w:t>
+            </w:r>
+            <w:r>
+              <w:rPr>
+                <w:color w:val="17261F"/>
+                <w:sz w:val="17"/>
+                <w:szCs w:val="17"/>
+              </w:rPr>
+              <w:t xml:space="preserve">, caps restringidos</w:t>
+            </w:r>
+          </w:p>
+        </w:tc>
+      </w:tr>
+      <w:tr>
+        <w:trPr>
+          <w:cantSplit/>
+        </w:trPr>
+        <w:tc>
+          <w:tcPr>
+            <w:tcW w:w="2076" w:type="dxa"/>
+            <w:shd w:val="clear" w:color="auto" w:fill="F2F7F4"/>
+            <w:tcMar>
+              <w:top w:w="70" w:type="dxa"/>
+              <w:left w:w="110" w:type="dxa"/>
+              <w:bottom w:w="70" w:type="dxa"/>
+              <w:right w:w="110" w:type="dxa"/>
+            </w:tcMar>
+            <w:vAlign w:val="center"/>
+          </w:tcPr>
+          <w:p>
+            <w:pPr>
+              <w:spacing w:before="0" w:after="0" w:line="252" w:lineRule="auto"/>
+            </w:pPr>
+            <w:r>
+              <w:rPr>
+                <w:rFonts w:ascii="JetBrains Mono" w:hAnsi="JetBrains Mono" w:eastAsia="JetBrains Mono" w:cs="JetBrains Mono"/>
+                <w:b/>
+                <w:bCs/>
+                <w:color w:val="0A5A3C"/>
+                <w:sz w:val="15"/>
+                <w:szCs w:val="15"/>
+              </w:rPr>
+              <w:t xml:space="preserve">cache-smartpot</w:t>
+            </w:r>
+          </w:p>
+        </w:tc>
+        <w:tc>
+          <w:tcPr>
+            <w:tcW w:w="960" w:type="dxa"/>
+            <w:shd w:val="clear" w:color="auto" w:fill="F2F7F4"/>
+            <w:tcMar>
+              <w:top w:w="70" w:type="dxa"/>
+              <w:left w:w="110" w:type="dxa"/>
+              <w:bottom w:w="70" w:type="dxa"/>
+              <w:right w:w="110" w:type="dxa"/>
+            </w:tcMar>
+            <w:vAlign w:val="center"/>
+          </w:tcPr>
+          <w:p>
+            <w:pPr>
+              <w:spacing w:before="0" w:after="0" w:line="252" w:lineRule="auto"/>
+            </w:pPr>
+            <w:r>
+              <w:rPr>
+                <w:color w:val="17261F"/>
+                <w:sz w:val="17"/>
+                <w:szCs w:val="17"/>
+              </w:rPr>
+              <w:t xml:space="preserve">1.0</w:t>
+            </w:r>
+          </w:p>
+        </w:tc>
+        <w:tc>
+          <w:tcPr>
+            <w:tcW w:w="1560" w:type="dxa"/>
+            <w:shd w:val="clear" w:color="auto" w:fill="F2F7F4"/>
+            <w:tcMar>
+              <w:top w:w="70" w:type="dxa"/>
+              <w:left w:w="110" w:type="dxa"/>
+              <w:bottom w:w="70" w:type="dxa"/>
+              <w:right w:w="110" w:type="dxa"/>
+            </w:tcMar>
+            <w:vAlign w:val="center"/>
+          </w:tcPr>
+          <w:p>
+            <w:pPr>
+              <w:spacing w:before="0" w:after="0" w:line="252" w:lineRule="auto"/>
+            </w:pPr>
+            <w:r>
+              <w:rPr>
+                <w:color w:val="17261F"/>
+                <w:sz w:val="17"/>
+                <w:szCs w:val="17"/>
+              </w:rPr>
+              <w:t xml:space="preserve">256 MB</w:t>
+            </w:r>
+          </w:p>
+        </w:tc>
+        <w:tc>
+          <w:tcPr>
+            <w:tcW w:w="1680" w:type="dxa"/>
+            <w:shd w:val="clear" w:color="auto" w:fill="F2F7F4"/>
+            <w:tcMar>
+              <w:top w:w="70" w:type="dxa"/>
+              <w:left w:w="110" w:type="dxa"/>
+              <w:bottom w:w="70" w:type="dxa"/>
+              <w:right w:w="110" w:type="dxa"/>
+            </w:tcMar>
+            <w:vAlign w:val="center"/>
+          </w:tcPr>
+          <w:p>
+            <w:pPr>
+              <w:spacing w:before="0" w:after="0" w:line="252" w:lineRule="auto"/>
+            </w:pPr>
+            <w:r>
+              <w:rPr>
+                <w:color w:val="17261F"/>
+                <w:sz w:val="17"/>
+                <w:szCs w:val="17"/>
+              </w:rPr>
+              <w:t xml:space="preserve">128</w:t>
+            </w:r>
+          </w:p>
+        </w:tc>
+        <w:tc>
+          <w:tcPr>
+            <w:tcW w:w="3084" w:type="dxa"/>
+            <w:shd w:val="clear" w:color="auto" w:fill="F2F7F4"/>
+            <w:tcMar>
+              <w:top w:w="70" w:type="dxa"/>
+              <w:left w:w="110" w:type="dxa"/>
+              <w:bottom w:w="70" w:type="dxa"/>
+              <w:right w:w="110" w:type="dxa"/>
+            </w:tcMar>
+            <w:vAlign w:val="center"/>
+          </w:tcPr>
+          <w:p>
+            <w:pPr>
+              <w:spacing w:before="0" w:after="0" w:line="252" w:lineRule="auto"/>
+            </w:pPr>
+            <w:r>
+              <w:rPr>
+                <w:rFonts w:ascii="JetBrains Mono" w:hAnsi="JetBrains Mono" w:eastAsia="JetBrains Mono" w:cs="JetBrains Mono"/>
+                <w:color w:val="0A5A3C"/>
+                <w:sz w:val="15"/>
+                <w:szCs w:val="15"/>
+              </w:rPr>
+              <w:t xml:space="preserve">no-new-privileges</w:t>
+            </w:r>
+            <w:r>
+              <w:rPr>
+                <w:color w:val="17261F"/>
+                <w:sz w:val="17"/>
+                <w:szCs w:val="17"/>
+              </w:rPr>
+              <w:t xml:space="preserve">, </w:t>
+            </w:r>
+            <w:r>
+              <w:rPr>
+                <w:rFonts w:ascii="JetBrains Mono" w:hAnsi="JetBrains Mono" w:eastAsia="JetBrains Mono" w:cs="JetBrains Mono"/>
+                <w:color w:val="0A5A3C"/>
+                <w:sz w:val="15"/>
+                <w:szCs w:val="15"/>
+              </w:rPr>
+              <w:t xml:space="preserve">read_only</w:t>
+            </w:r>
+            <w:r>
+              <w:rPr>
+                <w:color w:val="17261F"/>
+                <w:sz w:val="17"/>
+                <w:szCs w:val="17"/>
+              </w:rPr>
+              <w:t xml:space="preserve">, </w:t>
+            </w:r>
+            <w:r>
+              <w:rPr>
+                <w:rFonts w:ascii="JetBrains Mono" w:hAnsi="JetBrains Mono" w:eastAsia="JetBrains Mono" w:cs="JetBrains Mono"/>
+                <w:color w:val="0A5A3C"/>
+                <w:sz w:val="15"/>
+                <w:szCs w:val="15"/>
+              </w:rPr>
+              <w:t xml:space="preserve">cap_drop: ALL</w:t>
+            </w:r>
+          </w:p>
+        </w:tc>
+      </w:tr>
+      <w:tr>
+        <w:trPr>
+          <w:cantSplit/>
+        </w:trPr>
+        <w:tc>
+          <w:tcPr>
+            <w:tcW w:w="2076" w:type="dxa"/>
+            <w:shd w:val="clear" w:color="auto" w:fill="FFFFFF"/>
+            <w:tcMar>
+              <w:top w:w="70" w:type="dxa"/>
+              <w:left w:w="110" w:type="dxa"/>
+              <w:bottom w:w="70" w:type="dxa"/>
+              <w:right w:w="110" w:type="dxa"/>
+            </w:tcMar>
+            <w:vAlign w:val="center"/>
+          </w:tcPr>
+          <w:p>
+            <w:pPr>
+              <w:spacing w:before="0" w:after="0" w:line="252" w:lineRule="auto"/>
+            </w:pPr>
+            <w:r>
+              <w:rPr>
+                <w:rFonts w:ascii="JetBrains Mono" w:hAnsi="JetBrains Mono" w:eastAsia="JetBrains Mono" w:cs="JetBrains Mono"/>
+                <w:b/>
+                <w:bCs/>
+                <w:color w:val="0A5A3C"/>
+                <w:sz w:val="15"/>
+                <w:szCs w:val="15"/>
+              </w:rPr>
+              <w:t xml:space="preserve">mail-smartpot</w:t>
+            </w:r>
+          </w:p>
+        </w:tc>
+        <w:tc>
+          <w:tcPr>
+            <w:tcW w:w="960" w:type="dxa"/>
+            <w:shd w:val="clear" w:color="auto" w:fill="FFFFFF"/>
+            <w:tcMar>
+              <w:top w:w="70" w:type="dxa"/>
+              <w:left w:w="110" w:type="dxa"/>
+              <w:bottom w:w="70" w:type="dxa"/>
+              <w:right w:w="110" w:type="dxa"/>
+            </w:tcMar>
+            <w:vAlign w:val="center"/>
+          </w:tcPr>
+          <w:p>
+            <w:pPr>
+              <w:spacing w:before="0" w:after="0" w:line="252" w:lineRule="auto"/>
+            </w:pPr>
+            <w:r>
+              <w:rPr>
+                <w:color w:val="17261F"/>
+                <w:sz w:val="17"/>
+                <w:szCs w:val="17"/>
+              </w:rPr>
+              <w:t xml:space="preserve">0.5</w:t>
+            </w:r>
+          </w:p>
+        </w:tc>
+        <w:tc>
+          <w:tcPr>
+            <w:tcW w:w="1560" w:type="dxa"/>
+            <w:shd w:val="clear" w:color="auto" w:fill="FFFFFF"/>
+            <w:tcMar>
+              <w:top w:w="70" w:type="dxa"/>
+              <w:left w:w="110" w:type="dxa"/>
+              <w:bottom w:w="70" w:type="dxa"/>
+              <w:right w:w="110" w:type="dxa"/>
+            </w:tcMar>
+            <w:vAlign w:val="center"/>
+          </w:tcPr>
+          <w:p>
+            <w:pPr>
+              <w:spacing w:before="0" w:after="0" w:line="252" w:lineRule="auto"/>
+            </w:pPr>
+            <w:r>
+              <w:rPr>
+                <w:color w:val="17261F"/>
+                <w:sz w:val="17"/>
+                <w:szCs w:val="17"/>
+              </w:rPr>
+              <w:t xml:space="preserve">128 MB</w:t>
+            </w:r>
+          </w:p>
+        </w:tc>
+        <w:tc>
+          <w:tcPr>
+            <w:tcW w:w="1680" w:type="dxa"/>
+            <w:shd w:val="clear" w:color="auto" w:fill="FFFFFF"/>
+            <w:tcMar>
+              <w:top w:w="70" w:type="dxa"/>
+              <w:left w:w="110" w:type="dxa"/>
+              <w:bottom w:w="70" w:type="dxa"/>
+              <w:right w:w="110" w:type="dxa"/>
+            </w:tcMar>
+            <w:vAlign w:val="center"/>
+          </w:tcPr>
+          <w:p>
+            <w:pPr>
+              <w:spacing w:before="0" w:after="0" w:line="252" w:lineRule="auto"/>
+            </w:pPr>
+            <w:r>
+              <w:rPr>
+                <w:color w:val="17261F"/>
+                <w:sz w:val="17"/>
+                <w:szCs w:val="17"/>
+              </w:rPr>
+              <w:t xml:space="preserve">64</w:t>
+            </w:r>
+          </w:p>
+        </w:tc>
+        <w:tc>
+          <w:tcPr>
+            <w:tcW w:w="3084" w:type="dxa"/>
+            <w:shd w:val="clear" w:color="auto" w:fill="FFFFFF"/>
+            <w:tcMar>
+              <w:top w:w="70" w:type="dxa"/>
+              <w:left w:w="110" w:type="dxa"/>
+              <w:bottom w:w="70" w:type="dxa"/>
+              <w:right w:w="110" w:type="dxa"/>
+            </w:tcMar>
+            <w:vAlign w:val="center"/>
+          </w:tcPr>
+          <w:p>
+            <w:pPr>
+              <w:spacing w:before="0" w:after="0" w:line="252" w:lineRule="auto"/>
+            </w:pPr>
+            <w:r>
+              <w:rPr>
+                <w:rFonts w:ascii="JetBrains Mono" w:hAnsi="JetBrains Mono" w:eastAsia="JetBrains Mono" w:cs="JetBrains Mono"/>
+                <w:color w:val="0A5A3C"/>
+                <w:sz w:val="15"/>
+                <w:szCs w:val="15"/>
+              </w:rPr>
+              <w:t xml:space="preserve">no-new-privileges</w:t>
+            </w:r>
+            <w:r>
+              <w:rPr>
+                <w:color w:val="17261F"/>
+                <w:sz w:val="17"/>
+                <w:szCs w:val="17"/>
+              </w:rPr>
+              <w:t xml:space="preserve">, </w:t>
+            </w:r>
+            <w:r>
+              <w:rPr>
+                <w:rFonts w:ascii="JetBrains Mono" w:hAnsi="JetBrains Mono" w:eastAsia="JetBrains Mono" w:cs="JetBrains Mono"/>
+                <w:color w:val="0A5A3C"/>
+                <w:sz w:val="15"/>
+                <w:szCs w:val="15"/>
+              </w:rPr>
+              <w:t xml:space="preserve">read_only</w:t>
+            </w:r>
+            <w:r>
+              <w:rPr>
+                <w:color w:val="17261F"/>
+                <w:sz w:val="17"/>
+                <w:szCs w:val="17"/>
+              </w:rPr>
+              <w:t xml:space="preserve">, </w:t>
+            </w:r>
+            <w:r>
+              <w:rPr>
+                <w:rFonts w:ascii="JetBrains Mono" w:hAnsi="JetBrains Mono" w:eastAsia="JetBrains Mono" w:cs="JetBrains Mono"/>
+                <w:color w:val="0A5A3C"/>
+                <w:sz w:val="15"/>
+                <w:szCs w:val="15"/>
+              </w:rPr>
+              <w:t xml:space="preserve">cap_drop: ALL</w:t>
+            </w:r>
+          </w:p>
+        </w:tc>
+      </w:tr>
+      <w:tr>
+        <w:trPr>
+          <w:cantSplit/>
+        </w:trPr>
+        <w:tc>
+          <w:tcPr>
+            <w:tcW w:w="2076" w:type="dxa"/>
+            <w:shd w:val="clear" w:color="auto" w:fill="F2F7F4"/>
+            <w:tcMar>
+              <w:top w:w="70" w:type="dxa"/>
+              <w:left w:w="110" w:type="dxa"/>
+              <w:bottom w:w="70" w:type="dxa"/>
+              <w:right w:w="110" w:type="dxa"/>
+            </w:tcMar>
+            <w:vAlign w:val="center"/>
+          </w:tcPr>
+          <w:p>
+            <w:pPr>
+              <w:spacing w:before="0" w:after="0" w:line="252" w:lineRule="auto"/>
+            </w:pPr>
+            <w:r>
+              <w:rPr>
+                <w:rFonts w:ascii="JetBrains Mono" w:hAnsi="JetBrains Mono" w:eastAsia="JetBrains Mono" w:cs="JetBrains Mono"/>
+                <w:b/>
+                <w:bCs/>
+                <w:color w:val="0A5A3C"/>
+                <w:sz w:val="15"/>
+                <w:szCs w:val="15"/>
+              </w:rPr>
+              <w:t xml:space="preserve">broker-smartpot</w:t>
+            </w:r>
+          </w:p>
+        </w:tc>
+        <w:tc>
+          <w:tcPr>
+            <w:tcW w:w="960" w:type="dxa"/>
+            <w:shd w:val="clear" w:color="auto" w:fill="F2F7F4"/>
+            <w:tcMar>
+              <w:top w:w="70" w:type="dxa"/>
+              <w:left w:w="110" w:type="dxa"/>
+              <w:bottom w:w="70" w:type="dxa"/>
+              <w:right w:w="110" w:type="dxa"/>
+            </w:tcMar>
+            <w:vAlign w:val="center"/>
+          </w:tcPr>
+          <w:p>
+            <w:pPr>
+              <w:spacing w:before="0" w:after="0" w:line="252" w:lineRule="auto"/>
+            </w:pPr>
+            <w:r>
+              <w:rPr>
+                <w:color w:val="17261F"/>
+                <w:sz w:val="17"/>
+                <w:szCs w:val="17"/>
+              </w:rPr>
+              <w:t xml:space="preserve">2.0</w:t>
+            </w:r>
+          </w:p>
+        </w:tc>
+        <w:tc>
+          <w:tcPr>
+            <w:tcW w:w="1560" w:type="dxa"/>
+            <w:shd w:val="clear" w:color="auto" w:fill="F2F7F4"/>
+            <w:tcMar>
+              <w:top w:w="70" w:type="dxa"/>
+              <w:left w:w="110" w:type="dxa"/>
+              <w:bottom w:w="70" w:type="dxa"/>
+              <w:right w:w="110" w:type="dxa"/>
+            </w:tcMar>
+            <w:vAlign w:val="center"/>
+          </w:tcPr>
+          <w:p>
+            <w:pPr>
+              <w:spacing w:before="0" w:after="0" w:line="252" w:lineRule="auto"/>
+            </w:pPr>
+            <w:r>
+              <w:rPr>
+                <w:color w:val="17261F"/>
+                <w:sz w:val="17"/>
+                <w:szCs w:val="17"/>
+              </w:rPr>
+              <w:t xml:space="preserve">1024 MB</w:t>
+            </w:r>
+          </w:p>
+        </w:tc>
+        <w:tc>
+          <w:tcPr>
+            <w:tcW w:w="1680" w:type="dxa"/>
+            <w:shd w:val="clear" w:color="auto" w:fill="F2F7F4"/>
+            <w:tcMar>
+              <w:top w:w="70" w:type="dxa"/>
+              <w:left w:w="110" w:type="dxa"/>
+              <w:bottom w:w="70" w:type="dxa"/>
+              <w:right w:w="110" w:type="dxa"/>
+            </w:tcMar>
+            <w:vAlign w:val="center"/>
+          </w:tcPr>
+          <w:p>
+            <w:pPr>
+              <w:spacing w:before="0" w:after="0" w:line="252" w:lineRule="auto"/>
+            </w:pPr>
+            <w:r>
+              <w:rPr>
+                <w:color w:val="17261F"/>
+                <w:sz w:val="17"/>
+                <w:szCs w:val="17"/>
+              </w:rPr>
+              <w:t xml:space="preserve">512</w:t>
+            </w:r>
+          </w:p>
+        </w:tc>
+        <w:tc>
+          <w:tcPr>
+            <w:tcW w:w="3084" w:type="dxa"/>
+            <w:shd w:val="clear" w:color="auto" w:fill="F2F7F4"/>
+            <w:tcMar>
+              <w:top w:w="70" w:type="dxa"/>
+              <w:left w:w="110" w:type="dxa"/>
+              <w:bottom w:w="70" w:type="dxa"/>
+              <w:right w:w="110" w:type="dxa"/>
+            </w:tcMar>
+            <w:vAlign w:val="center"/>
+          </w:tcPr>
+          <w:p>
+            <w:pPr>
+              <w:spacing w:before="0" w:after="0" w:line="252" w:lineRule="auto"/>
+            </w:pPr>
+            <w:r>
+              <w:rPr>
+                <w:rFonts w:ascii="JetBrains Mono" w:hAnsi="JetBrains Mono" w:eastAsia="JetBrains Mono" w:cs="JetBrains Mono"/>
+                <w:color w:val="0A5A3C"/>
+                <w:sz w:val="15"/>
+                <w:szCs w:val="15"/>
+              </w:rPr>
+              <w:t xml:space="preserve">no-new-privileges</w:t>
+            </w:r>
+            <w:r>
+              <w:rPr>
+                <w:color w:val="17261F"/>
+                <w:sz w:val="17"/>
+                <w:szCs w:val="17"/>
+              </w:rPr>
+              <w:t xml:space="preserve">, datos persistentes en volumen</w:t>
+            </w:r>
+          </w:p>
+        </w:tc>
+      </w:tr>
+      <w:tr>
+        <w:trPr>
+          <w:cantSplit/>
+        </w:trPr>
+        <w:tc>
+          <w:tcPr>
+            <w:tcW w:w="2076" w:type="dxa"/>
+            <w:shd w:val="clear" w:color="auto" w:fill="FFFFFF"/>
+            <w:tcMar>
+              <w:top w:w="70" w:type="dxa"/>
+              <w:left w:w="110" w:type="dxa"/>
+              <w:bottom w:w="70" w:type="dxa"/>
+              <w:right w:w="110" w:type="dxa"/>
+            </w:tcMar>
+            <w:vAlign w:val="center"/>
+          </w:tcPr>
+          <w:p>
+            <w:pPr>
+              <w:spacing w:before="0" w:after="0" w:line="252" w:lineRule="auto"/>
+            </w:pPr>
+            <w:r>
+              <w:rPr>
+                <w:rFonts w:ascii="JetBrains Mono" w:hAnsi="JetBrains Mono" w:eastAsia="JetBrains Mono" w:cs="JetBrains Mono"/>
+                <w:b/>
+                <w:bCs/>
+                <w:color w:val="0A5A3C"/>
+                <w:sz w:val="15"/>
+                <w:szCs w:val="15"/>
+              </w:rPr>
+              <w:t xml:space="preserve">ai-smartpot</w:t>
+            </w:r>
+          </w:p>
+        </w:tc>
+        <w:tc>
+          <w:tcPr>
+            <w:tcW w:w="960" w:type="dxa"/>
+            <w:shd w:val="clear" w:color="auto" w:fill="FFFFFF"/>
+            <w:tcMar>
+              <w:top w:w="70" w:type="dxa"/>
+              <w:left w:w="110" w:type="dxa"/>
+              <w:bottom w:w="70" w:type="dxa"/>
+              <w:right w:w="110" w:type="dxa"/>
+            </w:tcMar>
+            <w:vAlign w:val="center"/>
+          </w:tcPr>
+          <w:p>
+            <w:pPr>
+              <w:spacing w:before="0" w:after="0" w:line="252" w:lineRule="auto"/>
+            </w:pPr>
+            <w:r>
+              <w:rPr>
+                <w:color w:val="17261F"/>
+                <w:sz w:val="17"/>
+                <w:szCs w:val="17"/>
+              </w:rPr>
+              <w:t xml:space="preserve">2.0</w:t>
+            </w:r>
+          </w:p>
+        </w:tc>
+        <w:tc>
+          <w:tcPr>
+            <w:tcW w:w="1560" w:type="dxa"/>
+            <w:shd w:val="clear" w:color="auto" w:fill="FFFFFF"/>
+            <w:tcMar>
+              <w:top w:w="70" w:type="dxa"/>
+              <w:left w:w="110" w:type="dxa"/>
+              <w:bottom w:w="70" w:type="dxa"/>
+              <w:right w:w="110" w:type="dxa"/>
+            </w:tcMar>
+            <w:vAlign w:val="center"/>
+          </w:tcPr>
+          <w:p>
+            <w:pPr>
+              <w:spacing w:before="0" w:after="0" w:line="252" w:lineRule="auto"/>
+            </w:pPr>
+            <w:r>
+              <w:rPr>
+                <w:color w:val="17261F"/>
+                <w:sz w:val="17"/>
+                <w:szCs w:val="17"/>
+              </w:rPr>
+              <w:t xml:space="preserve">768 MB</w:t>
+            </w:r>
+          </w:p>
+        </w:tc>
+        <w:tc>
+          <w:tcPr>
+            <w:tcW w:w="1680" w:type="dxa"/>
+            <w:shd w:val="clear" w:color="auto" w:fill="FFFFFF"/>
+            <w:tcMar>
+              <w:top w:w="70" w:type="dxa"/>
+              <w:left w:w="110" w:type="dxa"/>
+              <w:bottom w:w="70" w:type="dxa"/>
+              <w:right w:w="110" w:type="dxa"/>
+            </w:tcMar>
+            <w:vAlign w:val="center"/>
+          </w:tcPr>
+          <w:p>
+            <w:pPr>
+              <w:spacing w:before="0" w:after="0" w:line="252" w:lineRule="auto"/>
+            </w:pPr>
+            <w:r>
+              <w:rPr>
+                <w:color w:val="17261F"/>
+                <w:sz w:val="17"/>
+                <w:szCs w:val="17"/>
+              </w:rPr>
+              <w:t xml:space="preserve">128</w:t>
+            </w:r>
+          </w:p>
+        </w:tc>
+        <w:tc>
+          <w:tcPr>
+            <w:tcW w:w="3084" w:type="dxa"/>
+            <w:shd w:val="clear" w:color="auto" w:fill="FFFFFF"/>
+            <w:tcMar>
+              <w:top w:w="70" w:type="dxa"/>
+              <w:left w:w="110" w:type="dxa"/>
+              <w:bottom w:w="70" w:type="dxa"/>
+              <w:right w:w="110" w:type="dxa"/>
+            </w:tcMar>
+            <w:vAlign w:val="center"/>
+          </w:tcPr>
+          <w:p>
+            <w:pPr>
+              <w:spacing w:before="0" w:after="0" w:line="252" w:lineRule="auto"/>
+            </w:pPr>
+            <w:r>
+              <w:rPr>
+                <w:rFonts w:ascii="JetBrains Mono" w:hAnsi="JetBrains Mono" w:eastAsia="JetBrains Mono" w:cs="JetBrains Mono"/>
+                <w:color w:val="0A5A3C"/>
+                <w:sz w:val="15"/>
+                <w:szCs w:val="15"/>
+              </w:rPr>
+              <w:t xml:space="preserve">no-new-privileges</w:t>
+            </w:r>
+            <w:r>
+              <w:rPr>
+                <w:color w:val="17261F"/>
+                <w:sz w:val="17"/>
+                <w:szCs w:val="17"/>
+              </w:rPr>
+              <w:t xml:space="preserve">, </w:t>
+            </w:r>
+            <w:r>
+              <w:rPr>
+                <w:rFonts w:ascii="JetBrains Mono" w:hAnsi="JetBrains Mono" w:eastAsia="JetBrains Mono" w:cs="JetBrains Mono"/>
+                <w:color w:val="0A5A3C"/>
+                <w:sz w:val="15"/>
+                <w:szCs w:val="15"/>
+              </w:rPr>
+              <w:t xml:space="preserve">read_only</w:t>
+            </w:r>
+            <w:r>
+              <w:rPr>
+                <w:color w:val="17261F"/>
+                <w:sz w:val="17"/>
+                <w:szCs w:val="17"/>
+              </w:rPr>
+              <w:t xml:space="preserve">, </w:t>
+            </w:r>
+            <w:r>
+              <w:rPr>
+                <w:rFonts w:ascii="JetBrains Mono" w:hAnsi="JetBrains Mono" w:eastAsia="JetBrains Mono" w:cs="JetBrains Mono"/>
+                <w:color w:val="0A5A3C"/>
+                <w:sz w:val="15"/>
+                <w:szCs w:val="15"/>
+              </w:rPr>
+              <w:t xml:space="preserve">cap_drop: ALL</w:t>
+            </w:r>
+          </w:p>
+        </w:tc>
+      </w:tr>
+      <w:tr>
+        <w:trPr>
+          <w:cantSplit/>
+        </w:trPr>
+        <w:tc>
+          <w:tcPr>
+            <w:tcW w:w="2076" w:type="dxa"/>
+            <w:shd w:val="clear" w:color="auto" w:fill="F2F7F4"/>
+            <w:tcMar>
+              <w:top w:w="70" w:type="dxa"/>
+              <w:left w:w="110" w:type="dxa"/>
+              <w:bottom w:w="70" w:type="dxa"/>
+              <w:right w:w="110" w:type="dxa"/>
+            </w:tcMar>
+            <w:vAlign w:val="center"/>
+          </w:tcPr>
+          <w:p>
+            <w:pPr>
+              <w:spacing w:before="0" w:after="0" w:line="252" w:lineRule="auto"/>
+            </w:pPr>
+            <w:r>
+              <w:rPr>
+                <w:rFonts w:ascii="JetBrains Mono" w:hAnsi="JetBrains Mono" w:eastAsia="JetBrains Mono" w:cs="JetBrains Mono"/>
+                <w:b/>
+                <w:bCs/>
+                <w:color w:val="0A5A3C"/>
+                <w:sz w:val="15"/>
+                <w:szCs w:val="15"/>
+              </w:rPr>
+              <w:t xml:space="preserve">api-smartpot</w:t>
+            </w:r>
+          </w:p>
+        </w:tc>
+        <w:tc>
+          <w:tcPr>
+            <w:tcW w:w="960" w:type="dxa"/>
+            <w:shd w:val="clear" w:color="auto" w:fill="F2F7F4"/>
+            <w:tcMar>
+              <w:top w:w="70" w:type="dxa"/>
+              <w:left w:w="110" w:type="dxa"/>
+              <w:bottom w:w="70" w:type="dxa"/>
+              <w:right w:w="110" w:type="dxa"/>
+            </w:tcMar>
+            <w:vAlign w:val="center"/>
+          </w:tcPr>
+          <w:p>
+            <w:pPr>
+              <w:spacing w:before="0" w:after="0" w:line="252" w:lineRule="auto"/>
+            </w:pPr>
+            <w:r>
+              <w:rPr>
+                <w:color w:val="17261F"/>
+                <w:sz w:val="17"/>
+                <w:szCs w:val="17"/>
+              </w:rPr>
+              <w:t xml:space="preserve">2.0</w:t>
+            </w:r>
+          </w:p>
+        </w:tc>
+        <w:tc>
+          <w:tcPr>
+            <w:tcW w:w="1560" w:type="dxa"/>
+            <w:shd w:val="clear" w:color="auto" w:fill="F2F7F4"/>
+            <w:tcMar>
+              <w:top w:w="70" w:type="dxa"/>
+              <w:left w:w="110" w:type="dxa"/>
+              <w:bottom w:w="70" w:type="dxa"/>
+              <w:right w:w="110" w:type="dxa"/>
+            </w:tcMar>
+            <w:vAlign w:val="center"/>
+          </w:tcPr>
+          <w:p>
+            <w:pPr>
+              <w:spacing w:before="0" w:after="0" w:line="252" w:lineRule="auto"/>
+            </w:pPr>
+            <w:r>
+              <w:rPr>
+                <w:color w:val="17261F"/>
+                <w:sz w:val="17"/>
+                <w:szCs w:val="17"/>
+              </w:rPr>
+              <w:t xml:space="preserve">512 MB</w:t>
+            </w:r>
+          </w:p>
+        </w:tc>
+        <w:tc>
+          <w:tcPr>
+            <w:tcW w:w="1680" w:type="dxa"/>
+            <w:shd w:val="clear" w:color="auto" w:fill="F2F7F4"/>
+            <w:tcMar>
+              <w:top w:w="70" w:type="dxa"/>
+              <w:left w:w="110" w:type="dxa"/>
+              <w:bottom w:w="70" w:type="dxa"/>
+              <w:right w:w="110" w:type="dxa"/>
+            </w:tcMar>
+            <w:vAlign w:val="center"/>
+          </w:tcPr>
+          <w:p>
+            <w:pPr>
+              <w:spacing w:before="0" w:after="0" w:line="252" w:lineRule="auto"/>
+            </w:pPr>
+            <w:r>
+              <w:rPr>
+                <w:color w:val="17261F"/>
+                <w:sz w:val="17"/>
+                <w:szCs w:val="17"/>
+              </w:rPr>
+              <w:t xml:space="preserve">256</w:t>
+            </w:r>
+          </w:p>
+        </w:tc>
+        <w:tc>
+          <w:tcPr>
+            <w:tcW w:w="3084" w:type="dxa"/>
+            <w:shd w:val="clear" w:color="auto" w:fill="F2F7F4"/>
+            <w:tcMar>
+              <w:top w:w="70" w:type="dxa"/>
+              <w:left w:w="110" w:type="dxa"/>
+              <w:bottom w:w="70" w:type="dxa"/>
+              <w:right w:w="110" w:type="dxa"/>
+            </w:tcMar>
+            <w:vAlign w:val="center"/>
+          </w:tcPr>
+          <w:p>
+            <w:pPr>
+              <w:spacing w:before="0" w:after="0" w:line="252" w:lineRule="auto"/>
+            </w:pPr>
+            <w:r>
+              <w:rPr>
+                <w:rFonts w:ascii="JetBrains Mono" w:hAnsi="JetBrains Mono" w:eastAsia="JetBrains Mono" w:cs="JetBrains Mono"/>
+                <w:color w:val="0A5A3C"/>
+                <w:sz w:val="15"/>
+                <w:szCs w:val="15"/>
+              </w:rPr>
+              <w:t xml:space="preserve">no-new-privileges</w:t>
+            </w:r>
+            <w:r>
+              <w:rPr>
+                <w:color w:val="17261F"/>
+                <w:sz w:val="17"/>
+                <w:szCs w:val="17"/>
+              </w:rPr>
+              <w:t xml:space="preserve">, </w:t>
+            </w:r>
+            <w:r>
+              <w:rPr>
+                <w:rFonts w:ascii="JetBrains Mono" w:hAnsi="JetBrains Mono" w:eastAsia="JetBrains Mono" w:cs="JetBrains Mono"/>
+                <w:color w:val="0A5A3C"/>
+                <w:sz w:val="15"/>
+                <w:szCs w:val="15"/>
+              </w:rPr>
+              <w:t xml:space="preserve">read_only</w:t>
+            </w:r>
+            <w:r>
+              <w:rPr>
+                <w:color w:val="17261F"/>
+                <w:sz w:val="17"/>
+                <w:szCs w:val="17"/>
+              </w:rPr>
+              <w:t xml:space="preserve">, </w:t>
+            </w:r>
+            <w:r>
+              <w:rPr>
+                <w:rFonts w:ascii="JetBrains Mono" w:hAnsi="JetBrains Mono" w:eastAsia="JetBrains Mono" w:cs="JetBrains Mono"/>
+                <w:color w:val="0A5A3C"/>
+                <w:sz w:val="15"/>
+                <w:szCs w:val="15"/>
+              </w:rPr>
+              <w:t xml:space="preserve">cap_drop: ALL</w:t>
+            </w:r>
+          </w:p>
+        </w:tc>
+      </w:tr>
+      <w:tr>
+        <w:trPr>
+          <w:cantSplit/>
+        </w:trPr>
+        <w:tc>
+          <w:tcPr>
+            <w:tcW w:w="2076" w:type="dxa"/>
+            <w:shd w:val="clear" w:color="auto" w:fill="FFFFFF"/>
+            <w:tcMar>
+              <w:top w:w="70" w:type="dxa"/>
+              <w:left w:w="110" w:type="dxa"/>
+              <w:bottom w:w="70" w:type="dxa"/>
+              <w:right w:w="110" w:type="dxa"/>
+            </w:tcMar>
+            <w:vAlign w:val="center"/>
+          </w:tcPr>
+          <w:p>
+            <w:pPr>
+              <w:spacing w:before="0" w:after="0" w:line="252" w:lineRule="auto"/>
+            </w:pPr>
+            <w:r>
+              <w:rPr>
+                <w:rFonts w:ascii="JetBrains Mono" w:hAnsi="JetBrains Mono" w:eastAsia="JetBrains Mono" w:cs="JetBrains Mono"/>
+                <w:b/>
+                <w:bCs/>
+                <w:color w:val="0A5A3C"/>
+                <w:sz w:val="15"/>
+                <w:szCs w:val="15"/>
+              </w:rPr>
+              <w:t xml:space="preserve">web-smartpot</w:t>
+            </w:r>
+          </w:p>
+        </w:tc>
+        <w:tc>
+          <w:tcPr>
+            <w:tcW w:w="960" w:type="dxa"/>
+            <w:shd w:val="clear" w:color="auto" w:fill="FFFFFF"/>
+            <w:tcMar>
+              <w:top w:w="70" w:type="dxa"/>
+              <w:left w:w="110" w:type="dxa"/>
+              <w:bottom w:w="70" w:type="dxa"/>
+              <w:right w:w="110" w:type="dxa"/>
+            </w:tcMar>
+            <w:vAlign w:val="center"/>
+          </w:tcPr>
+          <w:p>
+            <w:pPr>
+              <w:spacing w:before="0" w:after="0" w:line="252" w:lineRule="auto"/>
+            </w:pPr>
+            <w:r>
+              <w:rPr>
+                <w:color w:val="17261F"/>
+                <w:sz w:val="17"/>
+                <w:szCs w:val="17"/>
+              </w:rPr>
+              <w:t xml:space="preserve">1.0</w:t>
+            </w:r>
+          </w:p>
+        </w:tc>
+        <w:tc>
+          <w:tcPr>
+            <w:tcW w:w="1560" w:type="dxa"/>
+            <w:shd w:val="clear" w:color="auto" w:fill="FFFFFF"/>
+            <w:tcMar>
+              <w:top w:w="70" w:type="dxa"/>
+              <w:left w:w="110" w:type="dxa"/>
+              <w:bottom w:w="70" w:type="dxa"/>
+              <w:right w:w="110" w:type="dxa"/>
+            </w:tcMar>
+            <w:vAlign w:val="center"/>
+          </w:tcPr>
+          <w:p>
+            <w:pPr>
+              <w:spacing w:before="0" w:after="0" w:line="252" w:lineRule="auto"/>
+            </w:pPr>
+            <w:r>
+              <w:rPr>
+                <w:color w:val="17261F"/>
+                <w:sz w:val="17"/>
+                <w:szCs w:val="17"/>
+              </w:rPr>
+              <w:t xml:space="preserve">128 MB</w:t>
+            </w:r>
+          </w:p>
+        </w:tc>
+        <w:tc>
+          <w:tcPr>
+            <w:tcW w:w="1680" w:type="dxa"/>
+            <w:shd w:val="clear" w:color="auto" w:fill="FFFFFF"/>
+            <w:tcMar>
+              <w:top w:w="70" w:type="dxa"/>
+              <w:left w:w="110" w:type="dxa"/>
+              <w:bottom w:w="70" w:type="dxa"/>
+              <w:right w:w="110" w:type="dxa"/>
+            </w:tcMar>
+            <w:vAlign w:val="center"/>
+          </w:tcPr>
+          <w:p>
+            <w:pPr>
+              <w:spacing w:before="0" w:after="0" w:line="252" w:lineRule="auto"/>
+            </w:pPr>
+            <w:r>
+              <w:rPr>
+                <w:color w:val="17261F"/>
+                <w:sz w:val="17"/>
+                <w:szCs w:val="17"/>
+              </w:rPr>
+              <w:t xml:space="preserve">128</w:t>
+            </w:r>
+          </w:p>
+        </w:tc>
+        <w:tc>
+          <w:tcPr>
+            <w:tcW w:w="3084" w:type="dxa"/>
+            <w:shd w:val="clear" w:color="auto" w:fill="FFFFFF"/>
+            <w:tcMar>
+              <w:top w:w="70" w:type="dxa"/>
+              <w:left w:w="110" w:type="dxa"/>
+              <w:bottom w:w="70" w:type="dxa"/>
+              <w:right w:w="110" w:type="dxa"/>
+            </w:tcMar>
+            <w:vAlign w:val="center"/>
+          </w:tcPr>
+          <w:p>
+            <w:pPr>
+              <w:spacing w:before="0" w:after="0" w:line="252" w:lineRule="auto"/>
+            </w:pPr>
+            <w:r>
+              <w:rPr>
+                <w:rFonts w:ascii="JetBrains Mono" w:hAnsi="JetBrains Mono" w:eastAsia="JetBrains Mono" w:cs="JetBrains Mono"/>
+                <w:color w:val="0A5A3C"/>
+                <w:sz w:val="15"/>
+                <w:szCs w:val="15"/>
+              </w:rPr>
+              <w:t xml:space="preserve">no-new-privileges</w:t>
+            </w:r>
+            <w:r>
+              <w:rPr>
+                <w:color w:val="17261F"/>
+                <w:sz w:val="17"/>
+                <w:szCs w:val="17"/>
+              </w:rPr>
+              <w:t xml:space="preserve">, </w:t>
+            </w:r>
+            <w:r>
+              <w:rPr>
+                <w:rFonts w:ascii="JetBrains Mono" w:hAnsi="JetBrains Mono" w:eastAsia="JetBrains Mono" w:cs="JetBrains Mono"/>
+                <w:color w:val="0A5A3C"/>
+                <w:sz w:val="15"/>
+                <w:szCs w:val="15"/>
+              </w:rPr>
+              <w:t xml:space="preserve">read_only</w:t>
+            </w:r>
+            <w:r>
+              <w:rPr>
+                <w:color w:val="17261F"/>
+                <w:sz w:val="17"/>
+                <w:szCs w:val="17"/>
+              </w:rPr>
+              <w:t xml:space="preserve">, </w:t>
+            </w:r>
+            <w:r>
+              <w:rPr>
+                <w:rFonts w:ascii="JetBrains Mono" w:hAnsi="JetBrains Mono" w:eastAsia="JetBrains Mono" w:cs="JetBrains Mono"/>
+                <w:color w:val="0A5A3C"/>
+                <w:sz w:val="15"/>
+                <w:szCs w:val="15"/>
+              </w:rPr>
+              <w:t xml:space="preserve">cap_drop: ALL</w:t>
+            </w:r>
+          </w:p>
+        </w:tc>
+      </w:tr>
+      <w:tr>
+        <w:trPr>
+          <w:cantSplit/>
+        </w:trPr>
+        <w:tc>
+          <w:tcPr>
+            <w:tcW w:w="2076" w:type="dxa"/>
+            <w:shd w:val="clear" w:color="auto" w:fill="F2F7F4"/>
+            <w:tcMar>
+              <w:top w:w="70" w:type="dxa"/>
+              <w:left w:w="110" w:type="dxa"/>
+              <w:bottom w:w="70" w:type="dxa"/>
+              <w:right w:w="110" w:type="dxa"/>
+            </w:tcMar>
+            <w:vAlign w:val="center"/>
+          </w:tcPr>
+          <w:p>
+            <w:pPr>
+              <w:spacing w:before="0" w:after="0" w:line="252" w:lineRule="auto"/>
+            </w:pPr>
+            <w:r>
+              <w:rPr>
+                <w:rFonts w:ascii="JetBrains Mono" w:hAnsi="JetBrains Mono" w:eastAsia="JetBrains Mono" w:cs="JetBrains Mono"/>
+                <w:b/>
+                <w:bCs/>
+                <w:color w:val="0A5A3C"/>
+                <w:sz w:val="15"/>
+                <w:szCs w:val="15"/>
+              </w:rPr>
+              <w:t xml:space="preserve">simulator-smartpot</w:t>
+            </w:r>
+          </w:p>
+        </w:tc>
+        <w:tc>
+          <w:tcPr>
+            <w:tcW w:w="960" w:type="dxa"/>
+            <w:shd w:val="clear" w:color="auto" w:fill="F2F7F4"/>
+            <w:tcMar>
+              <w:top w:w="70" w:type="dxa"/>
+              <w:left w:w="110" w:type="dxa"/>
+              <w:bottom w:w="70" w:type="dxa"/>
+              <w:right w:w="110" w:type="dxa"/>
+            </w:tcMar>
+            <w:vAlign w:val="center"/>
+          </w:tcPr>
+          <w:p>
+            <w:pPr>
+              <w:spacing w:before="0" w:after="0" w:line="252" w:lineRule="auto"/>
+            </w:pPr>
+            <w:r>
+              <w:rPr>
+                <w:color w:val="17261F"/>
+                <w:sz w:val="17"/>
+                <w:szCs w:val="17"/>
+              </w:rPr>
+              <w:t xml:space="preserve">1.0</w:t>
+            </w:r>
+          </w:p>
+        </w:tc>
+        <w:tc>
+          <w:tcPr>
+            <w:tcW w:w="1560" w:type="dxa"/>
+            <w:shd w:val="clear" w:color="auto" w:fill="F2F7F4"/>
+            <w:tcMar>
+              <w:top w:w="70" w:type="dxa"/>
+              <w:left w:w="110" w:type="dxa"/>
+              <w:bottom w:w="70" w:type="dxa"/>
+              <w:right w:w="110" w:type="dxa"/>
+            </w:tcMar>
+            <w:vAlign w:val="center"/>
+          </w:tcPr>
+          <w:p>
+            <w:pPr>
+              <w:spacing w:before="0" w:after="0" w:line="252" w:lineRule="auto"/>
+            </w:pPr>
+            <w:r>
+              <w:rPr>
+                <w:color w:val="17261F"/>
+                <w:sz w:val="17"/>
+                <w:szCs w:val="17"/>
+              </w:rPr>
+              <w:t xml:space="preserve">128 MB</w:t>
+            </w:r>
+          </w:p>
+        </w:tc>
+        <w:tc>
+          <w:tcPr>
+            <w:tcW w:w="1680" w:type="dxa"/>
+            <w:shd w:val="clear" w:color="auto" w:fill="F2F7F4"/>
+            <w:tcMar>
+              <w:top w:w="70" w:type="dxa"/>
+              <w:left w:w="110" w:type="dxa"/>
+              <w:bottom w:w="70" w:type="dxa"/>
+              <w:right w:w="110" w:type="dxa"/>
+            </w:tcMar>
+            <w:vAlign w:val="center"/>
+          </w:tcPr>
+          <w:p>
+            <w:pPr>
+              <w:spacing w:before="0" w:after="0" w:line="252" w:lineRule="auto"/>
+            </w:pPr>
+            <w:r>
+              <w:rPr>
+                <w:color w:val="17261F"/>
+                <w:sz w:val="17"/>
+                <w:szCs w:val="17"/>
+              </w:rPr>
+              <w:t xml:space="preserve">128</w:t>
+            </w:r>
+          </w:p>
+        </w:tc>
+        <w:tc>
+          <w:tcPr>
+            <w:tcW w:w="3084" w:type="dxa"/>
+            <w:shd w:val="clear" w:color="auto" w:fill="F2F7F4"/>
+            <w:tcMar>
+              <w:top w:w="70" w:type="dxa"/>
+              <w:left w:w="110" w:type="dxa"/>
+              <w:bottom w:w="70" w:type="dxa"/>
+              <w:right w:w="110" w:type="dxa"/>
+            </w:tcMar>
+            <w:vAlign w:val="center"/>
+          </w:tcPr>
+          <w:p>
+            <w:pPr>
+              <w:spacing w:before="0" w:after="0" w:line="252" w:lineRule="auto"/>
+            </w:pPr>
+            <w:r>
+              <w:rPr>
+                <w:rFonts w:ascii="JetBrains Mono" w:hAnsi="JetBrains Mono" w:eastAsia="JetBrains Mono" w:cs="JetBrains Mono"/>
+                <w:color w:val="0A5A3C"/>
+                <w:sz w:val="15"/>
+                <w:szCs w:val="15"/>
+              </w:rPr>
+              <w:t xml:space="preserve">no-new-privileges</w:t>
+            </w:r>
+            <w:r>
+              <w:rPr>
+                <w:color w:val="17261F"/>
+                <w:sz w:val="17"/>
+                <w:szCs w:val="17"/>
+              </w:rPr>
+              <w:t xml:space="preserve">, </w:t>
+            </w:r>
+            <w:r>
+              <w:rPr>
+                <w:rFonts w:ascii="JetBrains Mono" w:hAnsi="JetBrains Mono" w:eastAsia="JetBrains Mono" w:cs="JetBrains Mono"/>
+                <w:color w:val="0A5A3C"/>
+                <w:sz w:val="15"/>
+                <w:szCs w:val="15"/>
+              </w:rPr>
+              <w:t xml:space="preserve">read_only</w:t>
+            </w:r>
+            <w:r>
+              <w:rPr>
+                <w:color w:val="17261F"/>
+                <w:sz w:val="17"/>
+                <w:szCs w:val="17"/>
+              </w:rPr>
+              <w:t xml:space="preserve">, </w:t>
+            </w:r>
+            <w:r>
+              <w:rPr>
+                <w:rFonts w:ascii="JetBrains Mono" w:hAnsi="JetBrains Mono" w:eastAsia="JetBrains Mono" w:cs="JetBrains Mono"/>
+                <w:color w:val="0A5A3C"/>
+                <w:sz w:val="15"/>
+                <w:szCs w:val="15"/>
+              </w:rPr>
+              <w:t xml:space="preserve">cap_drop: ALL</w:t>
+            </w:r>
+          </w:p>
+        </w:tc>
+      </w:tr>
+    </w:tbl>
+    <w:p>
+      <w:pPr>
+        <w:spacing w:before="160" w:after="0" w:line="240" w:lineRule="auto"/>
+        <w:rPr>
+          <w:sz w:val="8"/>
+        </w:rPr>
+      </w:pPr>
+    </w:p>
+    <w:p>
+      <w:pPr>
+        <w:spacing w:before="0" w:after="140" w:line="288" w:lineRule="auto"/>
+      </w:pPr>
+      <w:r>
+        <w:rPr>
+          <w:color w:val="17261F"/>
+          <w:sz w:val="20"/>
+          <w:szCs w:val="20"/>
+        </w:rPr>
+        <w:t xml:space="preserve">---</w:t>
+      </w:r>
+    </w:p>
+    <w:p>
+      <w:pPr>
+        <w:pageBreakBefore/>
+        <w:spacing w:before="0" w:after="0" w:line="20" w:lineRule="exact"/>
+        <w:rPr>
+          <w:sz w:val="2"/>
+        </w:rPr>
+      </w:pPr>
+    </w:p>
+    <w:tbl>
+      <w:tblPr>
+        <w:tblW w:w="9360" w:type="dxa"/>
+        <w:tblInd w:w="0" w:type="dxa"/>
+        <w:tblBorders>
+          <w:top w:val="nil"/>
+          <w:left w:val="nil"/>
+          <w:bottom w:val="nil"/>
+          <w:right w:val="nil"/>
+          <w:insideH w:val="nil"/>
+          <w:insideV w:val="nil"/>
+        </w:tblBorders>
+        <w:tblLayout w:type="fixed"/>
+        <w:tblCellMar>
+          <w:left w:w="0" w:type="dxa"/>
+          <w:right w:w="0" w:type="dxa"/>
+        </w:tblCellMar>
+        <w:tblLook w:val="0000" w:firstRow="0" w:lastRow="0" w:firstColumn="0" w:lastColumn="0" w:noHBand="1" w:noVBand="1"/>
+      </w:tblPr>
+      <w:tblGrid>
+        <w:gridCol w:w="9360"/>
+      </w:tblGrid>
+      <w:tr>
+        <w:trPr>
+          <w:cantSplit/>
+        </w:trPr>
+        <w:tc>
+          <w:tcPr>
+            <w:tcW w:w="9360" w:type="dxa"/>
+            <w:shd w:val="clear" w:color="auto" w:fill="0B3D2B"/>
+            <w:tcMar>
+              <w:top w:w="420" w:type="dxa"/>
+              <w:left w:w="480" w:type="dxa"/>
+              <w:bottom w:w="420" w:type="dxa"/>
+              <w:right w:w="480" w:type="dxa"/>
+            </w:tcMar>
+            <w:vAlign w:val="top"/>
+          </w:tcPr>
+          <w:p>
+            <w:pPr>
+              <w:spacing w:before="0" w:after="80" w:line="288" w:lineRule="auto"/>
+            </w:pPr>
+            <w:r>
+              <w:rPr>
+                <w:b/>
+                <w:bCs/>
+                <w:caps/>
+                <w:color w:val="F2B632"/>
+                <w:spacing w:val="60"/>
+                <w:sz w:val="17"/>
+                <w:szCs w:val="17"/>
+              </w:rPr>
+              <w:t xml:space="preserve">PARTE VII</w:t>
+            </w:r>
+          </w:p>
+          <w:p>
+            <w:pPr>
+              <w:spacing w:before="0" w:after="0" w:line="240" w:lineRule="auto"/>
+            </w:pPr>
+            <w:r>
+              <w:rPr>
+                <w:rFonts w:ascii="Century Gothic" w:hAnsi="Century Gothic" w:eastAsia="Century Gothic" w:cs="Century Gothic"/>
+                <w:b/>
+                <w:bCs/>
+                <w:color w:val="FFFFFF"/>
+                <w:sz w:val="44"/>
+                <w:szCs w:val="44"/>
+              </w:rPr>
+              <w:t xml:space="preserve">Quality Gates y Veredicto</w:t>
+            </w:r>
+          </w:p>
+        </w:tc>
+      </w:tr>
+    </w:tbl>
+    <w:p>
+      <w:pPr>
+        <w:spacing w:before="240" w:after="0" w:line="240" w:lineRule="auto"/>
+        <w:rPr>
+          <w:sz w:val="8"/>
+        </w:rPr>
+      </w:pPr>
+    </w:p>
+    <w:p>
+      <w:pPr>
+        <w:keepNext/>
+        <w:spacing w:before="360" w:after="40" w:line="288" w:lineRule="auto"/>
+      </w:pPr>
+      <w:r>
+        <w:rPr>
+          <w:b/>
+          <w:bCs/>
+          <w:color w:val="009A64"/>
+          <w:spacing w:val="60"/>
+          <w:sz w:val="16"/>
+          <w:szCs w:val="16"/>
+        </w:rPr>
+        <w:t xml:space="preserve">SECCIÓN 07</w:t>
+      </w:r>
+    </w:p>
+    <w:p>
+      <w:pPr>
+        <w:pStyle w:val="Heading1"/>
+      </w:pPr>
+      <w:bookmarkStart w:id="130" w:name="sec_130"/>
+      <w:r>
+        <w:rPr>
+          <w:b/>
+          <w:bCs/>
+          <w:color w:val="0B3D2B"/>
+          <w:sz w:val="34"/>
+          <w:szCs w:val="34"/>
+        </w:rPr>
+        <w:t xml:space="preserve">Matriz de Quality Gates y Decisión de Release</w:t>
+      </w:r>
+      <w:bookmarkEnd w:id="130"/>
+    </w:p>
+    <w:p>
+      <w:pPr>
+        <w:keepNext/>
+        <w:spacing w:before="60" w:after="0" w:line="240" w:lineRule="auto"/>
+        <w:rPr>
+          <w:sz w:val="8"/>
+        </w:rPr>
+      </w:pPr>
+    </w:p>
+    <w:tbl>
+      <w:tblPr>
+        <w:tblW w:w="9360" w:type="dxa"/>
+        <w:tblBorders>
+          <w:top w:val="single" w:sz="4" w:space="0" w:color="D5E3DC"/>
+          <w:left w:val="single" w:sz="4" w:space="0" w:color="D5E3DC"/>
+          <w:bottom w:val="single" w:sz="4" w:space="0" w:color="D5E3DC"/>
+          <w:right w:val="single" w:sz="4" w:space="0" w:color="D5E3DC"/>
+          <w:insideH w:val="single" w:sz="4" w:space="0" w:color="D5E3DC"/>
+          <w:insideV w:val="single" w:sz="4" w:space="0" w:color="D5E3DC"/>
+        </w:tblBorders>
+        <w:tblLayout w:type="fixed"/>
+        <w:tblCellMar>
+          <w:left w:w="0" w:type="dxa"/>
+          <w:right w:w="0" w:type="dxa"/>
+        </w:tblCellMar>
+        <w:tblLook w:val="04A0" w:firstRow="1" w:firstColumn="1" w:noVBand="1"/>
+      </w:tblPr>
+      <w:tblGrid>
+        <w:gridCol w:w="2216"/>
+        <w:gridCol w:w="2915"/>
+        <w:gridCol w:w="3251"/>
         <w:gridCol w:w="978"/>
       </w:tblGrid>
       <w:tr>
@@ -7844,7 +11584,7 @@
         </w:trPr>
         <w:tc>
           <w:tcPr>
-            <w:tcW w:w="2341" w:type="dxa"/>
+            <w:tcW w:w="2216" w:type="dxa"/>
             <w:shd w:val="clear" w:color="auto" w:fill="0B3D2B"/>
             <w:tcMar>
               <w:top w:w="70" w:type="dxa"/>
@@ -7873,7 +11613,7 @@
         </w:tc>
         <w:tc>
           <w:tcPr>
-            <w:tcW w:w="3346" w:type="dxa"/>
+            <w:tcW w:w="2915" w:type="dxa"/>
             <w:shd w:val="clear" w:color="auto" w:fill="0B3D2B"/>
             <w:tcMar>
               <w:top w:w="70" w:type="dxa"/>
@@ -7902,7 +11642,7 @@
         </w:tc>
         <w:tc>
           <w:tcPr>
-            <w:tcW w:w="2695" w:type="dxa"/>
+            <w:tcW w:w="3251" w:type="dxa"/>
             <w:shd w:val="clear" w:color="auto" w:fill="0B3D2B"/>
             <w:tcMar>
               <w:top w:w="70" w:type="dxa"/>
@@ -7965,7 +11705,7 @@
         </w:trPr>
         <w:tc>
           <w:tcPr>
-            <w:tcW w:w="2341" w:type="dxa"/>
+            <w:tcW w:w="2216" w:type="dxa"/>
             <w:shd w:val="clear" w:color="auto" w:fill="FFFFFF"/>
             <w:tcMar>
               <w:top w:w="70" w:type="dxa"/>
@@ -7993,7 +11733,7 @@
         </w:tc>
         <w:tc>
           <w:tcPr>
-            <w:tcW w:w="3346" w:type="dxa"/>
+            <w:tcW w:w="2915" w:type="dxa"/>
             <w:shd w:val="clear" w:color="auto" w:fill="FFFFFF"/>
             <w:tcMar>
               <w:top w:w="70" w:type="dxa"/>
@@ -8019,7 +11759,7 @@
         </w:tc>
         <w:tc>
           <w:tcPr>
-            <w:tcW w:w="2695" w:type="dxa"/>
+            <w:tcW w:w="3251" w:type="dxa"/>
             <w:shd w:val="clear" w:color="auto" w:fill="FFFFFF"/>
             <w:tcMar>
               <w:top w:w="70" w:type="dxa"/>
@@ -8078,7 +11818,7 @@
         </w:trPr>
         <w:tc>
           <w:tcPr>
-            <w:tcW w:w="2341" w:type="dxa"/>
+            <w:tcW w:w="2216" w:type="dxa"/>
             <w:shd w:val="clear" w:color="auto" w:fill="F2F7F4"/>
             <w:tcMar>
               <w:top w:w="70" w:type="dxa"/>
@@ -8106,7 +11846,7 @@
         </w:tc>
         <w:tc>
           <w:tcPr>
-            <w:tcW w:w="3346" w:type="dxa"/>
+            <w:tcW w:w="2915" w:type="dxa"/>
             <w:shd w:val="clear" w:color="auto" w:fill="F2F7F4"/>
             <w:tcMar>
               <w:top w:w="70" w:type="dxa"/>
@@ -8132,7 +11872,7 @@
         </w:tc>
         <w:tc>
           <w:tcPr>
-            <w:tcW w:w="2695" w:type="dxa"/>
+            <w:tcW w:w="3251" w:type="dxa"/>
             <w:shd w:val="clear" w:color="auto" w:fill="F2F7F4"/>
             <w:tcMar>
               <w:top w:w="70" w:type="dxa"/>
@@ -8191,7 +11931,7 @@
         </w:trPr>
         <w:tc>
           <w:tcPr>
-            <w:tcW w:w="2341" w:type="dxa"/>
+            <w:tcW w:w="2216" w:type="dxa"/>
             <w:shd w:val="clear" w:color="auto" w:fill="FFFFFF"/>
             <w:tcMar>
               <w:top w:w="70" w:type="dxa"/>
@@ -8219,7 +11959,7 @@
         </w:tc>
         <w:tc>
           <w:tcPr>
-            <w:tcW w:w="3346" w:type="dxa"/>
+            <w:tcW w:w="2915" w:type="dxa"/>
             <w:shd w:val="clear" w:color="auto" w:fill="FFFFFF"/>
             <w:tcMar>
               <w:top w:w="70" w:type="dxa"/>
@@ -8245,7 +11985,7 @@
         </w:tc>
         <w:tc>
           <w:tcPr>
-            <w:tcW w:w="2695" w:type="dxa"/>
+            <w:tcW w:w="3251" w:type="dxa"/>
             <w:shd w:val="clear" w:color="auto" w:fill="FFFFFF"/>
             <w:tcMar>
               <w:top w:w="70" w:type="dxa"/>
@@ -8304,7 +12044,7 @@
         </w:trPr>
         <w:tc>
           <w:tcPr>
-            <w:tcW w:w="2341" w:type="dxa"/>
+            <w:tcW w:w="2216" w:type="dxa"/>
             <w:shd w:val="clear" w:color="auto" w:fill="F2F7F4"/>
             <w:tcMar>
               <w:top w:w="70" w:type="dxa"/>
@@ -8332,7 +12072,7 @@
         </w:tc>
         <w:tc>
           <w:tcPr>
-            <w:tcW w:w="3346" w:type="dxa"/>
+            <w:tcW w:w="2915" w:type="dxa"/>
             <w:shd w:val="clear" w:color="auto" w:fill="F2F7F4"/>
             <w:tcMar>
               <w:top w:w="70" w:type="dxa"/>
@@ -8358,7 +12098,7 @@
         </w:tc>
         <w:tc>
           <w:tcPr>
-            <w:tcW w:w="2695" w:type="dxa"/>
+            <w:tcW w:w="3251" w:type="dxa"/>
             <w:shd w:val="clear" w:color="auto" w:fill="F2F7F4"/>
             <w:tcMar>
               <w:top w:w="70" w:type="dxa"/>
@@ -8419,7 +12159,7 @@
         </w:trPr>
         <w:tc>
           <w:tcPr>
-            <w:tcW w:w="2341" w:type="dxa"/>
+            <w:tcW w:w="2216" w:type="dxa"/>
             <w:shd w:val="clear" w:color="auto" w:fill="FFFFFF"/>
             <w:tcMar>
               <w:top w:w="70" w:type="dxa"/>
@@ -8441,13 +12181,13 @@
                 <w:sz w:val="17"/>
                 <w:szCs w:val="17"/>
               </w:rPr>
-              <w:t xml:space="preserve">GATE-5: Latencia bajo Carga</w:t>
-            </w:r>
-          </w:p>
-        </w:tc>
-        <w:tc>
-          <w:tcPr>
-            <w:tcW w:w="3346" w:type="dxa"/>
+              <w:t xml:space="preserve">GATE-5: Latencia Series Temporales</w:t>
+            </w:r>
+          </w:p>
+        </w:tc>
+        <w:tc>
+          <w:tcPr>
+            <w:tcW w:w="2915" w:type="dxa"/>
             <w:shd w:val="clear" w:color="auto" w:fill="FFFFFF"/>
             <w:tcMar>
               <w:top w:w="70" w:type="dxa"/>
@@ -8467,13 +12207,13 @@
                 <w:sz w:val="17"/>
                 <w:szCs w:val="17"/>
               </w:rPr>
-              <w:t xml:space="preserve">Latencia $p_{95} \le 50\text{ ms}$ a 500 RPS</w:t>
-            </w:r>
-          </w:p>
-        </w:tc>
-        <w:tc>
-          <w:tcPr>
-            <w:tcW w:w="2695" w:type="dxa"/>
+              <w:t xml:space="preserve">Latencia $p_{95} \le 50\text{ ms}$ en agregación temporal</w:t>
+            </w:r>
+          </w:p>
+        </w:tc>
+        <w:tc>
+          <w:tcPr>
+            <w:tcW w:w="3251" w:type="dxa"/>
             <w:shd w:val="clear" w:color="auto" w:fill="FFFFFF"/>
             <w:tcMar>
               <w:top w:w="70" w:type="dxa"/>
@@ -8495,15 +12235,15 @@
                 <w:sz w:val="17"/>
                 <w:szCs w:val="17"/>
               </w:rPr>
-              <w:t xml:space="preserve">14.8 ms</w:t>
-            </w:r>
-            <w:r>
-              <w:rPr>
-                <w:color w:val="17261F"/>
-                <w:sz w:val="17"/>
-                <w:szCs w:val="17"/>
-              </w:rPr>
-              <w:t xml:space="preserve"> (vs 94.0 ms en Estable)</w:t>
+              <w:t xml:space="preserve">$p_{50} = 3.63\text{ ms}$, $p_{95} = 26.54\text{ ms}$</w:t>
+            </w:r>
+            <w:r>
+              <w:rPr>
+                <w:color w:val="17261F"/>
+                <w:sz w:val="17"/>
+                <w:szCs w:val="17"/>
+              </w:rPr>
+              <w:t xml:space="preserve"> (vs &gt; 250 ms)</w:t>
             </w:r>
           </w:p>
         </w:tc>
@@ -8542,7 +12282,7 @@
         </w:trPr>
         <w:tc>
           <w:tcPr>
-            <w:tcW w:w="2341" w:type="dxa"/>
+            <w:tcW w:w="2216" w:type="dxa"/>
             <w:shd w:val="clear" w:color="auto" w:fill="F2F7F4"/>
             <w:tcMar>
               <w:top w:w="70" w:type="dxa"/>
@@ -8570,7 +12310,7 @@
         </w:tc>
         <w:tc>
           <w:tcPr>
-            <w:tcW w:w="3346" w:type="dxa"/>
+            <w:tcW w:w="2915" w:type="dxa"/>
             <w:shd w:val="clear" w:color="auto" w:fill="F2F7F4"/>
             <w:tcMar>
               <w:top w:w="70" w:type="dxa"/>
@@ -8596,7 +12336,7 @@
         </w:tc>
         <w:tc>
           <w:tcPr>
-            <w:tcW w:w="2695" w:type="dxa"/>
+            <w:tcW w:w="3251" w:type="dxa"/>
             <w:shd w:val="clear" w:color="auto" w:fill="F2F7F4"/>
             <w:tcMar>
               <w:top w:w="70" w:type="dxa"/>
@@ -8634,6 +12374,119 @@
           <w:tcPr>
             <w:tcW w:w="978" w:type="dxa"/>
             <w:shd w:val="clear" w:color="auto" w:fill="F2F7F4"/>
+            <w:tcMar>
+              <w:top w:w="70" w:type="dxa"/>
+              <w:left w:w="110" w:type="dxa"/>
+              <w:bottom w:w="70" w:type="dxa"/>
+              <w:right w:w="110" w:type="dxa"/>
+            </w:tcMar>
+            <w:vAlign w:val="center"/>
+          </w:tcPr>
+          <w:p>
+            <w:pPr>
+              <w:spacing w:before="0" w:after="0" w:line="252" w:lineRule="auto"/>
+            </w:pPr>
+            <w:r>
+              <w:rPr>
+                <w:b/>
+                <w:bCs/>
+                <w:color w:val="17261F"/>
+                <w:sz w:val="17"/>
+                <w:szCs w:val="17"/>
+              </w:rPr>
+              <w:t xml:space="preserve">APROBADO</w:t>
+            </w:r>
+          </w:p>
+        </w:tc>
+      </w:tr>
+      <w:tr>
+        <w:trPr>
+          <w:cantSplit/>
+        </w:trPr>
+        <w:tc>
+          <w:tcPr>
+            <w:tcW w:w="2216" w:type="dxa"/>
+            <w:shd w:val="clear" w:color="auto" w:fill="FFFFFF"/>
+            <w:tcMar>
+              <w:top w:w="70" w:type="dxa"/>
+              <w:left w:w="110" w:type="dxa"/>
+              <w:bottom w:w="70" w:type="dxa"/>
+              <w:right w:w="110" w:type="dxa"/>
+            </w:tcMar>
+            <w:vAlign w:val="center"/>
+          </w:tcPr>
+          <w:p>
+            <w:pPr>
+              <w:spacing w:before="0" w:after="0" w:line="252" w:lineRule="auto"/>
+            </w:pPr>
+            <w:r>
+              <w:rPr>
+                <w:b/>
+                <w:bCs/>
+                <w:color w:val="0A5A3C"/>
+                <w:sz w:val="17"/>
+                <w:szCs w:val="17"/>
+              </w:rPr>
+              <w:t xml:space="preserve">GATE-7: Ingesta Batching y Resiliencia</w:t>
+            </w:r>
+          </w:p>
+        </w:tc>
+        <w:tc>
+          <w:tcPr>
+            <w:tcW w:w="2915" w:type="dxa"/>
+            <w:shd w:val="clear" w:color="auto" w:fill="FFFFFF"/>
+            <w:tcMar>
+              <w:top w:w="70" w:type="dxa"/>
+              <w:left w:w="110" w:type="dxa"/>
+              <w:bottom w:w="70" w:type="dxa"/>
+              <w:right w:w="110" w:type="dxa"/>
+            </w:tcMar>
+            <w:vAlign w:val="center"/>
+          </w:tcPr>
+          <w:p>
+            <w:pPr>
+              <w:spacing w:before="0" w:after="0" w:line="252" w:lineRule="auto"/>
+            </w:pPr>
+            <w:r>
+              <w:rPr>
+                <w:color w:val="17261F"/>
+                <w:sz w:val="17"/>
+                <w:szCs w:val="17"/>
+              </w:rPr>
+              <w:t xml:space="preserve">Worker pool acotado, pgx.Batch 50ms y circuit breaker</w:t>
+            </w:r>
+          </w:p>
+        </w:tc>
+        <w:tc>
+          <w:tcPr>
+            <w:tcW w:w="3251" w:type="dxa"/>
+            <w:shd w:val="clear" w:color="auto" w:fill="FFFFFF"/>
+            <w:tcMar>
+              <w:top w:w="70" w:type="dxa"/>
+              <w:left w:w="110" w:type="dxa"/>
+              <w:bottom w:w="70" w:type="dxa"/>
+              <w:right w:w="110" w:type="dxa"/>
+            </w:tcMar>
+            <w:vAlign w:val="center"/>
+          </w:tcPr>
+          <w:p>
+            <w:pPr>
+              <w:spacing w:before="0" w:after="0" w:line="252" w:lineRule="auto"/>
+            </w:pPr>
+            <w:r>
+              <w:rPr>
+                <w:color w:val="17261F"/>
+                <w:sz w:val="17"/>
+                <w:szCs w:val="17"/>
+              </w:rPr>
+              <w:t xml:space="preserve">Cero saturación de goroutines; 0 stampede</w:t>
+            </w:r>
+          </w:p>
+        </w:tc>
+        <w:tc>
+          <w:tcPr>
+            <w:tcW w:w="978" w:type="dxa"/>
+            <w:shd w:val="clear" w:color="auto" w:fill="FFFFFF"/>
             <w:tcMar>
               <w:top w:w="70" w:type="dxa"/>
               <w:left w:w="110" w:type="dxa"/>
@@ -8854,7 +12707,7 @@
             <w:drawing>
               <wp:inline distT="0" distB="0" distL="0" distR="0">
                 <wp:extent cx="180000" cy="180000"/>
-                <wp:docPr id="125" name="Icono"/>
+                <wp:docPr id="131" name="Icono"/>
                 <wp:cNvGraphicFramePr>
                   <a:graphicFrameLocks noChangeAspect="1"/>
                 </wp:cNvGraphicFramePr>
@@ -8862,7 +12715,7 @@
                   <a:graphicData uri="http://schemas.openxmlformats.org/drawingml/2006/picture">
                     <pic:pic>
                       <pic:nvPicPr>
-                        <pic:cNvPr id="125" name="Icono"/>
+                        <pic:cNvPr id="131" name="Icono"/>
                         <pic:cNvPicPr/>
                       </pic:nvPicPr>
                       <pic:blipFill>

</xml_diff>

<commit_message>
Update QA audit report and regenerate documents with extreme optimizations
</commit_message>
<xml_diff>
--- a/docs/SmartPot_QA_Audit_AB.docx
+++ b/docs/SmartPot_QA_Audit_AB.docx
@@ -1464,16 +1464,32 @@
             <w:sz w:val="18"/>
             <w:szCs w:val="18"/>
           </w:rPr>
-          <w:t xml:space="preserve">6.5 Blindaje y Cuotas de Recursos en Docker (demo-beta/compose.yaml)</w:t>
+          <w:t xml:space="preserve">6.5 Broker EMQX Optimizado (SmartPot-Broker-EMQX)</w:t>
         </w:r>
       </w:hyperlink>
     </w:p>
     <w:p>
       <w:pPr>
+        <w:ind w:left="420"/>
+        <w:spacing w:before="0" w:after="30" w:line="252" w:lineRule="auto"/>
+      </w:pPr>
+      <w:hyperlink w:anchor="sec_130" w:history="1">
+        <w:r>
+          <w:rPr>
+            <w:color w:val="17261F"/>
+            <w:sz w:val="18"/>
+            <w:szCs w:val="18"/>
+          </w:rPr>
+          <w:t xml:space="preserve">6.6 Blindaje y Cuotas de Recursos en Docker (demo-beta/compose.yaml)</w:t>
+        </w:r>
+      </w:hyperlink>
+    </w:p>
+    <w:p>
+      <w:pPr>
         <w:ind w:left="0"/>
         <w:spacing w:before="100" w:after="30" w:line="252" w:lineRule="auto"/>
       </w:pPr>
-      <w:hyperlink w:anchor="sec_130" w:history="1">
+      <w:hyperlink w:anchor="sec_131" w:history="1">
         <w:r>
           <w:rPr>
             <w:b/>
@@ -5878,7 +5894,7 @@
                 <w:sz w:val="17"/>
                 <w:szCs w:val="17"/>
               </w:rPr>
-              <w:t xml:space="preserve">18.2 MB</w:t>
+              <w:t xml:space="preserve">12.2 MB</w:t>
             </w:r>
           </w:p>
         </w:tc>
@@ -5932,7 +5948,7 @@
                 <w:sz w:val="17"/>
                 <w:szCs w:val="17"/>
               </w:rPr>
-              <w:t xml:space="preserve">42.5 MB</w:t>
+              <w:t xml:space="preserve">38.4 MB</w:t>
             </w:r>
           </w:p>
         </w:tc>
@@ -5960,7 +5976,7 @@
                 <w:sz w:val="17"/>
                 <w:szCs w:val="17"/>
               </w:rPr>
-              <w:t xml:space="preserve">-93.1%</w:t>
+              <w:t xml:space="preserve">-96.8%</w:t>
             </w:r>
           </w:p>
         </w:tc>
@@ -6047,7 +6063,7 @@
                 <w:sz w:val="17"/>
                 <w:szCs w:val="17"/>
               </w:rPr>
-              <w:t xml:space="preserve">92.4 MB</w:t>
+              <w:t xml:space="preserve">151.4 MB</w:t>
             </w:r>
           </w:p>
         </w:tc>
@@ -6101,7 +6117,7 @@
                 <w:sz w:val="17"/>
                 <w:szCs w:val="17"/>
               </w:rPr>
-              <w:t xml:space="preserve">165.0 MB</w:t>
+              <w:t xml:space="preserve">172.0 MB</w:t>
             </w:r>
           </w:p>
         </w:tc>
@@ -6129,7 +6145,7 @@
                 <w:sz w:val="17"/>
                 <w:szCs w:val="17"/>
               </w:rPr>
-              <w:t xml:space="preserve">-65.6%</w:t>
+              <w:t xml:space="preserve">-29.6%</w:t>
             </w:r>
           </w:p>
         </w:tc>
@@ -6216,7 +6232,7 @@
                 <w:sz w:val="17"/>
                 <w:szCs w:val="17"/>
               </w:rPr>
-              <w:t xml:space="preserve">118.0 MB</w:t>
+              <w:t xml:space="preserve">193.6 MB</w:t>
             </w:r>
           </w:p>
         </w:tc>
@@ -6270,7 +6286,7 @@
                 <w:sz w:val="17"/>
                 <w:szCs w:val="17"/>
               </w:rPr>
-              <w:t xml:space="preserve">145.0 MB</w:t>
+              <w:t xml:space="preserve">210.0 MB</w:t>
             </w:r>
           </w:p>
         </w:tc>
@@ -6296,7 +6312,7 @@
                 <w:sz w:val="17"/>
                 <w:szCs w:val="17"/>
               </w:rPr>
-              <w:t xml:space="preserve">+408% (BEAM)</w:t>
+              <w:t xml:space="preserve">BEAM VM</w:t>
             </w:r>
           </w:p>
         </w:tc>
@@ -6383,7 +6399,7 @@
                 <w:sz w:val="17"/>
                 <w:szCs w:val="17"/>
               </w:rPr>
-              <w:t xml:space="preserve">8.6 MB</w:t>
+              <w:t xml:space="preserve">3.6 MB</w:t>
             </w:r>
           </w:p>
         </w:tc>
@@ -6437,7 +6453,7 @@
                 <w:sz w:val="17"/>
                 <w:szCs w:val="17"/>
               </w:rPr>
-              <w:t xml:space="preserve">18.1 MB</w:t>
+              <w:t xml:space="preserve">12.5 MB</w:t>
             </w:r>
           </w:p>
         </w:tc>
@@ -6459,11 +6475,13 @@
             </w:pPr>
             <w:r>
               <w:rPr>
-                <w:color w:val="17261F"/>
-                <w:sz w:val="17"/>
-                <w:szCs w:val="17"/>
-              </w:rPr>
-              <w:t xml:space="preserve">Paridad</w:t>
+                <w:b/>
+                <w:bCs/>
+                <w:color w:val="17261F"/>
+                <w:sz w:val="17"/>
+                <w:szCs w:val="17"/>
+              </w:rPr>
+              <w:t xml:space="preserve">-57.6%</w:t>
             </w:r>
           </w:p>
         </w:tc>
@@ -6550,7 +6568,7 @@
                 <w:sz w:val="17"/>
                 <w:szCs w:val="17"/>
               </w:rPr>
-              <w:t xml:space="preserve">14.8 MB</w:t>
+              <w:t xml:space="preserve">1.3 MB</w:t>
             </w:r>
           </w:p>
         </w:tc>
@@ -6604,7 +6622,7 @@
                 <w:sz w:val="17"/>
                 <w:szCs w:val="17"/>
               </w:rPr>
-              <w:t xml:space="preserve">22.0 MB</w:t>
+              <w:t xml:space="preserve">8.2 MB</w:t>
             </w:r>
           </w:p>
         </w:tc>
@@ -6632,7 +6650,7 @@
                 <w:sz w:val="17"/>
                 <w:szCs w:val="17"/>
               </w:rPr>
-              <w:t xml:space="preserve">-84.8%</w:t>
+              <w:t xml:space="preserve">-98.4%</w:t>
             </w:r>
           </w:p>
         </w:tc>
@@ -6719,7 +6737,7 @@
                 <w:sz w:val="17"/>
                 <w:szCs w:val="17"/>
               </w:rPr>
-              <w:t xml:space="preserve">6.1 MB</w:t>
+              <w:t xml:space="preserve">7.6 MB</w:t>
             </w:r>
           </w:p>
         </w:tc>
@@ -6773,7 +6791,7 @@
                 <w:sz w:val="17"/>
                 <w:szCs w:val="17"/>
               </w:rPr>
-              <w:t xml:space="preserve">14.8 MB</w:t>
+              <w:t xml:space="preserve">12.0 MB</w:t>
             </w:r>
           </w:p>
         </w:tc>
@@ -6888,7 +6906,7 @@
                 <w:sz w:val="17"/>
                 <w:szCs w:val="17"/>
               </w:rPr>
-              <w:t xml:space="preserve">~258.1 MB</w:t>
+              <w:t xml:space="preserve">~369.7 MB</w:t>
             </w:r>
           </w:p>
         </w:tc>
@@ -6944,7 +6962,7 @@
                 <w:sz w:val="17"/>
                 <w:szCs w:val="17"/>
               </w:rPr>
-              <w:t xml:space="preserve">~407.4 MB</w:t>
+              <w:t xml:space="preserve">~453.1 MB</w:t>
             </w:r>
           </w:p>
         </w:tc>
@@ -6972,7 +6990,7 @@
                 <w:sz w:val="17"/>
                 <w:szCs w:val="17"/>
               </w:rPr>
-              <w:t xml:space="preserve">-68.8% Global</w:t>
+              <w:t xml:space="preserve">-47.9% Global</w:t>
             </w:r>
           </w:p>
         </w:tc>
@@ -7181,7 +7199,7 @@
                 <w:sz w:val="16"/>
                 <w:szCs w:val="16"/>
               </w:rPr>
-              <w:t xml:space="preserve">  Stack B (Go + TimescaleDB):</w:t>
+              <w:t xml:space="preserve">  Stack B (Go + TimescaleDB + Valkey Series Cache):</w:t>
             </w:r>
           </w:p>
           <w:p>
@@ -7195,7 +7213,7 @@
                 <w:sz w:val="16"/>
                 <w:szCs w:val="16"/>
               </w:rPr>
-              <w:t xml:space="preserve">    p50:  3.2 ms  |  p95: 14.8 ms  |  p99:  28.5 ms  |  Throughput máximo: ~1,450 RPS (4.2x mayor)</w:t>
+              <w:t xml:space="preserve">    p50:  3.4 ms  |  p95: 17.58 ms |  p99:  26.53 ms |  Throughput máximo: ~1,850 RPS (5.4x mayor)</w:t>
             </w:r>
           </w:p>
         </w:tc>
@@ -8205,7 +8223,7 @@
           <w:sz w:val="20"/>
           <w:szCs w:val="20"/>
         </w:rPr>
-        <w:t xml:space="preserve">Índice </w:t>
+        <w:t xml:space="preserve">Índice Cubriente con </w:t>
       </w:r>
       <w:r>
         <w:rPr>
@@ -8216,7 +8234,7 @@
           <w:sz w:val="18"/>
           <w:szCs w:val="18"/>
         </w:rPr>
-        <w:t xml:space="preserve">BRIN</w:t>
+        <w:t xml:space="preserve">INCLUDE</w:t>
       </w:r>
       <w:r>
         <w:rPr>
@@ -8226,7 +8244,28 @@
           <w:sz w:val="20"/>
           <w:szCs w:val="20"/>
         </w:rPr>
-        <w:t xml:space="preserve"> (Block Range Index):</w:t>
+        <w:t xml:space="preserve"> y </w:t>
+      </w:r>
+      <w:r>
+        <w:rPr>
+          <w:rFonts w:ascii="JetBrains Mono" w:hAnsi="JetBrains Mono" w:eastAsia="JetBrains Mono" w:cs="JetBrains Mono"/>
+          <w:b/>
+          <w:bCs/>
+          <w:color w:val="0A5A3C"/>
+          <w:sz w:val="18"/>
+          <w:szCs w:val="18"/>
+        </w:rPr>
+        <w:t xml:space="preserve">BRIN</w:t>
+      </w:r>
+      <w:r>
+        <w:rPr>
+          <w:b/>
+          <w:bCs/>
+          <w:color w:val="17261F"/>
+          <w:sz w:val="20"/>
+          <w:szCs w:val="20"/>
+        </w:rPr>
+        <w:t xml:space="preserve">:</w:t>
       </w:r>
     </w:p>
     <w:p>
@@ -8244,7 +8283,7 @@
           <w:sz w:val="20"/>
           <w:szCs w:val="20"/>
         </w:rPr>
-        <w:t xml:space="preserve">Incorporado índice </w:t>
+        <w:t xml:space="preserve">Incorporado índice cubriente </w:t>
       </w:r>
       <w:r>
         <w:rPr>
@@ -8253,6 +8292,59 @@
           <w:sz w:val="18"/>
           <w:szCs w:val="18"/>
         </w:rPr>
+        <w:t xml:space="preserve">CREATE INDEX readings_crop_measured_covering ON readings (crop_id, measured_at DESC) INCLUDE (temperature, humidity, brightness, ph, tds, atmosphere, soil_moisture);</w:t>
+      </w:r>
+      <w:r>
+        <w:rPr>
+          <w:color w:val="17261F"/>
+          <w:sz w:val="20"/>
+          <w:szCs w:val="20"/>
+        </w:rPr>
+        <w:t xml:space="preserve"> permitiendo </w:t>
+      </w:r>
+      <w:r>
+        <w:rPr>
+          <w:i/>
+          <w:iCs/>
+          <w:color w:val="17261F"/>
+          <w:sz w:val="20"/>
+          <w:szCs w:val="20"/>
+        </w:rPr>
+        <w:t xml:space="preserve">Index-Only Scans</w:t>
+      </w:r>
+      <w:r>
+        <w:rPr>
+          <w:color w:val="17261F"/>
+          <w:sz w:val="20"/>
+          <w:szCs w:val="20"/>
+        </w:rPr>
+        <w:t xml:space="preserve"> masivos sin tocar páginas del heap de tabla.</w:t>
+      </w:r>
+    </w:p>
+    <w:p>
+      <w:pPr>
+        <w:numPr>
+          <w:ilvl w:val="0"/>
+          <w:numId w:val="1"/>
+        </w:numPr>
+        <w:ind w:left="360" w:hanging="260"/>
+        <w:spacing w:before="0" w:after="60" w:line="276" w:lineRule="auto"/>
+      </w:pPr>
+      <w:r>
+        <w:rPr>
+          <w:color w:val="17261F"/>
+          <w:sz w:val="20"/>
+          <w:szCs w:val="20"/>
+        </w:rPr>
+        <w:t xml:space="preserve">Índice </w:t>
+      </w:r>
+      <w:r>
+        <w:rPr>
+          <w:rFonts w:ascii="JetBrains Mono" w:hAnsi="JetBrains Mono" w:eastAsia="JetBrains Mono" w:cs="JetBrains Mono"/>
+          <w:color w:val="0A5A3C"/>
+          <w:sz w:val="18"/>
+          <w:szCs w:val="18"/>
+        </w:rPr>
         <w:t xml:space="preserve">readings_measured_at_brin</w:t>
       </w:r>
       <w:r>
@@ -8261,7 +8353,7 @@
           <w:sz w:val="20"/>
           <w:szCs w:val="20"/>
         </w:rPr>
-        <w:t xml:space="preserve"> para búsquedas en grandes ventanas temporales con un consumo de RAM despreciable en comparación con índices B-Tree tradicionales.</w:t>
+        <w:t xml:space="preserve"> para búsquedas en grandes ventanas temporales con un consumo de RAM despreciable.</w:t>
       </w:r>
     </w:p>
     <w:p>
@@ -8683,7 +8775,28 @@
           <w:sz w:val="20"/>
           <w:szCs w:val="20"/>
         </w:rPr>
-        <w:t xml:space="preserve">Zero-Allocation en Telemetría:</w:t>
+        <w:t xml:space="preserve">Zero-Allocation en Telemetría y Micro-Batching con </w:t>
+      </w:r>
+      <w:r>
+        <w:rPr>
+          <w:rFonts w:ascii="JetBrains Mono" w:hAnsi="JetBrains Mono" w:eastAsia="JetBrains Mono" w:cs="JetBrains Mono"/>
+          <w:b/>
+          <w:bCs/>
+          <w:color w:val="0A5A3C"/>
+          <w:sz w:val="18"/>
+          <w:szCs w:val="18"/>
+        </w:rPr>
+        <w:t xml:space="preserve">sync.Pool</w:t>
+      </w:r>
+      <w:r>
+        <w:rPr>
+          <w:b/>
+          <w:bCs/>
+          <w:color w:val="17261F"/>
+          <w:sz w:val="20"/>
+          <w:szCs w:val="20"/>
+        </w:rPr>
+        <w:t xml:space="preserve">:</w:t>
       </w:r>
     </w:p>
     <w:p>
@@ -8701,7 +8814,7 @@
           <w:sz w:val="20"/>
           <w:szCs w:val="20"/>
         </w:rPr>
-        <w:t xml:space="preserve">Reutilización de estructuras JSON mediante </w:t>
+        <w:t xml:space="preserve">Reutilización de estructuras JSON y slices de lotes mediante </w:t>
       </w:r>
       <w:r>
         <w:rPr>
@@ -8735,7 +8848,24 @@
           <w:sz w:val="20"/>
           <w:szCs w:val="20"/>
         </w:rPr>
-        <w:t xml:space="preserve">) en el camino crítico de parsing de telemetría IoT, eliminando presión sobre el recolector de basura (</w:t>
+        <w:t xml:space="preserve">, </w:t>
+      </w:r>
+      <w:r>
+        <w:rPr>
+          <w:rFonts w:ascii="JetBrains Mono" w:hAnsi="JetBrains Mono" w:eastAsia="JetBrains Mono" w:cs="JetBrains Mono"/>
+          <w:color w:val="0A5A3C"/>
+          <w:sz w:val="18"/>
+          <w:szCs w:val="18"/>
+        </w:rPr>
+        <w:t xml:space="preserve">batchSlicePool</w:t>
+      </w:r>
+      <w:r>
+        <w:rPr>
+          <w:color w:val="17261F"/>
+          <w:sz w:val="20"/>
+          <w:szCs w:val="20"/>
+        </w:rPr>
+        <w:t xml:space="preserve">) en el camino crítico de ingesta IoT, eliminando pausas de recolección de basura (</w:t>
       </w:r>
       <w:r>
         <w:rPr>
@@ -8754,6 +8884,59 @@
           <w:szCs w:val="20"/>
         </w:rPr>
         <w:t xml:space="preserve">).</w:t>
+      </w:r>
+    </w:p>
+    <w:p>
+      <w:pPr>
+        <w:numPr>
+          <w:ilvl w:val="0"/>
+          <w:numId w:val="1"/>
+        </w:numPr>
+        <w:ind w:left="360" w:hanging="260"/>
+        <w:spacing w:before="0" w:after="60" w:line="276" w:lineRule="auto"/>
+      </w:pPr>
+      <w:r>
+        <w:rPr>
+          <w:color w:val="17261F"/>
+          <w:sz w:val="20"/>
+          <w:szCs w:val="20"/>
+        </w:rPr>
+        <w:t xml:space="preserve">Micro-batching ultracorto con ventana temporal de </w:t>
+      </w:r>
+      <w:r>
+        <w:rPr>
+          <w:b/>
+          <w:bCs/>
+          <w:color w:val="17261F"/>
+          <w:sz w:val="20"/>
+          <w:szCs w:val="20"/>
+        </w:rPr>
+        <w:t xml:space="preserve">10 ms</w:t>
+      </w:r>
+      <w:r>
+        <w:rPr>
+          <w:color w:val="17261F"/>
+          <w:sz w:val="20"/>
+          <w:szCs w:val="20"/>
+        </w:rPr>
+        <w:t xml:space="preserve"> o umbral de 100 lecturas con inserción eficiente vía </w:t>
+      </w:r>
+      <w:r>
+        <w:rPr>
+          <w:rFonts w:ascii="JetBrains Mono" w:hAnsi="JetBrains Mono" w:eastAsia="JetBrains Mono" w:cs="JetBrains Mono"/>
+          <w:color w:val="0A5A3C"/>
+          <w:sz w:val="18"/>
+          <w:szCs w:val="18"/>
+        </w:rPr>
+        <w:t xml:space="preserve">pgx.Batch</w:t>
+      </w:r>
+      <w:r>
+        <w:rPr>
+          <w:color w:val="17261F"/>
+          <w:sz w:val="20"/>
+          <w:szCs w:val="20"/>
+        </w:rPr>
+        <w:t xml:space="preserve">.</w:t>
       </w:r>
     </w:p>
     <w:p>
@@ -8773,7 +8956,7 @@
           <w:sz w:val="20"/>
           <w:szCs w:val="20"/>
         </w:rPr>
-        <w:t xml:space="preserve">Ingesta en Lote (</w:t>
+        <w:t xml:space="preserve">Caché en Memoria de Última Lectura (</w:t>
       </w:r>
       <w:r>
         <w:rPr>
@@ -8784,7 +8967,7 @@
           <w:sz w:val="18"/>
           <w:szCs w:val="18"/>
         </w:rPr>
-        <w:t xml:space="preserve">Batching</w:t>
+        <w:t xml:space="preserve">sync.Map</w:t>
       </w:r>
       <w:r>
         <w:rPr>
@@ -8794,28 +8977,7 @@
           <w:sz w:val="20"/>
           <w:szCs w:val="20"/>
         </w:rPr>
-        <w:t xml:space="preserve">) con </w:t>
-      </w:r>
-      <w:r>
-        <w:rPr>
-          <w:rFonts w:ascii="JetBrains Mono" w:hAnsi="JetBrains Mono" w:eastAsia="JetBrains Mono" w:cs="JetBrains Mono"/>
-          <w:b/>
-          <w:bCs/>
-          <w:color w:val="0A5A3C"/>
-          <w:sz w:val="18"/>
-          <w:szCs w:val="18"/>
-        </w:rPr>
-        <w:t xml:space="preserve">pgx.Batch</w:t>
-      </w:r>
-      <w:r>
-        <w:rPr>
-          <w:b/>
-          <w:bCs/>
-          <w:color w:val="17261F"/>
-          <w:sz w:val="20"/>
-          <w:szCs w:val="20"/>
-        </w:rPr>
-        <w:t xml:space="preserve">:</w:t>
+        <w:t xml:space="preserve">):</w:t>
       </w:r>
     </w:p>
     <w:p>
@@ -8833,25 +8995,7 @@
           <w:sz w:val="20"/>
           <w:szCs w:val="20"/>
         </w:rPr>
-        <w:t xml:space="preserve">Buffer asíncrono con </w:t>
-      </w:r>
-      <w:r>
-        <w:rPr>
-          <w:i/>
-          <w:iCs/>
-          <w:color w:val="17261F"/>
-          <w:sz w:val="20"/>
-          <w:szCs w:val="20"/>
-        </w:rPr>
-        <w:t xml:space="preserve">flush</w:t>
-      </w:r>
-      <w:r>
-        <w:rPr>
-          <w:color w:val="17261F"/>
-          <w:sz w:val="20"/>
-          <w:szCs w:val="20"/>
-        </w:rPr>
-        <w:t xml:space="preserve"> por ventana temporal (50 ms) o tamaño de lote (100 lecturas) en </w:t>
+        <w:t xml:space="preserve">Resolución instantánea de </w:t>
       </w:r>
       <w:r>
         <w:rPr>
@@ -8860,50 +9004,15 @@
           <w:sz w:val="18"/>
           <w:szCs w:val="18"/>
         </w:rPr>
-        <w:t xml:space="preserve">internal/readings/service.go</w:t>
-      </w:r>
-      <w:r>
-        <w:rPr>
-          <w:color w:val="17261F"/>
-          <w:sz w:val="20"/>
-          <w:szCs w:val="20"/>
-        </w:rPr>
-        <w:t xml:space="preserve"> e </w:t>
-      </w:r>
-      <w:r>
-        <w:rPr>
-          <w:rFonts w:ascii="JetBrains Mono" w:hAnsi="JetBrains Mono" w:eastAsia="JetBrains Mono" w:cs="JetBrains Mono"/>
-          <w:color w:val="0A5A3C"/>
-          <w:sz w:val="18"/>
-          <w:szCs w:val="18"/>
-        </w:rPr>
-        <w:t xml:space="preserve">internal/storage/postgres/readings.go</w:t>
-      </w:r>
-      <w:r>
-        <w:rPr>
-          <w:color w:val="17261F"/>
-          <w:sz w:val="20"/>
-          <w:szCs w:val="20"/>
-        </w:rPr>
-        <w:t xml:space="preserve">, reduciendo en un </w:t>
-      </w:r>
-      <w:r>
-        <w:rPr>
-          <w:b/>
-          <w:bCs/>
-          <w:color w:val="17261F"/>
-          <w:sz w:val="20"/>
-          <w:szCs w:val="20"/>
-        </w:rPr>
-        <w:t xml:space="preserve">85%</w:t>
-      </w:r>
-      <w:r>
-        <w:rPr>
-          <w:color w:val="17261F"/>
-          <w:sz w:val="20"/>
-          <w:szCs w:val="20"/>
-        </w:rPr>
-        <w:t xml:space="preserve"> los viajes de red hacia PostgreSQL (manteniendo inserción síncrona inmediata en peticiones HTTP manuales).</w:t>
+        <w:t xml:space="preserve">GET /api/v1/crops/{id}/readings/latest</w:t>
+      </w:r>
+      <w:r>
+        <w:rPr>
+          <w:color w:val="17261F"/>
+          <w:sz w:val="20"/>
+          <w:szCs w:val="20"/>
+        </w:rPr>
+        <w:t xml:space="preserve"> directamente de memoria (&lt; 0.1 ms), garantizando cero retraso perceptible sin depender del flush del batch hacia la base de datos.</w:t>
       </w:r>
     </w:p>
     <w:p>
@@ -8923,28 +9032,7 @@
           <w:sz w:val="20"/>
           <w:szCs w:val="20"/>
         </w:rPr>
-        <w:t xml:space="preserve">Resiliencia hacia </w:t>
-      </w:r>
-      <w:r>
-        <w:rPr>
-          <w:rFonts w:ascii="JetBrains Mono" w:hAnsi="JetBrains Mono" w:eastAsia="JetBrains Mono" w:cs="JetBrains Mono"/>
-          <w:b/>
-          <w:bCs/>
-          <w:color w:val="0A5A3C"/>
-          <w:sz w:val="18"/>
-          <w:szCs w:val="18"/>
-        </w:rPr>
-        <w:t xml:space="preserve">smartpot-ai</w:t>
-      </w:r>
-      <w:r>
-        <w:rPr>
-          <w:b/>
-          <w:bCs/>
-          <w:color w:val="17261F"/>
-          <w:sz w:val="20"/>
-          <w:szCs w:val="20"/>
-        </w:rPr>
-        <w:t xml:space="preserve">:</w:t>
+        <w:t xml:space="preserve">Caché Inteligente de Autenticación de Dispositivos e Invalidación Reactiva:</w:t>
       </w:r>
     </w:p>
     <w:p>
@@ -8962,7 +9050,7 @@
           <w:sz w:val="20"/>
           <w:szCs w:val="20"/>
         </w:rPr>
-        <w:t xml:space="preserve">Implementados en </w:t>
+        <w:t xml:space="preserve">Endpoint </w:t>
       </w:r>
       <w:r>
         <w:rPr>
@@ -8971,87 +9059,66 @@
           <w:sz w:val="18"/>
           <w:szCs w:val="18"/>
         </w:rPr>
-        <w:t xml:space="preserve">internal/ai/resilience.go</w:t>
-      </w:r>
-      <w:r>
-        <w:rPr>
-          <w:color w:val="17261F"/>
-          <w:sz w:val="20"/>
-          <w:szCs w:val="20"/>
-        </w:rPr>
-        <w:t xml:space="preserve">: </w:t>
-      </w:r>
-      <w:r>
-        <w:rPr>
-          <w:b/>
-          <w:bCs/>
-          <w:color w:val="17261F"/>
-          <w:sz w:val="20"/>
-          <w:szCs w:val="20"/>
-        </w:rPr>
-        <w:t xml:space="preserve">Circuit Breaker</w:t>
-      </w:r>
-      <w:r>
-        <w:rPr>
-          <w:color w:val="17261F"/>
-          <w:sz w:val="20"/>
-          <w:szCs w:val="20"/>
-        </w:rPr>
-        <w:t xml:space="preserve"> (umbral de 5 fallos, 10s cooldown), </w:t>
-      </w:r>
-      <w:r>
-        <w:rPr>
-          <w:b/>
-          <w:bCs/>
-          <w:color w:val="17261F"/>
-          <w:sz w:val="20"/>
-          <w:szCs w:val="20"/>
-        </w:rPr>
-        <w:t xml:space="preserve">Retry con Exponential Backoff y Jitter</w:t>
-      </w:r>
-      <w:r>
-        <w:rPr>
-          <w:color w:val="17261F"/>
-          <w:sz w:val="20"/>
-          <w:szCs w:val="20"/>
-        </w:rPr>
-        <w:t xml:space="preserve"> para errores 502/503/504, y </w:t>
-      </w:r>
-      <w:r>
-        <w:rPr>
-          <w:b/>
-          <w:bCs/>
-          <w:color w:val="17261F"/>
-          <w:sz w:val="20"/>
-          <w:szCs w:val="20"/>
-        </w:rPr>
-        <w:t xml:space="preserve">Singleflight</w:t>
-      </w:r>
-      <w:r>
-        <w:rPr>
-          <w:color w:val="17261F"/>
-          <w:sz w:val="20"/>
-          <w:szCs w:val="20"/>
-        </w:rPr>
-        <w:t xml:space="preserve"> para evitar </w:t>
-      </w:r>
-      <w:r>
-        <w:rPr>
-          <w:i/>
-          <w:iCs/>
-          <w:color w:val="17261F"/>
-          <w:sz w:val="20"/>
-          <w:szCs w:val="20"/>
-        </w:rPr>
-        <w:t xml:space="preserve">Cache Stampede</w:t>
-      </w:r>
-      <w:r>
-        <w:rPr>
-          <w:color w:val="17261F"/>
-          <w:sz w:val="20"/>
-          <w:szCs w:val="20"/>
-        </w:rPr>
-        <w:t xml:space="preserve"> sobre modelos de IA en arranques en frío.</w:t>
+        <w:t xml:space="preserve">/internal/mqtt/authn</w:t>
+      </w:r>
+      <w:r>
+        <w:rPr>
+          <w:color w:val="17261F"/>
+          <w:sz w:val="20"/>
+          <w:szCs w:val="20"/>
+        </w:rPr>
+        <w:t xml:space="preserve"> acelerado con clave de dispositivo en caché Valkey (</w:t>
+      </w:r>
+      <w:r>
+        <w:rPr>
+          <w:rFonts w:ascii="JetBrains Mono" w:hAnsi="JetBrains Mono" w:eastAsia="JetBrains Mono" w:cs="JetBrains Mono"/>
+          <w:color w:val="0A5A3C"/>
+          <w:sz w:val="18"/>
+          <w:szCs w:val="18"/>
+        </w:rPr>
+        <w:t xml:space="preserve">crop:key:{id}</w:t>
+      </w:r>
+      <w:r>
+        <w:rPr>
+          <w:color w:val="17261F"/>
+          <w:sz w:val="20"/>
+          <w:szCs w:val="20"/>
+        </w:rPr>
+        <w:t xml:space="preserve">) por 5 minutos, con invalidación atómica y corte de sesiones ante eventos </w:t>
+      </w:r>
+      <w:r>
+        <w:rPr>
+          <w:rFonts w:ascii="JetBrains Mono" w:hAnsi="JetBrains Mono" w:eastAsia="JetBrains Mono" w:cs="JetBrains Mono"/>
+          <w:color w:val="0A5A3C"/>
+          <w:sz w:val="18"/>
+          <w:szCs w:val="18"/>
+        </w:rPr>
+        <w:t xml:space="preserve">crops.DeletedEvent</w:t>
+      </w:r>
+      <w:r>
+        <w:rPr>
+          <w:color w:val="17261F"/>
+          <w:sz w:val="20"/>
+          <w:szCs w:val="20"/>
+        </w:rPr>
+        <w:t xml:space="preserve"> y </w:t>
+      </w:r>
+      <w:r>
+        <w:rPr>
+          <w:rFonts w:ascii="JetBrains Mono" w:hAnsi="JetBrains Mono" w:eastAsia="JetBrains Mono" w:cs="JetBrains Mono"/>
+          <w:color w:val="0A5A3C"/>
+          <w:sz w:val="18"/>
+          <w:szCs w:val="18"/>
+        </w:rPr>
+        <w:t xml:space="preserve">crops.DeviceKeyRotatedEvent</w:t>
+      </w:r>
+      <w:r>
+        <w:rPr>
+          <w:color w:val="17261F"/>
+          <w:sz w:val="20"/>
+          <w:szCs w:val="20"/>
+        </w:rPr>
+        <w:t xml:space="preserve">.</w:t>
       </w:r>
     </w:p>
     <w:p>
@@ -9071,7 +9138,28 @@
           <w:sz w:val="20"/>
           <w:szCs w:val="20"/>
         </w:rPr>
-        <w:t xml:space="preserve">Valkey RESP3 y Rate Limiting Atómico en Lua:</w:t>
+        <w:t xml:space="preserve">Caché de Series Horarias y Resiliencia hacia </w:t>
+      </w:r>
+      <w:r>
+        <w:rPr>
+          <w:rFonts w:ascii="JetBrains Mono" w:hAnsi="JetBrains Mono" w:eastAsia="JetBrains Mono" w:cs="JetBrains Mono"/>
+          <w:b/>
+          <w:bCs/>
+          <w:color w:val="0A5A3C"/>
+          <w:sz w:val="18"/>
+          <w:szCs w:val="18"/>
+        </w:rPr>
+        <w:t xml:space="preserve">smartpot-ai</w:t>
+      </w:r>
+      <w:r>
+        <w:rPr>
+          <w:b/>
+          <w:bCs/>
+          <w:color w:val="17261F"/>
+          <w:sz w:val="20"/>
+          <w:szCs w:val="20"/>
+        </w:rPr>
+        <w:t xml:space="preserve">:</w:t>
       </w:r>
     </w:p>
     <w:p>
@@ -9089,7 +9177,7 @@
           <w:sz w:val="20"/>
           <w:szCs w:val="20"/>
         </w:rPr>
-        <w:t xml:space="preserve">Conexión migrada a protocolo nativo RESP3 y conteo atómico de ventanas deslizantes en un único script Lua (</w:t>
+        <w:t xml:space="preserve">Respuestas de series calculadas (</w:t>
       </w:r>
       <w:r>
         <w:rPr>
@@ -9098,15 +9186,122 @@
           <w:sz w:val="18"/>
           <w:szCs w:val="18"/>
         </w:rPr>
-        <w:t xml:space="preserve">incrWithTTLScript</w:t>
-      </w:r>
-      <w:r>
-        <w:rPr>
-          <w:color w:val="17261F"/>
-          <w:sz w:val="20"/>
-          <w:szCs w:val="20"/>
-        </w:rPr>
-        <w:t xml:space="preserve">), eliminando condiciones de carrera y fugas de claves sin TTL.</w:t>
+        <w:t xml:space="preserve">smartpot:series:...</w:t>
+      </w:r>
+      <w:r>
+        <w:rPr>
+          <w:color w:val="17261F"/>
+          <w:sz w:val="20"/>
+          <w:szCs w:val="20"/>
+        </w:rPr>
+        <w:t xml:space="preserve">) cacheadas en Valkey (TTL 60s) con fallback local.</w:t>
+      </w:r>
+    </w:p>
+    <w:p>
+      <w:pPr>
+        <w:numPr>
+          <w:ilvl w:val="0"/>
+          <w:numId w:val="1"/>
+        </w:numPr>
+        <w:ind w:left="360" w:hanging="260"/>
+        <w:spacing w:before="0" w:after="60" w:line="276" w:lineRule="auto"/>
+      </w:pPr>
+      <w:r>
+        <w:rPr>
+          <w:color w:val="17261F"/>
+          <w:sz w:val="20"/>
+          <w:szCs w:val="20"/>
+        </w:rPr>
+        <w:t xml:space="preserve">Evaluación de diagnósticos (</w:t>
+      </w:r>
+      <w:r>
+        <w:rPr>
+          <w:rFonts w:ascii="JetBrains Mono" w:hAnsi="JetBrains Mono" w:eastAsia="JetBrains Mono" w:cs="JetBrains Mono"/>
+          <w:color w:val="0A5A3C"/>
+          <w:sz w:val="18"/>
+          <w:szCs w:val="18"/>
+        </w:rPr>
+        <w:t xml:space="preserve">smartpot:insights:...</w:t>
+      </w:r>
+      <w:r>
+        <w:rPr>
+          <w:color w:val="17261F"/>
+          <w:sz w:val="20"/>
+          <w:szCs w:val="20"/>
+        </w:rPr>
+        <w:t xml:space="preserve">) cacheada en Valkey y protegida con </w:t>
+      </w:r>
+      <w:r>
+        <w:rPr>
+          <w:b/>
+          <w:bCs/>
+          <w:color w:val="17261F"/>
+          <w:sz w:val="20"/>
+          <w:szCs w:val="20"/>
+        </w:rPr>
+        <w:t xml:space="preserve">Singleflight</w:t>
+      </w:r>
+      <w:r>
+        <w:rPr>
+          <w:color w:val="17261F"/>
+          <w:sz w:val="20"/>
+          <w:szCs w:val="20"/>
+        </w:rPr>
+        <w:t xml:space="preserve">, </w:t>
+      </w:r>
+      <w:r>
+        <w:rPr>
+          <w:b/>
+          <w:bCs/>
+          <w:color w:val="17261F"/>
+          <w:sz w:val="20"/>
+          <w:szCs w:val="20"/>
+        </w:rPr>
+        <w:t xml:space="preserve">Circuit Breaker</w:t>
+      </w:r>
+      <w:r>
+        <w:rPr>
+          <w:color w:val="17261F"/>
+          <w:sz w:val="20"/>
+          <w:szCs w:val="20"/>
+        </w:rPr>
+        <w:t xml:space="preserve"> (umbral 5 fallos, 10s cooldown) y </w:t>
+      </w:r>
+      <w:r>
+        <w:rPr>
+          <w:b/>
+          <w:bCs/>
+          <w:color w:val="17261F"/>
+          <w:sz w:val="20"/>
+          <w:szCs w:val="20"/>
+        </w:rPr>
+        <w:t xml:space="preserve">Exponential Backoff con Jitter</w:t>
+      </w:r>
+      <w:r>
+        <w:rPr>
+          <w:color w:val="17261F"/>
+          <w:sz w:val="20"/>
+          <w:szCs w:val="20"/>
+        </w:rPr>
+        <w:t xml:space="preserve"> para evitar </w:t>
+      </w:r>
+      <w:r>
+        <w:rPr>
+          <w:i/>
+          <w:iCs/>
+          <w:color w:val="17261F"/>
+          <w:sz w:val="20"/>
+          <w:szCs w:val="20"/>
+        </w:rPr>
+        <w:t xml:space="preserve">Cache Stampede</w:t>
+      </w:r>
+      <w:r>
+        <w:rPr>
+          <w:color w:val="17261F"/>
+          <w:sz w:val="20"/>
+          <w:szCs w:val="20"/>
+        </w:rPr>
+        <w:t xml:space="preserve">.</w:t>
       </w:r>
     </w:p>
     <w:p>
@@ -9126,7 +9321,7 @@
           <w:sz w:val="20"/>
           <w:szCs w:val="20"/>
         </w:rPr>
-        <w:t xml:space="preserve">Trazabilidad Unificada:</w:t>
+        <w:t xml:space="preserve">Valkey RESP3 y Rate Limiting Atómico en Lua:</w:t>
       </w:r>
     </w:p>
     <w:p>
@@ -9144,7 +9339,7 @@
           <w:sz w:val="20"/>
           <w:szCs w:val="20"/>
         </w:rPr>
-        <w:t xml:space="preserve">Propagación y reflejo automático de </w:t>
+        <w:t xml:space="preserve">Conexión migrada a protocolo nativo RESP3 y conteo atómico de ventanas deslizantes en un único script Lua (</w:t>
       </w:r>
       <w:r>
         <w:rPr>
@@ -9153,62 +9348,16 @@
           <w:sz w:val="18"/>
           <w:szCs w:val="18"/>
         </w:rPr>
-        <w:t xml:space="preserve">X-Request-ID</w:t>
-      </w:r>
-      <w:r>
-        <w:rPr>
-          <w:color w:val="17261F"/>
-          <w:sz w:val="20"/>
-          <w:szCs w:val="20"/>
-        </w:rPr>
-        <w:t xml:space="preserve"> en todas las cabeceras de respuesta HTTP.</w:t>
-      </w:r>
-    </w:p>
-    <w:p>
-      <w:pPr>
-        <w:spacing w:before="40" w:after="0" w:line="240" w:lineRule="auto"/>
-        <w:rPr>
-          <w:sz w:val="8"/>
-        </w:rPr>
-      </w:pPr>
-    </w:p>
-    <w:p>
-      <w:pPr>
-        <w:pStyle w:val="Heading2"/>
-      </w:pPr>
-      <w:bookmarkStart w:id="127" w:name="sec_127"/>
-      <w:r>
-        <w:rPr>
-          <w:b/>
-          <w:bCs/>
-          <w:color w:val="067A52"/>
-          <w:sz w:val="25"/>
-          <w:szCs w:val="25"/>
-        </w:rPr>
-        <w:t xml:space="preserve">6.3 Simulador Físico Ultrarrápido (</w:t>
-      </w:r>
-      <w:r>
-        <w:rPr>
-          <w:rFonts w:ascii="JetBrains Mono" w:hAnsi="JetBrains Mono" w:eastAsia="JetBrains Mono" w:cs="JetBrains Mono"/>
-          <w:b/>
-          <w:bCs/>
-          <w:color w:val="0A5A3C"/>
-          <w:sz w:val="23"/>
-          <w:szCs w:val="23"/>
-        </w:rPr>
-        <w:t xml:space="preserve">SmartPot-DataGenerator-Rust</w:t>
-      </w:r>
-      <w:r>
-        <w:rPr>
-          <w:b/>
-          <w:bCs/>
-          <w:color w:val="067A52"/>
-          <w:sz w:val="25"/>
-          <w:szCs w:val="25"/>
-        </w:rPr>
-        <w:t xml:space="preserve">)</w:t>
-      </w:r>
-      <w:bookmarkEnd w:id="127"/>
+        <w:t xml:space="preserve">incrWithTTLScript</w:t>
+      </w:r>
+      <w:r>
+        <w:rPr>
+          <w:color w:val="17261F"/>
+          <w:sz w:val="20"/>
+          <w:szCs w:val="20"/>
+        </w:rPr>
+        <w:t xml:space="preserve">), eliminando condiciones de carrera.</w:t>
+      </w:r>
     </w:p>
     <w:p>
       <w:pPr>
@@ -9227,7 +9376,7 @@
           <w:sz w:val="20"/>
           <w:szCs w:val="20"/>
         </w:rPr>
-        <w:t xml:space="preserve">Perfil de Compilación Cercano al Metal:</w:t>
+        <w:t xml:space="preserve">Trazabilidad Unificada:</w:t>
       </w:r>
     </w:p>
     <w:p>
@@ -9245,7 +9394,7 @@
           <w:sz w:val="20"/>
           <w:szCs w:val="20"/>
         </w:rPr>
-        <w:t xml:space="preserve">Configurado </w:t>
+        <w:t xml:space="preserve">Propagación y reflejo automático de </w:t>
       </w:r>
       <w:r>
         <w:rPr>
@@ -9254,101 +9403,62 @@
           <w:sz w:val="18"/>
           <w:szCs w:val="18"/>
         </w:rPr>
-        <w:t xml:space="preserve">[profile.release]</w:t>
-      </w:r>
-      <w:r>
-        <w:rPr>
-          <w:color w:val="17261F"/>
-          <w:sz w:val="20"/>
-          <w:szCs w:val="20"/>
-        </w:rPr>
-        <w:t xml:space="preserve"> con </w:t>
-      </w:r>
-      <w:r>
-        <w:rPr>
-          <w:rFonts w:ascii="JetBrains Mono" w:hAnsi="JetBrains Mono" w:eastAsia="JetBrains Mono" w:cs="JetBrains Mono"/>
-          <w:color w:val="0A5A3C"/>
-          <w:sz w:val="18"/>
-          <w:szCs w:val="18"/>
-        </w:rPr>
-        <w:t xml:space="preserve">opt-level = 3</w:t>
-      </w:r>
-      <w:r>
-        <w:rPr>
-          <w:color w:val="17261F"/>
-          <w:sz w:val="20"/>
-          <w:szCs w:val="20"/>
-        </w:rPr>
-        <w:t xml:space="preserve">, </w:t>
-      </w:r>
-      <w:r>
-        <w:rPr>
-          <w:rFonts w:ascii="JetBrains Mono" w:hAnsi="JetBrains Mono" w:eastAsia="JetBrains Mono" w:cs="JetBrains Mono"/>
-          <w:color w:val="0A5A3C"/>
-          <w:sz w:val="18"/>
-          <w:szCs w:val="18"/>
-        </w:rPr>
-        <w:t xml:space="preserve">lto = "fat"</w:t>
-      </w:r>
-      <w:r>
-        <w:rPr>
-          <w:color w:val="17261F"/>
-          <w:sz w:val="20"/>
-          <w:szCs w:val="20"/>
-        </w:rPr>
-        <w:t xml:space="preserve">, </w:t>
-      </w:r>
-      <w:r>
-        <w:rPr>
-          <w:rFonts w:ascii="JetBrains Mono" w:hAnsi="JetBrains Mono" w:eastAsia="JetBrains Mono" w:cs="JetBrains Mono"/>
-          <w:color w:val="0A5A3C"/>
-          <w:sz w:val="18"/>
-          <w:szCs w:val="18"/>
-        </w:rPr>
-        <w:t xml:space="preserve">codegen-units = 1</w:t>
-      </w:r>
-      <w:r>
-        <w:rPr>
-          <w:color w:val="17261F"/>
-          <w:sz w:val="20"/>
-          <w:szCs w:val="20"/>
-        </w:rPr>
-        <w:t xml:space="preserve">, </w:t>
-      </w:r>
-      <w:r>
-        <w:rPr>
-          <w:rFonts w:ascii="JetBrains Mono" w:hAnsi="JetBrains Mono" w:eastAsia="JetBrains Mono" w:cs="JetBrains Mono"/>
-          <w:color w:val="0A5A3C"/>
-          <w:sz w:val="18"/>
-          <w:szCs w:val="18"/>
-        </w:rPr>
-        <w:t xml:space="preserve">panic = "abort"</w:t>
-      </w:r>
-      <w:r>
-        <w:rPr>
-          <w:color w:val="17261F"/>
-          <w:sz w:val="20"/>
-          <w:szCs w:val="20"/>
-        </w:rPr>
-        <w:t xml:space="preserve"> y </w:t>
-      </w:r>
-      <w:r>
-        <w:rPr>
-          <w:rFonts w:ascii="JetBrains Mono" w:hAnsi="JetBrains Mono" w:eastAsia="JetBrains Mono" w:cs="JetBrains Mono"/>
-          <w:color w:val="0A5A3C"/>
-          <w:sz w:val="18"/>
-          <w:szCs w:val="18"/>
-        </w:rPr>
-        <w:t xml:space="preserve">strip = "symbols"</w:t>
-      </w:r>
-      <w:r>
-        <w:rPr>
-          <w:color w:val="17261F"/>
-          <w:sz w:val="20"/>
-          <w:szCs w:val="20"/>
-        </w:rPr>
-        <w:t xml:space="preserve">.</w:t>
-      </w:r>
+        <w:t xml:space="preserve">X-Request-ID</w:t>
+      </w:r>
+      <w:r>
+        <w:rPr>
+          <w:color w:val="17261F"/>
+          <w:sz w:val="20"/>
+          <w:szCs w:val="20"/>
+        </w:rPr>
+        <w:t xml:space="preserve"> en todas las cabeceras de respuesta HTTP.</w:t>
+      </w:r>
+    </w:p>
+    <w:p>
+      <w:pPr>
+        <w:spacing w:before="40" w:after="0" w:line="240" w:lineRule="auto"/>
+        <w:rPr>
+          <w:sz w:val="8"/>
+        </w:rPr>
+      </w:pPr>
+    </w:p>
+    <w:p>
+      <w:pPr>
+        <w:pStyle w:val="Heading2"/>
+      </w:pPr>
+      <w:bookmarkStart w:id="127" w:name="sec_127"/>
+      <w:r>
+        <w:rPr>
+          <w:b/>
+          <w:bCs/>
+          <w:color w:val="067A52"/>
+          <w:sz w:val="25"/>
+          <w:szCs w:val="25"/>
+        </w:rPr>
+        <w:t xml:space="preserve">6.3 Simulador Físico Ultrarrápido (</w:t>
+      </w:r>
+      <w:r>
+        <w:rPr>
+          <w:rFonts w:ascii="JetBrains Mono" w:hAnsi="JetBrains Mono" w:eastAsia="JetBrains Mono" w:cs="JetBrains Mono"/>
+          <w:b/>
+          <w:bCs/>
+          <w:color w:val="0A5A3C"/>
+          <w:sz w:val="23"/>
+          <w:szCs w:val="23"/>
+        </w:rPr>
+        <w:t xml:space="preserve">SmartPot-DataGenerator-Rust</w:t>
+      </w:r>
+      <w:r>
+        <w:rPr>
+          <w:b/>
+          <w:bCs/>
+          <w:color w:val="067A52"/>
+          <w:sz w:val="25"/>
+          <w:szCs w:val="25"/>
+        </w:rPr>
+        <w:t xml:space="preserve">)</w:t>
+      </w:r>
+      <w:bookmarkEnd w:id="127"/>
     </w:p>
     <w:p>
       <w:pPr>
@@ -9367,7 +9477,7 @@
           <w:sz w:val="20"/>
           <w:szCs w:val="20"/>
         </w:rPr>
-        <w:t xml:space="preserve">Despacho Concurrente Asíncrono:</w:t>
+        <w:t xml:space="preserve">Perfil de Compilación Cercano al Metal:</w:t>
       </w:r>
     </w:p>
     <w:p>
@@ -9385,7 +9495,7 @@
           <w:sz w:val="20"/>
           <w:szCs w:val="20"/>
         </w:rPr>
-        <w:t xml:space="preserve">Bucle principal refactorizado con </w:t>
+        <w:t xml:space="preserve">Configurado </w:t>
       </w:r>
       <w:r>
         <w:rPr>
@@ -9394,15 +9504,15 @@
           <w:sz w:val="18"/>
           <w:szCs w:val="18"/>
         </w:rPr>
-        <w:t xml:space="preserve">tokio::spawn</w:t>
-      </w:r>
-      <w:r>
-        <w:rPr>
-          <w:color w:val="17261F"/>
-          <w:sz w:val="20"/>
-          <w:szCs w:val="20"/>
-        </w:rPr>
-        <w:t xml:space="preserve"> y </w:t>
+        <w:t xml:space="preserve">[profile.release]</w:t>
+      </w:r>
+      <w:r>
+        <w:rPr>
+          <w:color w:val="17261F"/>
+          <w:sz w:val="20"/>
+          <w:szCs w:val="20"/>
+        </w:rPr>
+        <w:t xml:space="preserve"> con </w:t>
       </w:r>
       <w:r>
         <w:rPr>
@@ -9411,62 +9521,84 @@
           <w:sz w:val="18"/>
           <w:szCs w:val="18"/>
         </w:rPr>
-        <w:t xml:space="preserve">futures_util::future::join_all</w:t>
-      </w:r>
-      <w:r>
-        <w:rPr>
-          <w:color w:val="17261F"/>
-          <w:sz w:val="20"/>
-          <w:szCs w:val="20"/>
-        </w:rPr>
-        <w:t xml:space="preserve"> para paralelizar el ciclo de inferencia física y despacho MQTT de todos los cultivos virtuales sin contención.</w:t>
-      </w:r>
-    </w:p>
-    <w:p>
-      <w:pPr>
-        <w:spacing w:before="40" w:after="0" w:line="240" w:lineRule="auto"/>
-        <w:rPr>
-          <w:sz w:val="8"/>
-        </w:rPr>
-      </w:pPr>
-    </w:p>
-    <w:p>
-      <w:pPr>
-        <w:pStyle w:val="Heading2"/>
-      </w:pPr>
-      <w:bookmarkStart w:id="128" w:name="sec_128"/>
-      <w:r>
-        <w:rPr>
-          <w:b/>
-          <w:bCs/>
-          <w:color w:val="067A52"/>
-          <w:sz w:val="25"/>
-          <w:szCs w:val="25"/>
-        </w:rPr>
-        <w:t xml:space="preserve">6.4 Servidor de Borde y Frontend Reactivo (</w:t>
-      </w:r>
-      <w:r>
-        <w:rPr>
-          <w:rFonts w:ascii="JetBrains Mono" w:hAnsi="JetBrains Mono" w:eastAsia="JetBrains Mono" w:cs="JetBrains Mono"/>
-          <w:b/>
-          <w:bCs/>
-          <w:color w:val="0A5A3C"/>
-          <w:sz w:val="23"/>
-          <w:szCs w:val="23"/>
-        </w:rPr>
-        <w:t xml:space="preserve">SmartPot-Web-Solid</w:t>
-      </w:r>
-      <w:r>
-        <w:rPr>
-          <w:b/>
-          <w:bCs/>
-          <w:color w:val="067A52"/>
-          <w:sz w:val="25"/>
-          <w:szCs w:val="25"/>
-        </w:rPr>
-        <w:t xml:space="preserve">)</w:t>
-      </w:r>
-      <w:bookmarkEnd w:id="128"/>
+        <w:t xml:space="preserve">opt-level = 3</w:t>
+      </w:r>
+      <w:r>
+        <w:rPr>
+          <w:color w:val="17261F"/>
+          <w:sz w:val="20"/>
+          <w:szCs w:val="20"/>
+        </w:rPr>
+        <w:t xml:space="preserve">, </w:t>
+      </w:r>
+      <w:r>
+        <w:rPr>
+          <w:rFonts w:ascii="JetBrains Mono" w:hAnsi="JetBrains Mono" w:eastAsia="JetBrains Mono" w:cs="JetBrains Mono"/>
+          <w:color w:val="0A5A3C"/>
+          <w:sz w:val="18"/>
+          <w:szCs w:val="18"/>
+        </w:rPr>
+        <w:t xml:space="preserve">lto = "fat"</w:t>
+      </w:r>
+      <w:r>
+        <w:rPr>
+          <w:color w:val="17261F"/>
+          <w:sz w:val="20"/>
+          <w:szCs w:val="20"/>
+        </w:rPr>
+        <w:t xml:space="preserve">, </w:t>
+      </w:r>
+      <w:r>
+        <w:rPr>
+          <w:rFonts w:ascii="JetBrains Mono" w:hAnsi="JetBrains Mono" w:eastAsia="JetBrains Mono" w:cs="JetBrains Mono"/>
+          <w:color w:val="0A5A3C"/>
+          <w:sz w:val="18"/>
+          <w:szCs w:val="18"/>
+        </w:rPr>
+        <w:t xml:space="preserve">codegen-units = 1</w:t>
+      </w:r>
+      <w:r>
+        <w:rPr>
+          <w:color w:val="17261F"/>
+          <w:sz w:val="20"/>
+          <w:szCs w:val="20"/>
+        </w:rPr>
+        <w:t xml:space="preserve">, </w:t>
+      </w:r>
+      <w:r>
+        <w:rPr>
+          <w:rFonts w:ascii="JetBrains Mono" w:hAnsi="JetBrains Mono" w:eastAsia="JetBrains Mono" w:cs="JetBrains Mono"/>
+          <w:color w:val="0A5A3C"/>
+          <w:sz w:val="18"/>
+          <w:szCs w:val="18"/>
+        </w:rPr>
+        <w:t xml:space="preserve">panic = "abort"</w:t>
+      </w:r>
+      <w:r>
+        <w:rPr>
+          <w:color w:val="17261F"/>
+          <w:sz w:val="20"/>
+          <w:szCs w:val="20"/>
+        </w:rPr>
+        <w:t xml:space="preserve"> y </w:t>
+      </w:r>
+      <w:r>
+        <w:rPr>
+          <w:rFonts w:ascii="JetBrains Mono" w:hAnsi="JetBrains Mono" w:eastAsia="JetBrains Mono" w:cs="JetBrains Mono"/>
+          <w:color w:val="0A5A3C"/>
+          <w:sz w:val="18"/>
+          <w:szCs w:val="18"/>
+        </w:rPr>
+        <w:t xml:space="preserve">strip = "symbols"</w:t>
+      </w:r>
+      <w:r>
+        <w:rPr>
+          <w:color w:val="17261F"/>
+          <w:sz w:val="20"/>
+          <w:szCs w:val="20"/>
+        </w:rPr>
+        <w:t xml:space="preserve">.</w:t>
+      </w:r>
     </w:p>
     <w:p>
       <w:pPr>
@@ -9485,7 +9617,7 @@
           <w:sz w:val="20"/>
           <w:szCs w:val="20"/>
         </w:rPr>
-        <w:t xml:space="preserve">Pre-compresión Estática Gzip (Nivel 9):</w:t>
+        <w:t xml:space="preserve">Despacho Concurrente Asíncrono:</w:t>
       </w:r>
     </w:p>
     <w:p>
@@ -9503,7 +9635,7 @@
           <w:sz w:val="20"/>
           <w:szCs w:val="20"/>
         </w:rPr>
-        <w:t xml:space="preserve">Script automatizado </w:t>
+        <w:t xml:space="preserve">Bucle principal refactorizado con </w:t>
       </w:r>
       <w:r>
         <w:rPr>
@@ -9512,15 +9644,15 @@
           <w:sz w:val="18"/>
           <w:szCs w:val="18"/>
         </w:rPr>
-        <w:t xml:space="preserve">scripts/compress-assets.mjs</w:t>
-      </w:r>
-      <w:r>
-        <w:rPr>
-          <w:color w:val="17261F"/>
-          <w:sz w:val="20"/>
-          <w:szCs w:val="20"/>
-        </w:rPr>
-        <w:t xml:space="preserve"> que genera activos pre-comprimidos </w:t>
+        <w:t xml:space="preserve">tokio::spawn</w:t>
+      </w:r>
+      <w:r>
+        <w:rPr>
+          <w:color w:val="17261F"/>
+          <w:sz w:val="20"/>
+          <w:szCs w:val="20"/>
+        </w:rPr>
+        <w:t xml:space="preserve"> y </w:t>
       </w:r>
       <w:r>
         <w:rPr>
@@ -9529,16 +9661,62 @@
           <w:sz w:val="18"/>
           <w:szCs w:val="18"/>
         </w:rPr>
-        <w:t xml:space="preserve">.gz</w:t>
-      </w:r>
-      <w:r>
-        <w:rPr>
-          <w:color w:val="17261F"/>
-          <w:sz w:val="20"/>
-          <w:szCs w:val="20"/>
-        </w:rPr>
-        <w:t xml:space="preserve"> para todos los archivos JS, CSS, SVG y HTML en tiempo de compilación.</w:t>
-      </w:r>
+        <w:t xml:space="preserve">futures_util::future::join_all</w:t>
+      </w:r>
+      <w:r>
+        <w:rPr>
+          <w:color w:val="17261F"/>
+          <w:sz w:val="20"/>
+          <w:szCs w:val="20"/>
+        </w:rPr>
+        <w:t xml:space="preserve"> para paralelizar el ciclo de inferencia física y despacho MQTT de todos los cultivos virtuales sin contención.</w:t>
+      </w:r>
+    </w:p>
+    <w:p>
+      <w:pPr>
+        <w:spacing w:before="40" w:after="0" w:line="240" w:lineRule="auto"/>
+        <w:rPr>
+          <w:sz w:val="8"/>
+        </w:rPr>
+      </w:pPr>
+    </w:p>
+    <w:p>
+      <w:pPr>
+        <w:pStyle w:val="Heading2"/>
+      </w:pPr>
+      <w:bookmarkStart w:id="128" w:name="sec_128"/>
+      <w:r>
+        <w:rPr>
+          <w:b/>
+          <w:bCs/>
+          <w:color w:val="067A52"/>
+          <w:sz w:val="25"/>
+          <w:szCs w:val="25"/>
+        </w:rPr>
+        <w:t xml:space="preserve">6.4 Servidor de Borde y Frontend Reactivo (</w:t>
+      </w:r>
+      <w:r>
+        <w:rPr>
+          <w:rFonts w:ascii="JetBrains Mono" w:hAnsi="JetBrains Mono" w:eastAsia="JetBrains Mono" w:cs="JetBrains Mono"/>
+          <w:b/>
+          <w:bCs/>
+          <w:color w:val="0A5A3C"/>
+          <w:sz w:val="23"/>
+          <w:szCs w:val="23"/>
+        </w:rPr>
+        <w:t xml:space="preserve">SmartPot-Web-Solid</w:t>
+      </w:r>
+      <w:r>
+        <w:rPr>
+          <w:b/>
+          <w:bCs/>
+          <w:color w:val="067A52"/>
+          <w:sz w:val="25"/>
+          <w:szCs w:val="25"/>
+        </w:rPr>
+        <w:t xml:space="preserve">)</w:t>
+      </w:r>
+      <w:bookmarkEnd w:id="128"/>
     </w:p>
     <w:p>
       <w:pPr>
@@ -9557,7 +9735,7 @@
           <w:sz w:val="20"/>
           <w:szCs w:val="20"/>
         </w:rPr>
-        <w:t xml:space="preserve">Afinación de Transporte Nginx:</w:t>
+        <w:t xml:space="preserve">Pre-compresión Estática Dual (Gzip Nivel 9 + Brotli Calidad 11):</w:t>
       </w:r>
     </w:p>
     <w:p>
@@ -9575,7 +9753,7 @@
           <w:sz w:val="20"/>
           <w:szCs w:val="20"/>
         </w:rPr>
-        <w:t xml:space="preserve">Directivas </w:t>
+        <w:t xml:space="preserve">Script automatizado </w:t>
       </w:r>
       <w:r>
         <w:rPr>
@@ -9584,15 +9762,15 @@
           <w:sz w:val="18"/>
           <w:szCs w:val="18"/>
         </w:rPr>
-        <w:t xml:space="preserve">gzip_static on;</w:t>
-      </w:r>
-      <w:r>
-        <w:rPr>
-          <w:color w:val="17261F"/>
-          <w:sz w:val="20"/>
-          <w:szCs w:val="20"/>
-        </w:rPr>
-        <w:t xml:space="preserve">, </w:t>
+        <w:t xml:space="preserve">scripts/compress-assets.mjs</w:t>
+      </w:r>
+      <w:r>
+        <w:rPr>
+          <w:color w:val="17261F"/>
+          <w:sz w:val="20"/>
+          <w:szCs w:val="20"/>
+        </w:rPr>
+        <w:t xml:space="preserve"> que genera activos pre-comprimidos </w:t>
       </w:r>
       <w:r>
         <w:rPr>
@@ -9601,15 +9779,15 @@
           <w:sz w:val="18"/>
           <w:szCs w:val="18"/>
         </w:rPr>
-        <w:t xml:space="preserve">sendfile on;</w:t>
-      </w:r>
-      <w:r>
-        <w:rPr>
-          <w:color w:val="17261F"/>
-          <w:sz w:val="20"/>
-          <w:szCs w:val="20"/>
-        </w:rPr>
-        <w:t xml:space="preserve">, </w:t>
+        <w:t xml:space="preserve">.gz</w:t>
+      </w:r>
+      <w:r>
+        <w:rPr>
+          <w:color w:val="17261F"/>
+          <w:sz w:val="20"/>
+          <w:szCs w:val="20"/>
+        </w:rPr>
+        <w:t xml:space="preserve"> y </w:t>
       </w:r>
       <w:r>
         <w:rPr>
@@ -9618,15 +9796,51 @@
           <w:sz w:val="18"/>
           <w:szCs w:val="18"/>
         </w:rPr>
-        <w:t xml:space="preserve">tcp_nopush on;</w:t>
-      </w:r>
-      <w:r>
-        <w:rPr>
-          <w:color w:val="17261F"/>
-          <w:sz w:val="20"/>
-          <w:szCs w:val="20"/>
-        </w:rPr>
-        <w:t xml:space="preserve">, </w:t>
+        <w:t xml:space="preserve">.br</w:t>
+      </w:r>
+      <w:r>
+        <w:rPr>
+          <w:color w:val="17261F"/>
+          <w:sz w:val="20"/>
+          <w:szCs w:val="20"/>
+        </w:rPr>
+        <w:t xml:space="preserve"> en tiempo de compilación.</w:t>
+      </w:r>
+    </w:p>
+    <w:p>
+      <w:pPr>
+        <w:numPr>
+          <w:ilvl w:val="0"/>
+          <w:numId w:val="1"/>
+        </w:numPr>
+        <w:ind w:left="360" w:hanging="260"/>
+        <w:spacing w:before="0" w:after="60" w:line="276" w:lineRule="auto"/>
+      </w:pPr>
+      <w:r>
+        <w:rPr>
+          <w:color w:val="17261F"/>
+          <w:sz w:val="20"/>
+          <w:szCs w:val="20"/>
+        </w:rPr>
+        <w:t xml:space="preserve">Bundle principal transferido: </w:t>
+      </w:r>
+      <w:r>
+        <w:rPr>
+          <w:b/>
+          <w:bCs/>
+          <w:color w:val="17261F"/>
+          <w:sz w:val="20"/>
+          <w:szCs w:val="20"/>
+        </w:rPr>
+        <w:t xml:space="preserve">40.3 kB</w:t>
+      </w:r>
+      <w:r>
+        <w:rPr>
+          <w:color w:val="17261F"/>
+          <w:sz w:val="20"/>
+          <w:szCs w:val="20"/>
+        </w:rPr>
+        <w:t xml:space="preserve"> con Brotli (</w:t>
       </w:r>
       <w:r>
         <w:rPr>
@@ -9635,15 +9849,33 @@
           <w:sz w:val="18"/>
           <w:szCs w:val="18"/>
         </w:rPr>
-        <w:t xml:space="preserve">tcp_nodelay on;</w:t>
-      </w:r>
-      <w:r>
-        <w:rPr>
-          <w:color w:val="17261F"/>
-          <w:sz w:val="20"/>
-          <w:szCs w:val="20"/>
-        </w:rPr>
-        <w:t xml:space="preserve"> y </w:t>
+        <w:t xml:space="preserve">index-eBMpwok5.js.br</w:t>
+      </w:r>
+      <w:r>
+        <w:rPr>
+          <w:color w:val="17261F"/>
+          <w:sz w:val="20"/>
+          <w:szCs w:val="20"/>
+        </w:rPr>
+        <w:t xml:space="preserve">) y </w:t>
+      </w:r>
+      <w:r>
+        <w:rPr>
+          <w:b/>
+          <w:bCs/>
+          <w:color w:val="17261F"/>
+          <w:sz w:val="20"/>
+          <w:szCs w:val="20"/>
+        </w:rPr>
+        <w:t xml:space="preserve">48.7 kB</w:t>
+      </w:r>
+      <w:r>
+        <w:rPr>
+          <w:color w:val="17261F"/>
+          <w:sz w:val="20"/>
+          <w:szCs w:val="20"/>
+        </w:rPr>
+        <w:t xml:space="preserve"> con Gzip (</w:t>
       </w:r>
       <w:r>
         <w:rPr>
@@ -9652,32 +9884,33 @@
           <w:sz w:val="18"/>
           <w:szCs w:val="18"/>
         </w:rPr>
-        <w:t xml:space="preserve">keepalive_timeout 65;</w:t>
-      </w:r>
-      <w:r>
-        <w:rPr>
-          <w:color w:val="17261F"/>
-          <w:sz w:val="20"/>
-          <w:szCs w:val="20"/>
-        </w:rPr>
-        <w:t xml:space="preserve"> en </w:t>
-      </w:r>
-      <w:r>
-        <w:rPr>
-          <w:rFonts w:ascii="JetBrains Mono" w:hAnsi="JetBrains Mono" w:eastAsia="JetBrains Mono" w:cs="JetBrains Mono"/>
-          <w:color w:val="0A5A3C"/>
-          <w:sz w:val="18"/>
-          <w:szCs w:val="18"/>
-        </w:rPr>
-        <w:t xml:space="preserve">nginx/default.conf.template</w:t>
-      </w:r>
-      <w:r>
-        <w:rPr>
-          <w:color w:val="17261F"/>
-          <w:sz w:val="20"/>
-          <w:szCs w:val="20"/>
-        </w:rPr>
-        <w:t xml:space="preserve">, eliminando por completo el gasto de CPU por compresión dinámica en tiempo de petición.</w:t>
+        <w:t xml:space="preserve">index-eBMpwok5.js.gz</w:t>
+      </w:r>
+      <w:r>
+        <w:rPr>
+          <w:color w:val="17261F"/>
+          <w:sz w:val="20"/>
+          <w:szCs w:val="20"/>
+        </w:rPr>
+        <w:t xml:space="preserve">), batiendo con holgura el objetivo de </w:t>
+      </w:r>
+      <w:r>
+        <w:rPr>
+          <w:b/>
+          <w:bCs/>
+          <w:color w:val="17261F"/>
+          <w:sz w:val="20"/>
+          <w:szCs w:val="20"/>
+        </w:rPr>
+        <w:t xml:space="preserve">&lt; 55 kB</w:t>
+      </w:r>
+      <w:r>
+        <w:rPr>
+          <w:color w:val="17261F"/>
+          <w:sz w:val="20"/>
+          <w:szCs w:val="20"/>
+        </w:rPr>
+        <w:t xml:space="preserve">.</w:t>
       </w:r>
     </w:p>
     <w:p>
@@ -9697,7 +9930,7 @@
           <w:sz w:val="20"/>
           <w:szCs w:val="20"/>
         </w:rPr>
-        <w:t xml:space="preserve">Optimización de Bundles en Vite:</w:t>
+        <w:t xml:space="preserve">Afinación de Transporte Nginx:</w:t>
       </w:r>
     </w:p>
     <w:p>
@@ -9715,6 +9948,146 @@
           <w:sz w:val="20"/>
           <w:szCs w:val="20"/>
         </w:rPr>
+        <w:t xml:space="preserve">Directivas </w:t>
+      </w:r>
+      <w:r>
+        <w:rPr>
+          <w:rFonts w:ascii="JetBrains Mono" w:hAnsi="JetBrains Mono" w:eastAsia="JetBrains Mono" w:cs="JetBrains Mono"/>
+          <w:color w:val="0A5A3C"/>
+          <w:sz w:val="18"/>
+          <w:szCs w:val="18"/>
+        </w:rPr>
+        <w:t xml:space="preserve">gzip_static on;</w:t>
+      </w:r>
+      <w:r>
+        <w:rPr>
+          <w:color w:val="17261F"/>
+          <w:sz w:val="20"/>
+          <w:szCs w:val="20"/>
+        </w:rPr>
+        <w:t xml:space="preserve">, </w:t>
+      </w:r>
+      <w:r>
+        <w:rPr>
+          <w:rFonts w:ascii="JetBrains Mono" w:hAnsi="JetBrains Mono" w:eastAsia="JetBrains Mono" w:cs="JetBrains Mono"/>
+          <w:color w:val="0A5A3C"/>
+          <w:sz w:val="18"/>
+          <w:szCs w:val="18"/>
+        </w:rPr>
+        <w:t xml:space="preserve">sendfile on;</w:t>
+      </w:r>
+      <w:r>
+        <w:rPr>
+          <w:color w:val="17261F"/>
+          <w:sz w:val="20"/>
+          <w:szCs w:val="20"/>
+        </w:rPr>
+        <w:t xml:space="preserve">, </w:t>
+      </w:r>
+      <w:r>
+        <w:rPr>
+          <w:rFonts w:ascii="JetBrains Mono" w:hAnsi="JetBrains Mono" w:eastAsia="JetBrains Mono" w:cs="JetBrains Mono"/>
+          <w:color w:val="0A5A3C"/>
+          <w:sz w:val="18"/>
+          <w:szCs w:val="18"/>
+        </w:rPr>
+        <w:t xml:space="preserve">tcp_nopush on;</w:t>
+      </w:r>
+      <w:r>
+        <w:rPr>
+          <w:color w:val="17261F"/>
+          <w:sz w:val="20"/>
+          <w:szCs w:val="20"/>
+        </w:rPr>
+        <w:t xml:space="preserve">, </w:t>
+      </w:r>
+      <w:r>
+        <w:rPr>
+          <w:rFonts w:ascii="JetBrains Mono" w:hAnsi="JetBrains Mono" w:eastAsia="JetBrains Mono" w:cs="JetBrains Mono"/>
+          <w:color w:val="0A5A3C"/>
+          <w:sz w:val="18"/>
+          <w:szCs w:val="18"/>
+        </w:rPr>
+        <w:t xml:space="preserve">tcp_nodelay on;</w:t>
+      </w:r>
+      <w:r>
+        <w:rPr>
+          <w:color w:val="17261F"/>
+          <w:sz w:val="20"/>
+          <w:szCs w:val="20"/>
+        </w:rPr>
+        <w:t xml:space="preserve"> y </w:t>
+      </w:r>
+      <w:r>
+        <w:rPr>
+          <w:rFonts w:ascii="JetBrains Mono" w:hAnsi="JetBrains Mono" w:eastAsia="JetBrains Mono" w:cs="JetBrains Mono"/>
+          <w:color w:val="0A5A3C"/>
+          <w:sz w:val="18"/>
+          <w:szCs w:val="18"/>
+        </w:rPr>
+        <w:t xml:space="preserve">keepalive_timeout 65;</w:t>
+      </w:r>
+      <w:r>
+        <w:rPr>
+          <w:color w:val="17261F"/>
+          <w:sz w:val="20"/>
+          <w:szCs w:val="20"/>
+        </w:rPr>
+        <w:t xml:space="preserve"> en </w:t>
+      </w:r>
+      <w:r>
+        <w:rPr>
+          <w:rFonts w:ascii="JetBrains Mono" w:hAnsi="JetBrains Mono" w:eastAsia="JetBrains Mono" w:cs="JetBrains Mono"/>
+          <w:color w:val="0A5A3C"/>
+          <w:sz w:val="18"/>
+          <w:szCs w:val="18"/>
+        </w:rPr>
+        <w:t xml:space="preserve">nginx/default.conf.template</w:t>
+      </w:r>
+      <w:r>
+        <w:rPr>
+          <w:color w:val="17261F"/>
+          <w:sz w:val="20"/>
+          <w:szCs w:val="20"/>
+        </w:rPr>
+        <w:t xml:space="preserve">, eliminando por completo el gasto de CPU por compresión dinámica en tiempo de petición.</w:t>
+      </w:r>
+    </w:p>
+    <w:p>
+      <w:pPr>
+        <w:numPr>
+          <w:ilvl w:val="0"/>
+          <w:numId w:val="2"/>
+        </w:numPr>
+        <w:ind w:left="360" w:hanging="260"/>
+        <w:spacing w:before="0" w:after="60" w:line="276" w:lineRule="auto"/>
+      </w:pPr>
+      <w:r>
+        <w:rPr>
+          <w:b/>
+          <w:bCs/>
+          <w:color w:val="17261F"/>
+          <w:sz w:val="20"/>
+          <w:szCs w:val="20"/>
+        </w:rPr>
+        <w:t xml:space="preserve">Optimización de Bundles en Vite:</w:t>
+      </w:r>
+    </w:p>
+    <w:p>
+      <w:pPr>
+        <w:numPr>
+          <w:ilvl w:val="0"/>
+          <w:numId w:val="1"/>
+        </w:numPr>
+        <w:ind w:left="360" w:hanging="260"/>
+        <w:spacing w:before="0" w:after="60" w:line="276" w:lineRule="auto"/>
+      </w:pPr>
+      <w:r>
+        <w:rPr>
+          <w:color w:val="17261F"/>
+          <w:sz w:val="20"/>
+          <w:szCs w:val="20"/>
+        </w:rPr>
         <w:t xml:space="preserve">Separación de chunks modulares (</w:t>
       </w:r>
       <w:r>
@@ -9807,7 +10180,7 @@
           <w:sz w:val="25"/>
           <w:szCs w:val="25"/>
         </w:rPr>
-        <w:t xml:space="preserve">6.5 Blindaje y Cuotas de Recursos en Docker (</w:t>
+        <w:t xml:space="preserve">6.5 Broker EMQX Optimizado (</w:t>
       </w:r>
       <w:r>
         <w:rPr>
@@ -9818,7 +10191,7 @@
           <w:sz w:val="23"/>
           <w:szCs w:val="23"/>
         </w:rPr>
-        <w:t xml:space="preserve">demo-beta/compose.yaml</w:t>
+        <w:t xml:space="preserve">SmartPot-Broker-EMQX</w:t>
       </w:r>
       <w:r>
         <w:rPr>
@@ -9831,6 +10204,162 @@
         <w:t xml:space="preserve">)</w:t>
       </w:r>
       <w:bookmarkEnd w:id="129"/>
+    </w:p>
+    <w:p>
+      <w:pPr>
+        <w:numPr>
+          <w:ilvl w:val="0"/>
+          <w:numId w:val="2"/>
+        </w:numPr>
+        <w:ind w:left="360" w:hanging="260"/>
+        <w:spacing w:before="0" w:after="60" w:line="276" w:lineRule="auto"/>
+      </w:pPr>
+      <w:r>
+        <w:rPr>
+          <w:b/>
+          <w:bCs/>
+          <w:color w:val="17261F"/>
+          <w:sz w:val="20"/>
+          <w:szCs w:val="20"/>
+        </w:rPr>
+        <w:t xml:space="preserve">Caché de Autorización Afinada:</w:t>
+      </w:r>
+    </w:p>
+    <w:p>
+      <w:pPr>
+        <w:numPr>
+          <w:ilvl w:val="0"/>
+          <w:numId w:val="1"/>
+        </w:numPr>
+        <w:ind w:left="360" w:hanging="260"/>
+        <w:spacing w:before="0" w:after="60" w:line="276" w:lineRule="auto"/>
+      </w:pPr>
+      <w:r>
+        <w:rPr>
+          <w:color w:val="17261F"/>
+          <w:sz w:val="20"/>
+          <w:szCs w:val="20"/>
+        </w:rPr>
+        <w:t xml:space="preserve">Módulo de caché ampliado a 1,024 entradas y TTL de 5 minutos, reduciendo consultas repetitivas de ACL.</w:t>
+      </w:r>
+    </w:p>
+    <w:p>
+      <w:pPr>
+        <w:numPr>
+          <w:ilvl w:val="0"/>
+          <w:numId w:val="2"/>
+        </w:numPr>
+        <w:ind w:left="360" w:hanging="260"/>
+        <w:spacing w:before="0" w:after="60" w:line="276" w:lineRule="auto"/>
+      </w:pPr>
+      <w:r>
+        <w:rPr>
+          <w:b/>
+          <w:bCs/>
+          <w:color w:val="17261F"/>
+          <w:sz w:val="20"/>
+          <w:szCs w:val="20"/>
+        </w:rPr>
+        <w:t xml:space="preserve">Pool de Autenticación HTTP:</w:t>
+      </w:r>
+    </w:p>
+    <w:p>
+      <w:pPr>
+        <w:numPr>
+          <w:ilvl w:val="0"/>
+          <w:numId w:val="1"/>
+        </w:numPr>
+        <w:ind w:left="360" w:hanging="260"/>
+        <w:spacing w:before="0" w:after="60" w:line="276" w:lineRule="auto"/>
+      </w:pPr>
+      <w:r>
+        <w:rPr>
+          <w:color w:val="17261F"/>
+          <w:sz w:val="20"/>
+          <w:szCs w:val="20"/>
+        </w:rPr>
+        <w:t xml:space="preserve">Listener y webhook HTTP configurados con </w:t>
+      </w:r>
+      <w:r>
+        <w:rPr>
+          <w:rFonts w:ascii="JetBrains Mono" w:hAnsi="JetBrains Mono" w:eastAsia="JetBrains Mono" w:cs="JetBrains Mono"/>
+          <w:color w:val="0A5A3C"/>
+          <w:sz w:val="18"/>
+          <w:szCs w:val="18"/>
+        </w:rPr>
+        <w:t xml:space="preserve">pool_size = 16</w:t>
+      </w:r>
+      <w:r>
+        <w:rPr>
+          <w:color w:val="17261F"/>
+          <w:sz w:val="20"/>
+          <w:szCs w:val="20"/>
+        </w:rPr>
+        <w:t xml:space="preserve"> y </w:t>
+      </w:r>
+      <w:r>
+        <w:rPr>
+          <w:rFonts w:ascii="JetBrains Mono" w:hAnsi="JetBrains Mono" w:eastAsia="JetBrains Mono" w:cs="JetBrains Mono"/>
+          <w:color w:val="0A5A3C"/>
+          <w:sz w:val="18"/>
+          <w:szCs w:val="18"/>
+        </w:rPr>
+        <w:t xml:space="preserve">enable_pipelining = 100</w:t>
+      </w:r>
+      <w:r>
+        <w:rPr>
+          <w:color w:val="17261F"/>
+          <w:sz w:val="20"/>
+          <w:szCs w:val="20"/>
+        </w:rPr>
+        <w:t xml:space="preserve"> para ráfagas masivas de conexión de dispositivos IoT.</w:t>
+      </w:r>
+    </w:p>
+    <w:p>
+      <w:pPr>
+        <w:spacing w:before="40" w:after="0" w:line="240" w:lineRule="auto"/>
+        <w:rPr>
+          <w:sz w:val="8"/>
+        </w:rPr>
+      </w:pPr>
+    </w:p>
+    <w:p>
+      <w:pPr>
+        <w:pStyle w:val="Heading2"/>
+      </w:pPr>
+      <w:bookmarkStart w:id="130" w:name="sec_130"/>
+      <w:r>
+        <w:rPr>
+          <w:b/>
+          <w:bCs/>
+          <w:color w:val="067A52"/>
+          <w:sz w:val="25"/>
+          <w:szCs w:val="25"/>
+        </w:rPr>
+        <w:t xml:space="preserve">6.6 Blindaje y Cuotas de Recursos en Docker (</w:t>
+      </w:r>
+      <w:r>
+        <w:rPr>
+          <w:rFonts w:ascii="JetBrains Mono" w:hAnsi="JetBrains Mono" w:eastAsia="JetBrains Mono" w:cs="JetBrains Mono"/>
+          <w:b/>
+          <w:bCs/>
+          <w:color w:val="0A5A3C"/>
+          <w:sz w:val="23"/>
+          <w:szCs w:val="23"/>
+        </w:rPr>
+        <w:t xml:space="preserve">demo-beta/compose.yaml</w:t>
+      </w:r>
+      <w:r>
+        <w:rPr>
+          <w:b/>
+          <w:bCs/>
+          <w:color w:val="067A52"/>
+          <w:sz w:val="25"/>
+          <w:szCs w:val="25"/>
+        </w:rPr>
+        <w:t xml:space="preserve">)</w:t>
+      </w:r>
+      <w:bookmarkEnd w:id="130"/>
     </w:p>
     <w:p>
       <w:pPr>
@@ -11531,7 +12060,7 @@
       <w:pPr>
         <w:pStyle w:val="Heading1"/>
       </w:pPr>
-      <w:bookmarkStart w:id="130" w:name="sec_130"/>
+      <w:bookmarkStart w:id="131" w:name="sec_131"/>
       <w:r>
         <w:rPr>
           <w:b/>
@@ -11542,7 +12071,7 @@
         </w:rPr>
         <w:t xml:space="preserve">Matriz de Quality Gates y Decisión de Release</w:t>
       </w:r>
-      <w:bookmarkEnd w:id="130"/>
+      <w:bookmarkEnd w:id="131"/>
     </w:p>
     <w:p>
       <w:pPr>
@@ -11572,10 +12101,10 @@
         <w:tblLook w:val="04A0" w:firstRow="1" w:firstColumn="1" w:noVBand="1"/>
       </w:tblPr>
       <w:tblGrid>
-        <w:gridCol w:w="2216"/>
-        <w:gridCol w:w="2915"/>
-        <w:gridCol w:w="3251"/>
-        <w:gridCol w:w="978"/>
+        <w:gridCol w:w="2198"/>
+        <w:gridCol w:w="2973"/>
+        <w:gridCol w:w="3212"/>
+        <w:gridCol w:w="977"/>
       </w:tblGrid>
       <w:tr>
         <w:trPr>
@@ -11584,7 +12113,7 @@
         </w:trPr>
         <w:tc>
           <w:tcPr>
-            <w:tcW w:w="2216" w:type="dxa"/>
+            <w:tcW w:w="2198" w:type="dxa"/>
             <w:shd w:val="clear" w:color="auto" w:fill="0B3D2B"/>
             <w:tcMar>
               <w:top w:w="70" w:type="dxa"/>
@@ -11613,7 +12142,7 @@
         </w:tc>
         <w:tc>
           <w:tcPr>
-            <w:tcW w:w="2915" w:type="dxa"/>
+            <w:tcW w:w="2973" w:type="dxa"/>
             <w:shd w:val="clear" w:color="auto" w:fill="0B3D2B"/>
             <w:tcMar>
               <w:top w:w="70" w:type="dxa"/>
@@ -11642,7 +12171,7 @@
         </w:tc>
         <w:tc>
           <w:tcPr>
-            <w:tcW w:w="3251" w:type="dxa"/>
+            <w:tcW w:w="3212" w:type="dxa"/>
             <w:shd w:val="clear" w:color="auto" w:fill="0B3D2B"/>
             <w:tcMar>
               <w:top w:w="70" w:type="dxa"/>
@@ -11671,7 +12200,7 @@
         </w:tc>
         <w:tc>
           <w:tcPr>
-            <w:tcW w:w="978" w:type="dxa"/>
+            <w:tcW w:w="977" w:type="dxa"/>
             <w:shd w:val="clear" w:color="auto" w:fill="0B3D2B"/>
             <w:tcMar>
               <w:top w:w="70" w:type="dxa"/>
@@ -11705,7 +12234,7 @@
         </w:trPr>
         <w:tc>
           <w:tcPr>
-            <w:tcW w:w="2216" w:type="dxa"/>
+            <w:tcW w:w="2198" w:type="dxa"/>
             <w:shd w:val="clear" w:color="auto" w:fill="FFFFFF"/>
             <w:tcMar>
               <w:top w:w="70" w:type="dxa"/>
@@ -11733,7 +12262,7 @@
         </w:tc>
         <w:tc>
           <w:tcPr>
-            <w:tcW w:w="2915" w:type="dxa"/>
+            <w:tcW w:w="2973" w:type="dxa"/>
             <w:shd w:val="clear" w:color="auto" w:fill="FFFFFF"/>
             <w:tcMar>
               <w:top w:w="70" w:type="dxa"/>
@@ -11759,7 +12288,7 @@
         </w:tc>
         <w:tc>
           <w:tcPr>
-            <w:tcW w:w="3251" w:type="dxa"/>
+            <w:tcW w:w="3212" w:type="dxa"/>
             <w:shd w:val="clear" w:color="auto" w:fill="FFFFFF"/>
             <w:tcMar>
               <w:top w:w="70" w:type="dxa"/>
@@ -11785,7 +12314,7 @@
         </w:tc>
         <w:tc>
           <w:tcPr>
-            <w:tcW w:w="978" w:type="dxa"/>
+            <w:tcW w:w="977" w:type="dxa"/>
             <w:shd w:val="clear" w:color="auto" w:fill="FFFFFF"/>
             <w:tcMar>
               <w:top w:w="70" w:type="dxa"/>
@@ -11818,7 +12347,7 @@
         </w:trPr>
         <w:tc>
           <w:tcPr>
-            <w:tcW w:w="2216" w:type="dxa"/>
+            <w:tcW w:w="2198" w:type="dxa"/>
             <w:shd w:val="clear" w:color="auto" w:fill="F2F7F4"/>
             <w:tcMar>
               <w:top w:w="70" w:type="dxa"/>
@@ -11846,7 +12375,7 @@
         </w:tc>
         <w:tc>
           <w:tcPr>
-            <w:tcW w:w="2915" w:type="dxa"/>
+            <w:tcW w:w="2973" w:type="dxa"/>
             <w:shd w:val="clear" w:color="auto" w:fill="F2F7F4"/>
             <w:tcMar>
               <w:top w:w="70" w:type="dxa"/>
@@ -11872,7 +12401,7 @@
         </w:tc>
         <w:tc>
           <w:tcPr>
-            <w:tcW w:w="3251" w:type="dxa"/>
+            <w:tcW w:w="3212" w:type="dxa"/>
             <w:shd w:val="clear" w:color="auto" w:fill="F2F7F4"/>
             <w:tcMar>
               <w:top w:w="70" w:type="dxa"/>
@@ -11898,7 +12427,7 @@
         </w:tc>
         <w:tc>
           <w:tcPr>
-            <w:tcW w:w="978" w:type="dxa"/>
+            <w:tcW w:w="977" w:type="dxa"/>
             <w:shd w:val="clear" w:color="auto" w:fill="F2F7F4"/>
             <w:tcMar>
               <w:top w:w="70" w:type="dxa"/>
@@ -11931,7 +12460,7 @@
         </w:trPr>
         <w:tc>
           <w:tcPr>
-            <w:tcW w:w="2216" w:type="dxa"/>
+            <w:tcW w:w="2198" w:type="dxa"/>
             <w:shd w:val="clear" w:color="auto" w:fill="FFFFFF"/>
             <w:tcMar>
               <w:top w:w="70" w:type="dxa"/>
@@ -11959,7 +12488,7 @@
         </w:tc>
         <w:tc>
           <w:tcPr>
-            <w:tcW w:w="2915" w:type="dxa"/>
+            <w:tcW w:w="2973" w:type="dxa"/>
             <w:shd w:val="clear" w:color="auto" w:fill="FFFFFF"/>
             <w:tcMar>
               <w:top w:w="70" w:type="dxa"/>
@@ -11985,7 +12514,7 @@
         </w:tc>
         <w:tc>
           <w:tcPr>
-            <w:tcW w:w="3251" w:type="dxa"/>
+            <w:tcW w:w="3212" w:type="dxa"/>
             <w:shd w:val="clear" w:color="auto" w:fill="FFFFFF"/>
             <w:tcMar>
               <w:top w:w="70" w:type="dxa"/>
@@ -12011,7 +12540,7 @@
         </w:tc>
         <w:tc>
           <w:tcPr>
-            <w:tcW w:w="978" w:type="dxa"/>
+            <w:tcW w:w="977" w:type="dxa"/>
             <w:shd w:val="clear" w:color="auto" w:fill="FFFFFF"/>
             <w:tcMar>
               <w:top w:w="70" w:type="dxa"/>
@@ -12044,7 +12573,7 @@
         </w:trPr>
         <w:tc>
           <w:tcPr>
-            <w:tcW w:w="2216" w:type="dxa"/>
+            <w:tcW w:w="2198" w:type="dxa"/>
             <w:shd w:val="clear" w:color="auto" w:fill="F2F7F4"/>
             <w:tcMar>
               <w:top w:w="70" w:type="dxa"/>
@@ -12072,7 +12601,7 @@
         </w:tc>
         <w:tc>
           <w:tcPr>
-            <w:tcW w:w="2915" w:type="dxa"/>
+            <w:tcW w:w="2973" w:type="dxa"/>
             <w:shd w:val="clear" w:color="auto" w:fill="F2F7F4"/>
             <w:tcMar>
               <w:top w:w="70" w:type="dxa"/>
@@ -12098,7 +12627,7 @@
         </w:tc>
         <w:tc>
           <w:tcPr>
-            <w:tcW w:w="3251" w:type="dxa"/>
+            <w:tcW w:w="3212" w:type="dxa"/>
             <w:shd w:val="clear" w:color="auto" w:fill="F2F7F4"/>
             <w:tcMar>
               <w:top w:w="70" w:type="dxa"/>
@@ -12120,13 +12649,13 @@
                 <w:sz w:val="17"/>
                 <w:szCs w:val="17"/>
               </w:rPr>
-              <w:t xml:space="preserve">-68.8% global (-93.1% en API)</w:t>
-            </w:r>
-          </w:p>
-        </w:tc>
-        <w:tc>
-          <w:tcPr>
-            <w:tcW w:w="978" w:type="dxa"/>
+              <w:t xml:space="preserve">-47.9% global (-96.8% en API: 12.2 MB)</w:t>
+            </w:r>
+          </w:p>
+        </w:tc>
+        <w:tc>
+          <w:tcPr>
+            <w:tcW w:w="977" w:type="dxa"/>
             <w:shd w:val="clear" w:color="auto" w:fill="F2F7F4"/>
             <w:tcMar>
               <w:top w:w="70" w:type="dxa"/>
@@ -12159,7 +12688,7 @@
         </w:trPr>
         <w:tc>
           <w:tcPr>
-            <w:tcW w:w="2216" w:type="dxa"/>
+            <w:tcW w:w="2198" w:type="dxa"/>
             <w:shd w:val="clear" w:color="auto" w:fill="FFFFFF"/>
             <w:tcMar>
               <w:top w:w="70" w:type="dxa"/>
@@ -12187,7 +12716,7 @@
         </w:tc>
         <w:tc>
           <w:tcPr>
-            <w:tcW w:w="2915" w:type="dxa"/>
+            <w:tcW w:w="2973" w:type="dxa"/>
             <w:shd w:val="clear" w:color="auto" w:fill="FFFFFF"/>
             <w:tcMar>
               <w:top w:w="70" w:type="dxa"/>
@@ -12213,7 +12742,7 @@
         </w:tc>
         <w:tc>
           <w:tcPr>
-            <w:tcW w:w="3251" w:type="dxa"/>
+            <w:tcW w:w="3212" w:type="dxa"/>
             <w:shd w:val="clear" w:color="auto" w:fill="FFFFFF"/>
             <w:tcMar>
               <w:top w:w="70" w:type="dxa"/>
@@ -12235,7 +12764,7 @@
                 <w:sz w:val="17"/>
                 <w:szCs w:val="17"/>
               </w:rPr>
-              <w:t xml:space="preserve">$p_{50} = 3.63\text{ ms}$, $p_{95} = 26.54\text{ ms}$</w:t>
+              <w:t xml:space="preserve">$p_{50} = 3.40\text{ ms}$, $p_{95} = 17.58\text{ ms}$</w:t>
             </w:r>
             <w:r>
               <w:rPr>
@@ -12249,7 +12778,7 @@
         </w:tc>
         <w:tc>
           <w:tcPr>
-            <w:tcW w:w="978" w:type="dxa"/>
+            <w:tcW w:w="977" w:type="dxa"/>
             <w:shd w:val="clear" w:color="auto" w:fill="FFFFFF"/>
             <w:tcMar>
               <w:top w:w="70" w:type="dxa"/>
@@ -12282,7 +12811,7 @@
         </w:trPr>
         <w:tc>
           <w:tcPr>
-            <w:tcW w:w="2216" w:type="dxa"/>
+            <w:tcW w:w="2198" w:type="dxa"/>
             <w:shd w:val="clear" w:color="auto" w:fill="F2F7F4"/>
             <w:tcMar>
               <w:top w:w="70" w:type="dxa"/>
@@ -12310,7 +12839,7 @@
         </w:tc>
         <w:tc>
           <w:tcPr>
-            <w:tcW w:w="2915" w:type="dxa"/>
+            <w:tcW w:w="2973" w:type="dxa"/>
             <w:shd w:val="clear" w:color="auto" w:fill="F2F7F4"/>
             <w:tcMar>
               <w:top w:w="70" w:type="dxa"/>
@@ -12330,13 +12859,13 @@
                 <w:sz w:val="17"/>
                 <w:szCs w:val="17"/>
               </w:rPr>
-              <w:t xml:space="preserve">Bundle gzip transferido $\le 100\text{ kB}$</w:t>
-            </w:r>
-          </w:p>
-        </w:tc>
-        <w:tc>
-          <w:tcPr>
-            <w:tcW w:w="3251" w:type="dxa"/>
+              <w:t xml:space="preserve">Bundle gzip/brotli transferido $\le 55\text{ kB}$</w:t>
+            </w:r>
+          </w:p>
+        </w:tc>
+        <w:tc>
+          <w:tcPr>
+            <w:tcW w:w="3212" w:type="dxa"/>
             <w:shd w:val="clear" w:color="auto" w:fill="F2F7F4"/>
             <w:tcMar>
               <w:top w:w="70" w:type="dxa"/>
@@ -12358,21 +12887,31 @@
                 <w:sz w:val="17"/>
                 <w:szCs w:val="17"/>
               </w:rPr>
-              <w:t xml:space="preserve">71.52 kB</w:t>
-            </w:r>
-            <w:r>
-              <w:rPr>
-                <w:color w:val="17261F"/>
-                <w:sz w:val="17"/>
-                <w:szCs w:val="17"/>
-              </w:rPr>
-              <w:t xml:space="preserve"> en SolidJS (vs 240 kB en React)</w:t>
-            </w:r>
-          </w:p>
-        </w:tc>
-        <w:tc>
-          <w:tcPr>
-            <w:tcW w:w="978" w:type="dxa"/>
+              <w:t xml:space="preserve">40.3 kB (Brotli)</w:t>
+            </w:r>
+            <w:r>
+              <w:rPr>
+                <w:color w:val="17261F"/>
+                <w:sz w:val="17"/>
+                <w:szCs w:val="17"/>
+              </w:rPr>
+              <w:t xml:space="preserve"> / </w:t>
+            </w:r>
+            <w:r>
+              <w:rPr>
+                <w:b/>
+                <w:bCs/>
+                <w:color w:val="17261F"/>
+                <w:sz w:val="17"/>
+                <w:szCs w:val="17"/>
+              </w:rPr>
+              <w:t xml:space="preserve">48.7 kB (Gzip)</w:t>
+            </w:r>
+          </w:p>
+        </w:tc>
+        <w:tc>
+          <w:tcPr>
+            <w:tcW w:w="977" w:type="dxa"/>
             <w:shd w:val="clear" w:color="auto" w:fill="F2F7F4"/>
             <w:tcMar>
               <w:top w:w="70" w:type="dxa"/>
@@ -12405,7 +12944,7 @@
         </w:trPr>
         <w:tc>
           <w:tcPr>
-            <w:tcW w:w="2216" w:type="dxa"/>
+            <w:tcW w:w="2198" w:type="dxa"/>
             <w:shd w:val="clear" w:color="auto" w:fill="FFFFFF"/>
             <w:tcMar>
               <w:top w:w="70" w:type="dxa"/>
@@ -12433,7 +12972,7 @@
         </w:tc>
         <w:tc>
           <w:tcPr>
-            <w:tcW w:w="2915" w:type="dxa"/>
+            <w:tcW w:w="2973" w:type="dxa"/>
             <w:shd w:val="clear" w:color="auto" w:fill="FFFFFF"/>
             <w:tcMar>
               <w:top w:w="70" w:type="dxa"/>
@@ -12453,13 +12992,13 @@
                 <w:sz w:val="17"/>
                 <w:szCs w:val="17"/>
               </w:rPr>
-              <w:t xml:space="preserve">Worker pool acotado, pgx.Batch 50ms y circuit breaker</w:t>
-            </w:r>
-          </w:p>
-        </w:tc>
-        <w:tc>
-          <w:tcPr>
-            <w:tcW w:w="3251" w:type="dxa"/>
+              <w:t xml:space="preserve">Worker pool acotado, micro-batching 10ms y circuit breaker</w:t>
+            </w:r>
+          </w:p>
+        </w:tc>
+        <w:tc>
+          <w:tcPr>
+            <w:tcW w:w="3212" w:type="dxa"/>
             <w:shd w:val="clear" w:color="auto" w:fill="FFFFFF"/>
             <w:tcMar>
               <w:top w:w="70" w:type="dxa"/>
@@ -12479,13 +13018,13 @@
                 <w:sz w:val="17"/>
                 <w:szCs w:val="17"/>
               </w:rPr>
-              <w:t xml:space="preserve">Cero saturación de goroutines; 0 stampede</w:t>
-            </w:r>
-          </w:p>
-        </w:tc>
-        <w:tc>
-          <w:tcPr>
-            <w:tcW w:w="978" w:type="dxa"/>
+              <w:t xml:space="preserve">0 saturación goroutines; 0 stampede</w:t>
+            </w:r>
+          </w:p>
+        </w:tc>
+        <w:tc>
+          <w:tcPr>
+            <w:tcW w:w="977" w:type="dxa"/>
             <w:shd w:val="clear" w:color="auto" w:fill="FFFFFF"/>
             <w:tcMar>
               <w:top w:w="70" w:type="dxa"/>
@@ -12707,7 +13246,7 @@
             <w:drawing>
               <wp:inline distT="0" distB="0" distL="0" distR="0">
                 <wp:extent cx="180000" cy="180000"/>
-                <wp:docPr id="131" name="Icono"/>
+                <wp:docPr id="132" name="Icono"/>
                 <wp:cNvGraphicFramePr>
                   <a:graphicFrameLocks noChangeAspect="1"/>
                 </wp:cNvGraphicFramePr>
@@ -12715,7 +13254,7 @@
                   <a:graphicData uri="http://schemas.openxmlformats.org/drawingml/2006/picture">
                     <pic:pic>
                       <pic:nvPicPr>
-                        <pic:cNvPr id="131" name="Icono"/>
+                        <pic:cNvPr id="132" name="Icono"/>
                         <pic:cNvPicPr/>
                       </pic:nvPicPr>
                       <pic:blipFill>

</xml_diff>